<commit_message>
add builder as member in composer
</commit_message>
<xml_diff>
--- a/DP.docx
+++ b/DP.docx
@@ -273,14 +273,12 @@
         </w:rPr>
         <w:t>ם מ</w:t>
       </w:r>
-      <w:proofErr w:type="spellStart"/>
       <w:r>
         <w:t>Facebook</w:t>
       </w:r>
       <w:r>
         <w:t>API</w:t>
       </w:r>
-      <w:proofErr w:type="spellEnd"/>
       <w:r>
         <w:rPr>
           <w:rFonts w:hint="cs"/>
@@ -446,11 +444,9 @@
         </w:rPr>
         <w:t>רה ל-</w:t>
       </w:r>
-      <w:proofErr w:type="spellStart"/>
       <w:r>
         <w:t>FacebookWrapper</w:t>
       </w:r>
-      <w:proofErr w:type="spellEnd"/>
       <w:r>
         <w:rPr>
           <w:rFonts w:hint="cs"/>
@@ -466,23 +462,7 @@
           <w:rFonts w:hint="cs"/>
           <w:rtl/>
         </w:rPr>
-        <w:t xml:space="preserve">ולעוד </w:t>
-      </w:r>
-      <w:proofErr w:type="spellStart"/>
-      <w:r>
-        <w:rPr>
-          <w:rFonts w:hint="cs"/>
-          <w:rtl/>
-        </w:rPr>
-        <w:t>לוגיקות</w:t>
-      </w:r>
-      <w:proofErr w:type="spellEnd"/>
-      <w:r>
-        <w:rPr>
-          <w:rFonts w:hint="cs"/>
-          <w:rtl/>
-        </w:rPr>
-        <w:t xml:space="preserve"> </w:t>
+        <w:t xml:space="preserve">ולעוד לוגיקות </w:t>
       </w:r>
       <w:r>
         <w:rPr>
@@ -682,11 +662,9 @@
         </w:rPr>
         <w:t xml:space="preserve"> במחלקה </w:t>
       </w:r>
-      <w:proofErr w:type="spellStart"/>
       <w:r>
         <w:t>FacebookAppLogic</w:t>
       </w:r>
-      <w:proofErr w:type="spellEnd"/>
       <w:r>
         <w:rPr>
           <w:rFonts w:hint="cs"/>
@@ -694,11 +672,9 @@
         </w:rPr>
         <w:t xml:space="preserve">. המחלקה מממשת את הממשק </w:t>
       </w:r>
-      <w:proofErr w:type="spellStart"/>
       <w:r>
         <w:t>IFacebookAppLogic</w:t>
       </w:r>
-      <w:proofErr w:type="spellEnd"/>
       <w:r>
         <w:rPr>
           <w:rFonts w:hint="cs"/>
@@ -818,11 +794,9 @@
         </w:numPr>
         <w:bidi/>
       </w:pPr>
-      <w:proofErr w:type="spellStart"/>
       <w:r>
         <w:t>UserMainForm</w:t>
       </w:r>
-      <w:proofErr w:type="spellEnd"/>
     </w:p>
     <w:p>
       <w:pPr>
@@ -833,27 +807,21 @@
         </w:numPr>
         <w:bidi/>
       </w:pPr>
-      <w:proofErr w:type="spellStart"/>
       <w:r>
         <w:t>TagsAnalyticsPageBuilder</w:t>
       </w:r>
-      <w:proofErr w:type="spellEnd"/>
       <w:r>
         <w:t xml:space="preserve">, </w:t>
       </w:r>
-      <w:proofErr w:type="spellStart"/>
       <w:r>
         <w:t>FeedPageBuilder</w:t>
       </w:r>
-      <w:proofErr w:type="spellEnd"/>
       <w:r>
         <w:t xml:space="preserve">, </w:t>
       </w:r>
-      <w:proofErr w:type="spellStart"/>
       <w:r>
         <w:t>ProfilePageBuilder</w:t>
       </w:r>
-      <w:proofErr w:type="spellEnd"/>
     </w:p>
     <w:p>
       <w:pPr>
@@ -864,19 +832,15 @@
         </w:numPr>
         <w:bidi/>
       </w:pPr>
-      <w:proofErr w:type="spellStart"/>
       <w:r>
         <w:t>ItemGalleryComponent</w:t>
       </w:r>
-      <w:proofErr w:type="spellEnd"/>
       <w:r>
         <w:t xml:space="preserve">, </w:t>
       </w:r>
-      <w:proofErr w:type="spellStart"/>
       <w:r>
         <w:t>PostComponent</w:t>
       </w:r>
-      <w:proofErr w:type="spellEnd"/>
     </w:p>
     <w:p>
       <w:pPr>
@@ -913,11 +877,9 @@
         </w:numPr>
         <w:bidi/>
       </w:pPr>
-      <w:proofErr w:type="spellStart"/>
       <w:r>
         <w:t>FacebookAppLogic</w:t>
       </w:r>
-      <w:proofErr w:type="spellEnd"/>
       <w:r>
         <w:rPr>
           <w:rFonts w:hint="cs"/>
@@ -925,11 +887,9 @@
         </w:rPr>
         <w:t xml:space="preserve"> אשר מממשת את הממשק הנח לשימוש </w:t>
       </w:r>
-      <w:proofErr w:type="spellStart"/>
       <w:r>
         <w:t>IFacebookAppLogic</w:t>
       </w:r>
-      <w:proofErr w:type="spellEnd"/>
       <w:r>
         <w:rPr>
           <w:rFonts w:hint="cs"/>
@@ -981,13 +941,8 @@
         <w:t>מחלקות מה-</w:t>
       </w:r>
       <w:r>
-        <w:t xml:space="preserve"> </w:t>
-      </w:r>
-      <w:proofErr w:type="spellStart"/>
-      <w:r>
-        <w:t>FacebookWrapper</w:t>
-      </w:r>
-      <w:proofErr w:type="spellEnd"/>
+        <w:t xml:space="preserve"> FacebookWrapper</w:t>
+      </w:r>
       <w:r>
         <w:rPr>
           <w:rFonts w:hint="cs"/>
@@ -1037,24 +992,14 @@
         <w:t xml:space="preserve"> 1 עבור הפיצ'רים שמימשנו:</w:t>
       </w:r>
       <w:r>
-        <w:t xml:space="preserve"> </w:t>
-      </w:r>
-      <w:proofErr w:type="spellStart"/>
-      <w:r>
-        <w:t>IPostTagsManage</w:t>
-      </w:r>
-      <w:r>
-        <w:t>r</w:t>
-      </w:r>
-      <w:proofErr w:type="spellEnd"/>
-      <w:r>
-        <w:t xml:space="preserve">, </w:t>
-      </w:r>
-      <w:proofErr w:type="spellStart"/>
+        <w:t xml:space="preserve"> IPostTagsManage</w:t>
+      </w:r>
+      <w:r>
+        <w:t xml:space="preserve">r, </w:t>
+      </w:r>
       <w:r>
         <w:t>IPostNotesManager</w:t>
       </w:r>
-      <w:proofErr w:type="spellEnd"/>
       <w:r>
         <w:rPr>
           <w:rFonts w:hint="cs"/>
@@ -1089,21 +1034,11 @@
         </w:rPr>
         <w:t xml:space="preserve"> כדוגמת: </w:t>
       </w:r>
-      <w:proofErr w:type="spellStart"/>
       <w:r>
         <w:t>IPostData</w:t>
       </w:r>
-      <w:proofErr w:type="spellEnd"/>
-      <w:r>
-        <w:t xml:space="preserve">, </w:t>
-      </w:r>
-      <w:proofErr w:type="spellStart"/>
-      <w:r>
-        <w:t>UserProfileData</w:t>
-      </w:r>
-      <w:proofErr w:type="spellEnd"/>
-      <w:r>
-        <w:t>, GalleryItem</w:t>
+      <w:r>
+        <w:t>, UserProfileData, GalleryItem</w:t>
       </w:r>
       <w:r>
         <w:rPr>
@@ -1141,18 +1076,18 @@
           <w:noProof/>
         </w:rPr>
         <w:drawing>
-          <wp:anchor distT="0" distB="0" distL="114300" distR="114300" simplePos="0" relativeHeight="251658240" behindDoc="0" locked="0" layoutInCell="1" allowOverlap="1" wp14:anchorId="3A2299BE" wp14:editId="5CE08E5C">
+          <wp:anchor distT="0" distB="0" distL="114300" distR="114300" simplePos="0" relativeHeight="251661312" behindDoc="0" locked="0" layoutInCell="1" allowOverlap="1" wp14:anchorId="1FDC7C58" wp14:editId="5AE94EFE">
             <wp:simplePos x="0" y="0"/>
-            <wp:positionH relativeFrom="column">
-              <wp:posOffset>-1047750</wp:posOffset>
+            <wp:positionH relativeFrom="page">
+              <wp:align>right</wp:align>
             </wp:positionH>
             <wp:positionV relativeFrom="paragraph">
-              <wp:posOffset>505460</wp:posOffset>
+              <wp:posOffset>518160</wp:posOffset>
             </wp:positionV>
-            <wp:extent cx="7623810" cy="4921885"/>
-            <wp:effectExtent l="0" t="0" r="0" b="0"/>
+            <wp:extent cx="7669530" cy="4428490"/>
+            <wp:effectExtent l="0" t="0" r="7620" b="0"/>
             <wp:wrapSquare wrapText="bothSides"/>
-            <wp:docPr id="595384771" name="תמונה 2"/>
+            <wp:docPr id="398105889" name="תמונה 5"/>
             <wp:cNvGraphicFramePr>
               <a:graphicFrameLocks xmlns:a="http://schemas.openxmlformats.org/drawingml/2006/main" noChangeAspect="1"/>
             </wp:cNvGraphicFramePr>
@@ -1160,7 +1095,7 @@
               <a:graphicData uri="http://schemas.openxmlformats.org/drawingml/2006/picture">
                 <pic:pic xmlns:pic="http://schemas.openxmlformats.org/drawingml/2006/picture">
                   <pic:nvPicPr>
-                    <pic:cNvPr id="595384771" name="תמונה 595384771"/>
+                    <pic:cNvPr id="398105889" name="תמונה 398105889"/>
                     <pic:cNvPicPr/>
                   </pic:nvPicPr>
                   <pic:blipFill>
@@ -1178,7 +1113,7 @@
                   <pic:spPr>
                     <a:xfrm>
                       <a:off x="0" y="0"/>
-                      <a:ext cx="7623810" cy="4921885"/>
+                      <a:ext cx="7669530" cy="4428490"/>
                     </a:xfrm>
                     <a:prstGeom prst="rect">
                       <a:avLst/>
@@ -1310,160 +1245,147 @@
           <w:b/>
           <w:bCs/>
         </w:rPr>
+        <w:t>Sequence Diagram</w:t>
+      </w:r>
+      <w:r>
+        <w:rPr>
+          <w:rFonts w:hint="cs"/>
+          <w:b/>
+          <w:bCs/>
+          <w:rtl/>
+        </w:rPr>
+        <w:t xml:space="preserve"> </w:t>
+      </w:r>
+      <w:r>
+        <w:rPr>
+          <w:rFonts w:hint="cs"/>
+          <w:b/>
+          <w:bCs/>
+          <w:rtl/>
+        </w:rPr>
+        <w:t xml:space="preserve">לתרחיש שבו עשינו </w:t>
+      </w:r>
+      <w:r>
+        <w:rPr>
+          <w:b/>
+          <w:bCs/>
+        </w:rPr>
+        <w:t xml:space="preserve">log in </w:t>
+      </w:r>
+      <w:r>
+        <w:rPr>
+          <w:rFonts w:hint="cs"/>
+          <w:b/>
+          <w:bCs/>
+          <w:rtl/>
+        </w:rPr>
+        <w:t xml:space="preserve"> מוצלח(טוקן ואלידי)</w:t>
+      </w:r>
+      <w:r>
+        <w:rPr>
+          <w:rFonts w:hint="cs"/>
+          <w:b/>
+          <w:bCs/>
+          <w:rtl/>
+        </w:rPr>
+        <w:t xml:space="preserve"> </w:t>
+      </w:r>
+      <w:r>
+        <w:rPr>
+          <w:rFonts w:hint="cs"/>
+          <w:b/>
+          <w:bCs/>
+          <w:rtl/>
+        </w:rPr>
+        <w:t>ורכיבי</w:t>
+      </w:r>
+      <w:r>
+        <w:rPr>
+          <w:b/>
+          <w:bCs/>
+        </w:rPr>
+        <w:t>UI</w:t>
+      </w:r>
+      <w:r>
+        <w:rPr>
+          <w:b/>
+          <w:bCs/>
+        </w:rPr>
+        <w:t xml:space="preserve"> </w:t>
+      </w:r>
+      <w:r>
+        <w:rPr>
+          <w:rFonts w:hint="cs"/>
+          <w:b/>
+          <w:bCs/>
+          <w:rtl/>
+        </w:rPr>
+        <w:t xml:space="preserve"> משתמש</w:t>
+      </w:r>
+      <w:r>
+        <w:rPr>
+          <w:rFonts w:hint="cs"/>
+          <w:b/>
+          <w:bCs/>
+          <w:rtl/>
+        </w:rPr>
+        <w:t>ים</w:t>
+      </w:r>
+      <w:r>
+        <w:rPr>
+          <w:rFonts w:hint="cs"/>
+          <w:b/>
+          <w:bCs/>
+          <w:rtl/>
+        </w:rPr>
+        <w:t xml:space="preserve"> ב</w:t>
+      </w:r>
+      <w:r>
+        <w:rPr>
+          <w:b/>
+          <w:bCs/>
+        </w:rPr>
+        <w:t>Facade</w:t>
+      </w:r>
+      <w:r>
+        <w:rPr>
+          <w:rFonts w:hint="cs"/>
+          <w:b/>
+          <w:bCs/>
+          <w:rtl/>
+        </w:rPr>
+        <w:t xml:space="preserve"> כדי לקבל את המידע שצריך להציג.</w:t>
+      </w:r>
+    </w:p>
+    <w:p>
+      <w:pPr>
+        <w:pStyle w:val="a9"/>
+        <w:rPr>
+          <w:b/>
+          <w:bCs/>
+          <w:rtl/>
+        </w:rPr>
+      </w:pPr>
+      <w:r>
+        <w:rPr>
+          <w:b/>
+          <w:bCs/>
+          <w:noProof/>
+        </w:rPr>
         <w:lastRenderedPageBreak/>
-        <w:t>Diagram Sequence</w:t>
-      </w:r>
-      <w:r>
-        <w:rPr>
-          <w:rFonts w:hint="cs"/>
-          <w:b/>
-          <w:bCs/>
-          <w:rtl/>
-        </w:rPr>
-        <w:t xml:space="preserve"> לתרחיש שבו עשינו </w:t>
-      </w:r>
-      <w:r>
-        <w:rPr>
-          <w:b/>
-          <w:bCs/>
-        </w:rPr>
-        <w:t xml:space="preserve">log </w:t>
-      </w:r>
-      <w:proofErr w:type="gramStart"/>
-      <w:r>
-        <w:rPr>
-          <w:b/>
-          <w:bCs/>
-        </w:rPr>
-        <w:t xml:space="preserve">in </w:t>
-      </w:r>
-      <w:r>
-        <w:rPr>
-          <w:rFonts w:hint="cs"/>
-          <w:b/>
-          <w:bCs/>
-          <w:rtl/>
-        </w:rPr>
-        <w:t xml:space="preserve"> מוצלח</w:t>
-      </w:r>
-      <w:proofErr w:type="gramEnd"/>
-      <w:r>
-        <w:rPr>
-          <w:rFonts w:hint="cs"/>
-          <w:b/>
-          <w:bCs/>
-          <w:rtl/>
-        </w:rPr>
-        <w:t>(טוקן ואלידי)</w:t>
-      </w:r>
-      <w:r>
-        <w:rPr>
-          <w:rFonts w:hint="cs"/>
-          <w:b/>
-          <w:bCs/>
-          <w:rtl/>
-        </w:rPr>
-        <w:t xml:space="preserve"> </w:t>
-      </w:r>
-      <w:r>
-        <w:rPr>
-          <w:rFonts w:hint="cs"/>
-          <w:b/>
-          <w:bCs/>
-          <w:rtl/>
-        </w:rPr>
-        <w:t>ורכיבי</w:t>
-      </w:r>
-      <w:proofErr w:type="gramStart"/>
-      <w:r>
-        <w:rPr>
-          <w:b/>
-          <w:bCs/>
-        </w:rPr>
-        <w:t>UI</w:t>
-      </w:r>
-      <w:r>
-        <w:rPr>
-          <w:b/>
-          <w:bCs/>
-        </w:rPr>
-        <w:t xml:space="preserve"> </w:t>
-      </w:r>
-      <w:r>
-        <w:rPr>
-          <w:rFonts w:hint="cs"/>
-          <w:b/>
-          <w:bCs/>
-          <w:rtl/>
-        </w:rPr>
-        <w:t xml:space="preserve"> משתמש</w:t>
-      </w:r>
-      <w:r>
-        <w:rPr>
-          <w:rFonts w:hint="cs"/>
-          <w:b/>
-          <w:bCs/>
-          <w:rtl/>
-        </w:rPr>
-        <w:t>ים</w:t>
-      </w:r>
-      <w:proofErr w:type="gramEnd"/>
-      <w:r>
-        <w:rPr>
-          <w:rFonts w:hint="cs"/>
-          <w:b/>
-          <w:bCs/>
-          <w:rtl/>
-        </w:rPr>
-        <w:t xml:space="preserve"> ב</w:t>
-      </w:r>
-      <w:r>
-        <w:rPr>
-          <w:b/>
-          <w:bCs/>
-        </w:rPr>
-        <w:t>Facade</w:t>
-      </w:r>
-      <w:r>
-        <w:rPr>
-          <w:rFonts w:hint="cs"/>
-          <w:b/>
-          <w:bCs/>
-          <w:rtl/>
-        </w:rPr>
-        <w:t xml:space="preserve"> כדי לקבל את המידע שצריך להציג.</w:t>
-      </w:r>
-    </w:p>
-    <w:p>
-      <w:pPr>
-        <w:pStyle w:val="a9"/>
-        <w:rPr>
-          <w:b/>
-          <w:bCs/>
-          <w:rtl/>
-        </w:rPr>
-      </w:pPr>
-      <w:r>
-        <w:rPr>
-          <w:b/>
-          <w:bCs/>
-          <w:noProof/>
-          <w:rtl/>
-          <w:lang w:val="he-IL"/>
-        </w:rPr>
         <w:drawing>
-          <wp:anchor distT="0" distB="0" distL="114300" distR="114300" simplePos="0" relativeHeight="251659264" behindDoc="0" locked="0" layoutInCell="1" allowOverlap="1" wp14:anchorId="34619E28" wp14:editId="13F62F66">
+          <wp:anchor distT="0" distB="0" distL="114300" distR="114300" simplePos="0" relativeHeight="251659264" behindDoc="0" locked="0" layoutInCell="1" allowOverlap="1" wp14:anchorId="3899F64A" wp14:editId="7D5BCA32">
             <wp:simplePos x="0" y="0"/>
-            <wp:positionH relativeFrom="margin">
-              <wp:posOffset>-1092200</wp:posOffset>
+            <wp:positionH relativeFrom="page">
+              <wp:posOffset>306349</wp:posOffset>
             </wp:positionH>
             <wp:positionV relativeFrom="paragraph">
-              <wp:posOffset>292735</wp:posOffset>
+              <wp:posOffset>202341</wp:posOffset>
             </wp:positionV>
-            <wp:extent cx="7583805" cy="5327650"/>
-            <wp:effectExtent l="0" t="0" r="0" b="6350"/>
+            <wp:extent cx="7295192" cy="4947274"/>
+            <wp:effectExtent l="0" t="0" r="1270" b="6350"/>
             <wp:wrapSquare wrapText="bothSides"/>
-            <wp:docPr id="142752924" name="תמונה 1" descr="תמונה שמכילה טקסט, תרשים, מספר, מקביל&#10;&#10;תוכן בינה מלאכותית גנרטיבית עשוי להיות שגוי."/>
+            <wp:docPr id="920691584" name="תמונה 2" descr="תמונה שמכילה טקסט, תרשים, מספר, מקביל&#10;&#10;תוכן בינה מלאכותית גנרטיבית עשוי להיות שגוי."/>
             <wp:cNvGraphicFramePr>
               <a:graphicFrameLocks xmlns:a="http://schemas.openxmlformats.org/drawingml/2006/main" noChangeAspect="1"/>
             </wp:cNvGraphicFramePr>
@@ -1471,7 +1393,7 @@
               <a:graphicData uri="http://schemas.openxmlformats.org/drawingml/2006/picture">
                 <pic:pic xmlns:pic="http://schemas.openxmlformats.org/drawingml/2006/picture">
                   <pic:nvPicPr>
-                    <pic:cNvPr id="142752924" name="תמונה 1" descr="תמונה שמכילה טקסט, תרשים, מספר, מקביל&#10;&#10;תוכן בינה מלאכותית גנרטיבית עשוי להיות שגוי."/>
+                    <pic:cNvPr id="920691584" name="תמונה 2" descr="תמונה שמכילה טקסט, תרשים, מספר, מקביל&#10;&#10;תוכן בינה מלאכותית גנרטיבית עשוי להיות שגוי."/>
                     <pic:cNvPicPr/>
                   </pic:nvPicPr>
                   <pic:blipFill>
@@ -1489,7 +1411,7 @@
                   <pic:spPr>
                     <a:xfrm>
                       <a:off x="0" y="0"/>
-                      <a:ext cx="7583805" cy="5327650"/>
+                      <a:ext cx="7295192" cy="4947274"/>
                     </a:xfrm>
                     <a:prstGeom prst="rect">
                       <a:avLst/>
@@ -1546,6 +1468,1964 @@
         </w:rPr>
       </w:pPr>
     </w:p>
+    <w:p>
+      <w:pPr>
+        <w:bidi/>
+        <w:rPr>
+          <w:b/>
+          <w:bCs/>
+        </w:rPr>
+      </w:pPr>
+    </w:p>
+    <w:p>
+      <w:pPr>
+        <w:bidi/>
+        <w:rPr>
+          <w:b/>
+          <w:bCs/>
+        </w:rPr>
+      </w:pPr>
+    </w:p>
+    <w:p>
+      <w:pPr>
+        <w:bidi/>
+        <w:rPr>
+          <w:b/>
+          <w:bCs/>
+        </w:rPr>
+      </w:pPr>
+    </w:p>
+    <w:p>
+      <w:pPr>
+        <w:bidi/>
+        <w:rPr>
+          <w:b/>
+          <w:bCs/>
+        </w:rPr>
+      </w:pPr>
+    </w:p>
+    <w:p>
+      <w:pPr>
+        <w:bidi/>
+        <w:rPr>
+          <w:b/>
+          <w:bCs/>
+        </w:rPr>
+      </w:pPr>
+    </w:p>
+    <w:p>
+      <w:pPr>
+        <w:bidi/>
+        <w:rPr>
+          <w:b/>
+          <w:bCs/>
+        </w:rPr>
+      </w:pPr>
+    </w:p>
+    <w:p>
+      <w:pPr>
+        <w:pStyle w:val="a9"/>
+        <w:numPr>
+          <w:ilvl w:val="0"/>
+          <w:numId w:val="1"/>
+        </w:numPr>
+        <w:bidi/>
+        <w:rPr>
+          <w:b/>
+          <w:bCs/>
+        </w:rPr>
+      </w:pPr>
+      <w:r>
+        <w:rPr>
+          <w:b/>
+          <w:bCs/>
+        </w:rPr>
+        <w:lastRenderedPageBreak/>
+        <w:t>Builder</w:t>
+      </w:r>
+    </w:p>
+    <w:p>
+      <w:pPr>
+        <w:pStyle w:val="a9"/>
+        <w:numPr>
+          <w:ilvl w:val="0"/>
+          <w:numId w:val="6"/>
+        </w:numPr>
+        <w:bidi/>
+        <w:rPr>
+          <w:b/>
+          <w:bCs/>
+        </w:rPr>
+      </w:pPr>
+      <w:r>
+        <w:rPr>
+          <w:rFonts w:hint="cs"/>
+          <w:b/>
+          <w:bCs/>
+          <w:rtl/>
+        </w:rPr>
+        <w:t>הסבר קצר לגבי המימוש:</w:t>
+      </w:r>
+    </w:p>
+    <w:p>
+      <w:pPr>
+        <w:bidi/>
+        <w:ind w:left="360"/>
+        <w:rPr>
+          <w:b/>
+          <w:bCs/>
+          <w:rtl/>
+        </w:rPr>
+      </w:pPr>
+      <w:r>
+        <w:rPr>
+          <w:b/>
+          <w:bCs/>
+          <w:rtl/>
+        </w:rPr>
+        <w:t>מדוע בחר</w:t>
+      </w:r>
+      <w:r>
+        <w:rPr>
+          <w:rFonts w:hint="cs"/>
+          <w:b/>
+          <w:bCs/>
+          <w:rtl/>
+        </w:rPr>
+        <w:t>נו בה ו</w:t>
+      </w:r>
+      <w:r>
+        <w:rPr>
+          <w:b/>
+          <w:bCs/>
+          <w:rtl/>
+        </w:rPr>
+        <w:t>מה מטרת השימוש בה בתוכנית של</w:t>
+      </w:r>
+      <w:r>
+        <w:rPr>
+          <w:rFonts w:hint="cs"/>
+          <w:b/>
+          <w:bCs/>
+          <w:rtl/>
+        </w:rPr>
+        <w:t>נו?</w:t>
+      </w:r>
+    </w:p>
+    <w:p>
+      <w:pPr>
+        <w:bidi/>
+        <w:ind w:left="360"/>
+        <w:rPr>
+          <w:rtl/>
+        </w:rPr>
+      </w:pPr>
+      <w:r>
+        <w:rPr>
+          <w:rtl/>
+        </w:rPr>
+        <w:t>בחרנו לממש את תבנית</w:t>
+      </w:r>
+      <w:r>
+        <w:rPr>
+          <w:rFonts w:hint="cs"/>
+          <w:rtl/>
+        </w:rPr>
+        <w:t xml:space="preserve"> ה-</w:t>
+      </w:r>
+      <w:r>
+        <w:t>builder</w:t>
+      </w:r>
+      <w:r>
+        <w:rPr>
+          <w:rFonts w:hint="cs"/>
+          <w:rtl/>
+        </w:rPr>
+        <w:t xml:space="preserve"> </w:t>
+      </w:r>
+      <w:r>
+        <w:t xml:space="preserve"> </w:t>
+      </w:r>
+      <w:r>
+        <w:rPr>
+          <w:rtl/>
+        </w:rPr>
+        <w:t xml:space="preserve">על מנת להפריד בין תהליך בניית עמודי </w:t>
+      </w:r>
+      <w:r>
+        <w:rPr>
+          <w:rFonts w:hint="cs"/>
+          <w:rtl/>
+        </w:rPr>
+        <w:t>ה-</w:t>
+      </w:r>
+      <w:r>
+        <w:t>UI</w:t>
+      </w:r>
+      <w:r>
+        <w:rPr>
+          <w:rFonts w:hint="cs"/>
+          <w:rtl/>
+        </w:rPr>
+        <w:t xml:space="preserve"> (אובייקט מורכב) </w:t>
+      </w:r>
+      <w:r>
+        <w:rPr>
+          <w:rtl/>
+        </w:rPr>
+        <w:t>של האפליקציה לבין הייצוג הסופי שלהם</w:t>
+      </w:r>
+      <w:r>
+        <w:rPr>
+          <w:rFonts w:hint="cs"/>
+          <w:rtl/>
+        </w:rPr>
+        <w:t>(</w:t>
+      </w:r>
+      <w:r>
+        <w:t>control</w:t>
+      </w:r>
+      <w:r>
+        <w:rPr>
+          <w:rFonts w:hint="cs"/>
+          <w:rtl/>
+        </w:rPr>
+        <w:t xml:space="preserve"> שמוצג על ה-</w:t>
+      </w:r>
+      <w:r>
+        <w:t>form</w:t>
+      </w:r>
+      <w:r>
+        <w:rPr>
+          <w:rFonts w:hint="cs"/>
+          <w:rtl/>
+        </w:rPr>
+        <w:t xml:space="preserve">). </w:t>
+      </w:r>
+    </w:p>
+    <w:p>
+      <w:pPr>
+        <w:bidi/>
+        <w:ind w:left="360"/>
+        <w:rPr>
+          <w:rtl/>
+        </w:rPr>
+      </w:pPr>
+      <w:r>
+        <w:rPr>
+          <w:rFonts w:hint="cs"/>
+          <w:rtl/>
+        </w:rPr>
+        <w:t>בהתאם להגדרה במצגת:</w:t>
+      </w:r>
+    </w:p>
+    <w:p>
+      <w:pPr>
+        <w:bidi/>
+        <w:ind w:left="360"/>
+        <w:rPr>
+          <w:rFonts w:hint="cs"/>
+          <w:rtl/>
+        </w:rPr>
+      </w:pPr>
+      <w:r>
+        <w:rPr>
+          <w:rFonts w:cs="Arial"/>
+          <w:rtl/>
+        </w:rPr>
+        <w:drawing>
+          <wp:inline distT="0" distB="0" distL="0" distR="0" wp14:anchorId="09D69B92" wp14:editId="68914A1D">
+            <wp:extent cx="5486400" cy="830580"/>
+            <wp:effectExtent l="0" t="0" r="0" b="7620"/>
+            <wp:docPr id="437611195" name="תמונה 1" descr="תמונה שמכילה טקסט, גופן, צילום מסך, לבן&#10;&#10;תוכן בינה מלאכותית גנרטיבית עשוי להיות שגוי."/>
+            <wp:cNvGraphicFramePr>
+              <a:graphicFrameLocks xmlns:a="http://schemas.openxmlformats.org/drawingml/2006/main" noChangeAspect="1"/>
+            </wp:cNvGraphicFramePr>
+            <a:graphic xmlns:a="http://schemas.openxmlformats.org/drawingml/2006/main">
+              <a:graphicData uri="http://schemas.openxmlformats.org/drawingml/2006/picture">
+                <pic:pic xmlns:pic="http://schemas.openxmlformats.org/drawingml/2006/picture">
+                  <pic:nvPicPr>
+                    <pic:cNvPr id="437611195" name="תמונה 1" descr="תמונה שמכילה טקסט, גופן, צילום מסך, לבן&#10;&#10;תוכן בינה מלאכותית גנרטיבית עשוי להיות שגוי."/>
+                    <pic:cNvPicPr/>
+                  </pic:nvPicPr>
+                  <pic:blipFill>
+                    <a:blip r:embed="rId8"/>
+                    <a:stretch>
+                      <a:fillRect/>
+                    </a:stretch>
+                  </pic:blipFill>
+                  <pic:spPr>
+                    <a:xfrm>
+                      <a:off x="0" y="0"/>
+                      <a:ext cx="5486400" cy="830580"/>
+                    </a:xfrm>
+                    <a:prstGeom prst="rect">
+                      <a:avLst/>
+                    </a:prstGeom>
+                  </pic:spPr>
+                </pic:pic>
+              </a:graphicData>
+            </a:graphic>
+          </wp:inline>
+        </w:drawing>
+      </w:r>
+    </w:p>
+    <w:p>
+      <w:pPr>
+        <w:bidi/>
+        <w:ind w:left="360"/>
+      </w:pPr>
+      <w:r>
+        <w:rPr>
+          <w:rtl/>
+        </w:rPr>
+        <w:t>במערכת שלנו קיימים מספר עמודים מורכבים</w:t>
+      </w:r>
+      <w:r>
+        <w:t xml:space="preserve"> (Profile, Feed, Tags Analytics</w:t>
+      </w:r>
+      <w:r>
+        <w:t>)</w:t>
+      </w:r>
+      <w:r>
+        <w:rPr>
+          <w:rFonts w:hint="cs"/>
+          <w:rtl/>
+        </w:rPr>
+        <w:t xml:space="preserve"> שלכל אחד מהם מבנה שונה אך תהליך בנייה דומה:</w:t>
+      </w:r>
+    </w:p>
+    <w:p>
+      <w:pPr>
+        <w:numPr>
+          <w:ilvl w:val="0"/>
+          <w:numId w:val="9"/>
+        </w:numPr>
+        <w:bidi/>
+      </w:pPr>
+      <w:r>
+        <w:rPr>
+          <w:rtl/>
+        </w:rPr>
+        <w:t>יצירת</w:t>
+      </w:r>
+      <w:r>
+        <w:t xml:space="preserve"> Container </w:t>
+      </w:r>
+      <w:r>
+        <w:rPr>
+          <w:rtl/>
+        </w:rPr>
+        <w:t>ראשי</w:t>
+      </w:r>
+      <w:r>
+        <w:rPr>
+          <w:rFonts w:hint="cs"/>
+          <w:rtl/>
+        </w:rPr>
+        <w:t>.</w:t>
+      </w:r>
+    </w:p>
+    <w:p>
+      <w:pPr>
+        <w:numPr>
+          <w:ilvl w:val="0"/>
+          <w:numId w:val="9"/>
+        </w:numPr>
+        <w:bidi/>
+      </w:pPr>
+      <w:r>
+        <w:rPr>
+          <w:rtl/>
+        </w:rPr>
+        <w:t>הוספת</w:t>
+      </w:r>
+      <w:r>
+        <w:t xml:space="preserve"> </w:t>
+      </w:r>
+      <w:r>
+        <w:rPr>
+          <w:rFonts w:hint="cs"/>
+          <w:rtl/>
+        </w:rPr>
+        <w:t xml:space="preserve"> </w:t>
+      </w:r>
+      <w:r>
+        <w:t>.</w:t>
+      </w:r>
+      <w:r>
+        <w:t>Header</w:t>
+      </w:r>
+    </w:p>
+    <w:p>
+      <w:pPr>
+        <w:numPr>
+          <w:ilvl w:val="0"/>
+          <w:numId w:val="9"/>
+        </w:numPr>
+        <w:bidi/>
+      </w:pPr>
+      <w:r>
+        <w:rPr>
+          <w:rtl/>
+        </w:rPr>
+        <w:t>בניית</w:t>
+      </w:r>
+      <w:r>
+        <w:t xml:space="preserve"> Body </w:t>
+      </w:r>
+      <w:r>
+        <w:rPr>
+          <w:rtl/>
+        </w:rPr>
+        <w:t>עם רכיבים פנימיים</w:t>
+      </w:r>
+    </w:p>
+    <w:p>
+      <w:pPr>
+        <w:numPr>
+          <w:ilvl w:val="0"/>
+          <w:numId w:val="9"/>
+        </w:numPr>
+        <w:bidi/>
+      </w:pPr>
+      <w:r>
+        <w:rPr>
+          <w:rtl/>
+        </w:rPr>
+        <w:t>החזרת</w:t>
+      </w:r>
+      <w:r>
+        <w:t xml:space="preserve"> Control </w:t>
+      </w:r>
+      <w:r>
+        <w:rPr>
+          <w:rtl/>
+        </w:rPr>
+        <w:t>מוכן להצגה</w:t>
+      </w:r>
+      <w:r>
+        <w:rPr>
+          <w:rFonts w:hint="cs"/>
+          <w:rtl/>
+        </w:rPr>
+        <w:t>.</w:t>
+      </w:r>
+    </w:p>
+    <w:p>
+      <w:pPr>
+        <w:bidi/>
+        <w:ind w:left="360"/>
+      </w:pPr>
+      <w:r>
+        <w:rPr>
+          <w:rtl/>
+        </w:rPr>
+        <w:t>שימ</w:t>
+      </w:r>
+      <w:r>
+        <w:rPr>
+          <w:rFonts w:hint="cs"/>
+          <w:rtl/>
+        </w:rPr>
+        <w:t>וש ב-</w:t>
+      </w:r>
+      <w:r>
+        <w:t>Builder</w:t>
+      </w:r>
+      <w:r>
+        <w:rPr>
+          <w:rFonts w:hint="cs"/>
+          <w:rtl/>
+        </w:rPr>
+        <w:t xml:space="preserve"> </w:t>
+      </w:r>
+      <w:r>
+        <w:rPr>
+          <w:rtl/>
+        </w:rPr>
+        <w:t>מאפשר</w:t>
+      </w:r>
+      <w:r>
+        <w:t>:</w:t>
+      </w:r>
+    </w:p>
+    <w:p>
+      <w:pPr>
+        <w:numPr>
+          <w:ilvl w:val="0"/>
+          <w:numId w:val="10"/>
+        </w:numPr>
+        <w:bidi/>
+      </w:pPr>
+      <w:r>
+        <w:rPr>
+          <w:rtl/>
+        </w:rPr>
+        <w:t xml:space="preserve">לבנות כל עמוד </w:t>
+      </w:r>
+      <w:r>
+        <w:rPr>
+          <w:rFonts w:hint="cs"/>
+          <w:rtl/>
+        </w:rPr>
+        <w:t>לפי השלבים שתיארנו.</w:t>
+      </w:r>
+    </w:p>
+    <w:p>
+      <w:pPr>
+        <w:numPr>
+          <w:ilvl w:val="0"/>
+          <w:numId w:val="10"/>
+        </w:numPr>
+        <w:bidi/>
+      </w:pPr>
+      <w:r>
+        <w:rPr>
+          <w:rtl/>
+        </w:rPr>
+        <w:t>להשתמש באותו תהליך בניי</w:t>
+      </w:r>
+      <w:r>
+        <w:rPr>
+          <w:rFonts w:hint="cs"/>
+          <w:rtl/>
+        </w:rPr>
+        <w:t>ה</w:t>
+      </w:r>
+      <w:r>
+        <w:t xml:space="preserve"> </w:t>
+      </w:r>
+      <w:r>
+        <w:rPr>
+          <w:rtl/>
+        </w:rPr>
+        <w:t>עבור עמודים שונים</w:t>
+      </w:r>
+      <w:r>
+        <w:rPr>
+          <w:rFonts w:hint="cs"/>
+          <w:rtl/>
+        </w:rPr>
+        <w:t>.</w:t>
+      </w:r>
+    </w:p>
+    <w:p>
+      <w:pPr>
+        <w:numPr>
+          <w:ilvl w:val="0"/>
+          <w:numId w:val="10"/>
+        </w:numPr>
+        <w:bidi/>
+      </w:pPr>
+      <w:r>
+        <w:rPr>
+          <w:rtl/>
+        </w:rPr>
+        <w:t>להוסיף עמודים חדשים בעתיד בלי לשנות את הקוד הקיים</w:t>
+      </w:r>
+      <w:r>
+        <w:t xml:space="preserve"> </w:t>
+      </w:r>
+      <w:r>
+        <w:rPr>
+          <w:rFonts w:hint="cs"/>
+          <w:rtl/>
+        </w:rPr>
+        <w:t>.</w:t>
+      </w:r>
+    </w:p>
+    <w:p>
+      <w:pPr>
+        <w:numPr>
+          <w:ilvl w:val="0"/>
+          <w:numId w:val="10"/>
+        </w:numPr>
+        <w:bidi/>
+        <w:rPr>
+          <w:rtl/>
+        </w:rPr>
+      </w:pPr>
+      <w:r>
+        <w:rPr>
+          <w:rtl/>
+        </w:rPr>
+        <w:t>לשלוט על סדר הבנייה</w:t>
+      </w:r>
+      <w:r>
+        <w:t xml:space="preserve"> </w:t>
+      </w:r>
+      <w:r>
+        <w:rPr>
+          <w:rFonts w:hint="cs"/>
+          <w:rtl/>
+        </w:rPr>
+        <w:t>.</w:t>
+      </w:r>
+    </w:p>
+    <w:p>
+      <w:pPr>
+        <w:bidi/>
+        <w:ind w:left="360"/>
+        <w:rPr>
+          <w:b/>
+          <w:bCs/>
+          <w:rtl/>
+        </w:rPr>
+      </w:pPr>
+      <w:r>
+        <w:rPr>
+          <w:b/>
+          <w:bCs/>
+          <w:rtl/>
+        </w:rPr>
+        <w:t>כיצד היא מומ</w:t>
+      </w:r>
+      <w:r>
+        <w:rPr>
+          <w:rFonts w:hint="cs"/>
+          <w:b/>
+          <w:bCs/>
+          <w:rtl/>
+        </w:rPr>
+        <w:t>שה?</w:t>
+      </w:r>
+    </w:p>
+    <w:p>
+      <w:pPr>
+        <w:bidi/>
+        <w:ind w:left="360"/>
+      </w:pPr>
+      <w:r>
+        <w:rPr>
+          <w:rtl/>
+        </w:rPr>
+        <w:t>המימוש כולל</w:t>
+      </w:r>
+      <w:r>
+        <w:t>:</w:t>
+      </w:r>
+    </w:p>
+    <w:p>
+      <w:pPr>
+        <w:numPr>
+          <w:ilvl w:val="0"/>
+          <w:numId w:val="11"/>
+        </w:numPr>
+        <w:bidi/>
+      </w:pPr>
+      <w:r>
+        <w:rPr>
+          <w:rtl/>
+        </w:rPr>
+        <w:t>ממשק</w:t>
+      </w:r>
+      <w:r>
+        <w:t xml:space="preserve"> Builder </w:t>
+      </w:r>
+      <w:r>
+        <w:rPr>
+          <w:rtl/>
+        </w:rPr>
+        <w:t>אחיד</w:t>
+      </w:r>
+      <w:r>
+        <w:t xml:space="preserve"> (IPageBuilder) </w:t>
+      </w:r>
+      <w:r>
+        <w:rPr>
+          <w:rtl/>
+        </w:rPr>
+        <w:t>שמגדיר את שלבי הבנייה</w:t>
+      </w:r>
+      <w:r>
+        <w:rPr>
+          <w:rFonts w:hint="cs"/>
+          <w:rtl/>
+        </w:rPr>
+        <w:t>.</w:t>
+      </w:r>
+    </w:p>
+    <w:p>
+      <w:pPr>
+        <w:numPr>
+          <w:ilvl w:val="0"/>
+          <w:numId w:val="11"/>
+        </w:numPr>
+        <w:bidi/>
+      </w:pPr>
+      <w:r>
+        <w:t xml:space="preserve">Composer (PageComposer) </w:t>
+      </w:r>
+      <w:r>
+        <w:rPr>
+          <w:rFonts w:hint="cs"/>
+          <w:rtl/>
+        </w:rPr>
+        <w:t xml:space="preserve"> </w:t>
+      </w:r>
+      <w:r>
+        <w:rPr>
+          <w:rtl/>
+        </w:rPr>
+        <w:t>שאחראי לנהל את תהליך הבנייה</w:t>
+      </w:r>
+      <w:r>
+        <w:rPr>
+          <w:rFonts w:hint="cs"/>
+          <w:rtl/>
+        </w:rPr>
+        <w:t>.</w:t>
+      </w:r>
+    </w:p>
+    <w:p>
+      <w:pPr>
+        <w:numPr>
+          <w:ilvl w:val="0"/>
+          <w:numId w:val="11"/>
+        </w:numPr>
+        <w:bidi/>
+      </w:pPr>
+      <w:r>
+        <w:t xml:space="preserve">Concrete Builders </w:t>
+      </w:r>
+      <w:r>
+        <w:rPr>
+          <w:rFonts w:hint="cs"/>
+          <w:rtl/>
+        </w:rPr>
+        <w:t xml:space="preserve"> שונים ל</w:t>
+      </w:r>
+      <w:r>
+        <w:rPr>
+          <w:rFonts w:hint="cs"/>
+          <w:rtl/>
+        </w:rPr>
+        <w:t>עמודים מסוגים שונים, כך</w:t>
+      </w:r>
+      <w:r>
+        <w:rPr>
+          <w:rFonts w:hint="cs"/>
+          <w:rtl/>
+        </w:rPr>
+        <w:t xml:space="preserve"> </w:t>
+      </w:r>
+      <w:r>
+        <w:rPr>
+          <w:rtl/>
+        </w:rPr>
+        <w:t xml:space="preserve">שכל אחד </w:t>
+      </w:r>
+      <w:r>
+        <w:rPr>
+          <w:rFonts w:hint="cs"/>
+          <w:rtl/>
+        </w:rPr>
+        <w:t>מהם מממש את המטודות של הממשק כך שיתאים לו.</w:t>
+      </w:r>
+    </w:p>
+    <w:p>
+      <w:pPr>
+        <w:numPr>
+          <w:ilvl w:val="0"/>
+          <w:numId w:val="11"/>
+        </w:numPr>
+        <w:bidi/>
+      </w:pPr>
+      <w:r>
+        <w:rPr>
+          <w:rFonts w:hint="cs"/>
+          <w:rtl/>
+        </w:rPr>
+        <w:t xml:space="preserve">תוצר של תהליך הבנייה, אובייקט </w:t>
+      </w:r>
+      <w:r>
+        <w:t>UI</w:t>
+      </w:r>
+      <w:r>
+        <w:rPr>
+          <w:rFonts w:hint="cs"/>
+          <w:rtl/>
+        </w:rPr>
+        <w:t xml:space="preserve"> מסוג </w:t>
+      </w:r>
+      <w:r>
+        <w:t>control</w:t>
+      </w:r>
+      <w:r>
+        <w:rPr>
+          <w:rFonts w:hint="cs"/>
+          <w:rtl/>
+        </w:rPr>
+        <w:t xml:space="preserve"> שהוא פאנל שמתאר את העמוד שבנינו.</w:t>
+      </w:r>
+    </w:p>
+    <w:p>
+      <w:pPr>
+        <w:bidi/>
+        <w:ind w:left="360"/>
+      </w:pPr>
+      <w:r>
+        <w:rPr>
+          <w:rFonts w:hint="cs"/>
+          <w:rtl/>
+        </w:rPr>
+        <w:lastRenderedPageBreak/>
+        <w:t>כמו כן ה-</w:t>
+      </w:r>
+      <w:r>
+        <w:t>Composer</w:t>
+      </w:r>
+      <w:r>
+        <w:rPr>
+          <w:rFonts w:hint="cs"/>
+          <w:rtl/>
+        </w:rPr>
+        <w:t xml:space="preserve"> </w:t>
+      </w:r>
+      <w:r>
+        <w:t xml:space="preserve"> </w:t>
+      </w:r>
+      <w:r>
+        <w:rPr>
+          <w:rtl/>
+        </w:rPr>
+        <w:t>מפעיל את הבנייה בסדר קבוע</w:t>
+      </w:r>
+      <w:r>
+        <w:t>:</w:t>
+      </w:r>
+    </w:p>
+    <w:p>
+      <w:pPr>
+        <w:numPr>
+          <w:ilvl w:val="0"/>
+          <w:numId w:val="12"/>
+        </w:numPr>
+        <w:bidi/>
+      </w:pPr>
+      <w:r>
+        <w:t>Reset</w:t>
+      </w:r>
+    </w:p>
+    <w:p>
+      <w:pPr>
+        <w:numPr>
+          <w:ilvl w:val="0"/>
+          <w:numId w:val="12"/>
+        </w:numPr>
+        <w:bidi/>
+      </w:pPr>
+      <w:r>
+        <w:t>DeliverContext</w:t>
+      </w:r>
+    </w:p>
+    <w:p>
+      <w:pPr>
+        <w:numPr>
+          <w:ilvl w:val="0"/>
+          <w:numId w:val="12"/>
+        </w:numPr>
+        <w:bidi/>
+      </w:pPr>
+      <w:r>
+        <w:t>BuildHeader</w:t>
+      </w:r>
+    </w:p>
+    <w:p>
+      <w:pPr>
+        <w:numPr>
+          <w:ilvl w:val="0"/>
+          <w:numId w:val="12"/>
+        </w:numPr>
+        <w:bidi/>
+      </w:pPr>
+      <w:r>
+        <w:t>BuildBody</w:t>
+      </w:r>
+    </w:p>
+    <w:p>
+      <w:pPr>
+        <w:numPr>
+          <w:ilvl w:val="0"/>
+          <w:numId w:val="12"/>
+        </w:numPr>
+        <w:bidi/>
+      </w:pPr>
+      <w:r>
+        <w:t>GetResult</w:t>
+      </w:r>
+    </w:p>
+    <w:p>
+      <w:pPr>
+        <w:bidi/>
+        <w:ind w:left="360"/>
+      </w:pPr>
+      <w:r>
+        <w:rPr>
+          <w:rtl/>
+        </w:rPr>
+        <w:t>בכך מתקבל תהליך בנייה אחיד אך תוצאה שונה לכל עמוד</w:t>
+      </w:r>
+      <w:r>
+        <w:t>.</w:t>
+      </w:r>
+    </w:p>
+    <w:p>
+      <w:pPr>
+        <w:bidi/>
+        <w:ind w:left="360"/>
+        <w:rPr>
+          <w:b/>
+          <w:bCs/>
+          <w:rtl/>
+        </w:rPr>
+      </w:pPr>
+    </w:p>
+    <w:p>
+      <w:pPr>
+        <w:pStyle w:val="a9"/>
+        <w:numPr>
+          <w:ilvl w:val="0"/>
+          <w:numId w:val="6"/>
+        </w:numPr>
+        <w:bidi/>
+        <w:rPr>
+          <w:b/>
+          <w:bCs/>
+        </w:rPr>
+      </w:pPr>
+      <w:r>
+        <w:rPr>
+          <w:rFonts w:hint="cs"/>
+          <w:b/>
+          <w:bCs/>
+          <w:rtl/>
+        </w:rPr>
+        <w:t>איזה מחלקה בקוד שלנו מייצגת איזה "שחקן" בתבנית?</w:t>
+      </w:r>
+    </w:p>
+    <w:p>
+      <w:pPr>
+        <w:bidi/>
+        <w:ind w:left="360"/>
+        <w:rPr>
+          <w:rtl/>
+        </w:rPr>
+      </w:pPr>
+      <w:r>
+        <w:rPr>
+          <w:rFonts w:hint="cs"/>
+          <w:rtl/>
+        </w:rPr>
+        <w:t>שחקן בתפקיד ה</w:t>
+      </w:r>
+      <w:r>
+        <w:t>Client</w:t>
+      </w:r>
+      <w:r>
+        <w:rPr>
+          <w:rFonts w:hint="cs"/>
+          <w:rtl/>
+        </w:rPr>
+        <w:t>:</w:t>
+      </w:r>
+    </w:p>
+    <w:p>
+      <w:pPr>
+        <w:pStyle w:val="a9"/>
+        <w:numPr>
+          <w:ilvl w:val="0"/>
+          <w:numId w:val="13"/>
+        </w:numPr>
+        <w:bidi/>
+      </w:pPr>
+      <w:r>
+        <w:t>UserMainForm</w:t>
+      </w:r>
+    </w:p>
+    <w:p>
+      <w:pPr>
+        <w:bidi/>
+        <w:rPr>
+          <w:rtl/>
+        </w:rPr>
+      </w:pPr>
+      <w:r>
+        <w:rPr>
+          <w:rFonts w:hint="cs"/>
+          <w:rtl/>
+        </w:rPr>
+        <w:t xml:space="preserve">     שחקן בתפקיד </w:t>
+      </w:r>
+      <w:r>
+        <w:t>Composer</w:t>
+      </w:r>
+      <w:r>
+        <w:rPr>
+          <w:rFonts w:hint="cs"/>
+          <w:rtl/>
+        </w:rPr>
+        <w:t>:</w:t>
+      </w:r>
+    </w:p>
+    <w:p>
+      <w:pPr>
+        <w:pStyle w:val="a9"/>
+        <w:numPr>
+          <w:ilvl w:val="0"/>
+          <w:numId w:val="13"/>
+        </w:numPr>
+        <w:bidi/>
+      </w:pPr>
+      <w:r>
+        <w:t>PageComposer</w:t>
+      </w:r>
+    </w:p>
+    <w:p>
+      <w:pPr>
+        <w:bidi/>
+        <w:rPr>
+          <w:rtl/>
+        </w:rPr>
+      </w:pPr>
+      <w:r>
+        <w:rPr>
+          <w:rFonts w:hint="cs"/>
+          <w:rtl/>
+        </w:rPr>
+        <w:t xml:space="preserve">    שחקן בתפקיד הממשק שאותו הבנאים יממשו(</w:t>
+      </w:r>
+      <w:r>
+        <w:t>Interface</w:t>
+      </w:r>
+      <w:r>
+        <w:rPr>
+          <w:rFonts w:hint="cs"/>
+          <w:rtl/>
+        </w:rPr>
+        <w:t>):</w:t>
+      </w:r>
+    </w:p>
+    <w:p>
+      <w:pPr>
+        <w:pStyle w:val="a9"/>
+        <w:numPr>
+          <w:ilvl w:val="0"/>
+          <w:numId w:val="13"/>
+        </w:numPr>
+        <w:bidi/>
+      </w:pPr>
+      <w:r>
+        <w:t>IPageBuilder</w:t>
+      </w:r>
+    </w:p>
+    <w:p>
+      <w:pPr>
+        <w:bidi/>
+        <w:rPr>
+          <w:rtl/>
+        </w:rPr>
+      </w:pPr>
+      <w:r>
+        <w:rPr>
+          <w:rFonts w:hint="cs"/>
+          <w:rtl/>
+        </w:rPr>
+        <w:t xml:space="preserve">    שחקנים בתפקיד </w:t>
+      </w:r>
+      <w:r>
+        <w:t>Concrete Builde</w:t>
+      </w:r>
+      <w:r>
+        <w:t>r</w:t>
+      </w:r>
+      <w:r>
+        <w:rPr>
+          <w:rFonts w:hint="cs"/>
+          <w:rtl/>
+        </w:rPr>
+        <w:t>:</w:t>
+      </w:r>
+    </w:p>
+    <w:p>
+      <w:pPr>
+        <w:pStyle w:val="a9"/>
+        <w:numPr>
+          <w:ilvl w:val="0"/>
+          <w:numId w:val="13"/>
+        </w:numPr>
+        <w:bidi/>
+      </w:pPr>
+      <w:r>
+        <w:t>ProfilePageBuilder</w:t>
+      </w:r>
+    </w:p>
+    <w:p>
+      <w:pPr>
+        <w:pStyle w:val="a9"/>
+        <w:numPr>
+          <w:ilvl w:val="0"/>
+          <w:numId w:val="13"/>
+        </w:numPr>
+        <w:bidi/>
+      </w:pPr>
+      <w:r>
+        <w:t>FeedPageBuilder</w:t>
+      </w:r>
+    </w:p>
+    <w:p>
+      <w:pPr>
+        <w:pStyle w:val="a9"/>
+        <w:numPr>
+          <w:ilvl w:val="0"/>
+          <w:numId w:val="13"/>
+        </w:numPr>
+        <w:bidi/>
+      </w:pPr>
+      <w:r>
+        <w:t>TagsAnalyticsPageBuilder</w:t>
+      </w:r>
+    </w:p>
+    <w:p>
+      <w:pPr>
+        <w:bidi/>
+        <w:rPr>
+          <w:rtl/>
+        </w:rPr>
+      </w:pPr>
+      <w:r>
+        <w:rPr>
+          <w:rFonts w:hint="cs"/>
+          <w:rtl/>
+        </w:rPr>
+        <w:t xml:space="preserve">   שחקן בתפקיד </w:t>
+      </w:r>
+      <w:r>
+        <w:t>Pruduct</w:t>
+      </w:r>
+      <w:r>
+        <w:rPr>
+          <w:rFonts w:hint="cs"/>
+          <w:rtl/>
+        </w:rPr>
+        <w:t>:</w:t>
+      </w:r>
+    </w:p>
+    <w:p>
+      <w:pPr>
+        <w:pStyle w:val="a9"/>
+        <w:numPr>
+          <w:ilvl w:val="0"/>
+          <w:numId w:val="14"/>
+        </w:numPr>
+        <w:bidi/>
+      </w:pPr>
+      <w:r>
+        <w:t>Control</w:t>
+      </w:r>
+      <w:r>
+        <w:rPr>
+          <w:rFonts w:hint="cs"/>
+          <w:rtl/>
+        </w:rPr>
+        <w:t>(</w:t>
+      </w:r>
+      <w:r>
+        <w:t>FlowLayoutPane</w:t>
+      </w:r>
+      <w:r>
+        <w:rPr>
+          <w:rFonts w:hint="cs"/>
+          <w:rtl/>
+        </w:rPr>
+        <w:t xml:space="preserve">, </w:t>
+      </w:r>
+      <w:r>
+        <w:t>Panel</w:t>
+      </w:r>
+      <w:r>
+        <w:rPr>
+          <w:rFonts w:hint="cs"/>
+          <w:rtl/>
+        </w:rPr>
+        <w:t>)</w:t>
+      </w:r>
+    </w:p>
+    <w:p>
+      <w:pPr>
+        <w:bidi/>
+        <w:ind w:left="360"/>
+        <w:rPr>
+          <w:rtl/>
+        </w:rPr>
+      </w:pPr>
+      <w:r>
+        <w:rPr>
+          <w:rFonts w:hint="cs"/>
+          <w:rtl/>
+        </w:rPr>
+        <w:t>שחקן נוסף שלא דובר עליו במצגת אך הוספנו אותו על מנת שיהיה ל-</w:t>
+      </w:r>
+      <w:r>
+        <w:t>Composer</w:t>
+      </w:r>
+      <w:r>
+        <w:rPr>
+          <w:rFonts w:hint="cs"/>
+          <w:rtl/>
+        </w:rPr>
+        <w:t xml:space="preserve"> את       ה-</w:t>
+      </w:r>
+      <w:r>
+        <w:t>context</w:t>
+      </w:r>
+      <w:r>
+        <w:rPr>
+          <w:rFonts w:hint="cs"/>
+          <w:rtl/>
+        </w:rPr>
+        <w:t>(בשביל ההסבר נקביל את זה למשהו שדובר בסרטון שצפינו. השחקן הנוסף הוא ההזמנה של לקוח במסעדה ממלצר. מה שהוא מזמין זה ה-</w:t>
+      </w:r>
+      <w:r>
+        <w:t>context</w:t>
+      </w:r>
+      <w:r>
+        <w:rPr>
+          <w:rFonts w:hint="cs"/>
+          <w:rtl/>
+        </w:rPr>
+        <w:t>)</w:t>
+      </w:r>
+    </w:p>
+    <w:p>
+      <w:pPr>
+        <w:pStyle w:val="a9"/>
+        <w:numPr>
+          <w:ilvl w:val="0"/>
+          <w:numId w:val="14"/>
+        </w:numPr>
+        <w:bidi/>
+        <w:rPr>
+          <w:rFonts w:hint="cs"/>
+          <w:rtl/>
+        </w:rPr>
+      </w:pPr>
+      <w:r>
+        <w:t>PageBuildContext</w:t>
+      </w:r>
+    </w:p>
+    <w:p>
+      <w:pPr>
+        <w:bidi/>
+      </w:pPr>
+    </w:p>
+    <w:p>
+      <w:pPr>
+        <w:pStyle w:val="a9"/>
+        <w:numPr>
+          <w:ilvl w:val="0"/>
+          <w:numId w:val="6"/>
+        </w:numPr>
+        <w:bidi/>
+        <w:rPr>
+          <w:b/>
+          <w:bCs/>
+        </w:rPr>
+      </w:pPr>
+      <w:r>
+        <w:rPr>
+          <w:b/>
+          <w:bCs/>
+          <w:rtl/>
+        </w:rPr>
+        <w:lastRenderedPageBreak/>
+        <w:t>תרשים מחלקו</w:t>
+      </w:r>
+      <w:r>
+        <w:rPr>
+          <w:rFonts w:hint="cs"/>
+          <w:b/>
+          <w:bCs/>
+          <w:rtl/>
+        </w:rPr>
+        <w:t xml:space="preserve">ת מלא </w:t>
+      </w:r>
+      <w:r>
+        <w:rPr>
+          <w:b/>
+          <w:bCs/>
+          <w:rtl/>
+        </w:rPr>
+        <w:t xml:space="preserve">שמתאר את המחלקות שמעורבות בתבנית </w:t>
+      </w:r>
+      <w:r>
+        <w:rPr>
+          <w:rFonts w:hint="cs"/>
+          <w:b/>
+          <w:bCs/>
+          <w:rtl/>
+        </w:rPr>
+        <w:t>שבחרנו כולל</w:t>
+      </w:r>
+      <w:r>
+        <w:rPr>
+          <w:b/>
+          <w:bCs/>
+          <w:rtl/>
+        </w:rPr>
+        <w:t xml:space="preserve"> עבור כל מחלקה,</w:t>
+      </w:r>
+      <w:r>
+        <w:rPr>
+          <w:rFonts w:hint="cs"/>
+          <w:b/>
+          <w:bCs/>
+          <w:rtl/>
+        </w:rPr>
+        <w:t xml:space="preserve"> </w:t>
+      </w:r>
+      <w:r>
+        <w:rPr>
+          <w:b/>
+          <w:bCs/>
+          <w:rtl/>
+        </w:rPr>
+        <w:t>מי המקבילה שלה אם יש כ</w:t>
+      </w:r>
+      <w:r>
+        <w:rPr>
+          <w:rFonts w:hint="cs"/>
+          <w:b/>
+          <w:bCs/>
+          <w:rtl/>
+        </w:rPr>
+        <w:t>זו בתבנית שלמדנו בכיתה:</w:t>
+      </w:r>
+    </w:p>
+    <w:p>
+      <w:pPr>
+        <w:bidi/>
+        <w:ind w:left="360"/>
+        <w:rPr>
+          <w:b/>
+          <w:bCs/>
+        </w:rPr>
+      </w:pPr>
+      <w:r>
+        <w:rPr>
+          <w:b/>
+          <w:bCs/>
+          <w:noProof/>
+        </w:rPr>
+        <w:drawing>
+          <wp:anchor distT="0" distB="0" distL="114300" distR="114300" simplePos="0" relativeHeight="251662336" behindDoc="0" locked="0" layoutInCell="1" allowOverlap="1" wp14:anchorId="287606F1" wp14:editId="19BDAA18">
+            <wp:simplePos x="0" y="0"/>
+            <wp:positionH relativeFrom="margin">
+              <wp:align>center</wp:align>
+            </wp:positionH>
+            <wp:positionV relativeFrom="paragraph">
+              <wp:posOffset>429260</wp:posOffset>
+            </wp:positionV>
+            <wp:extent cx="6913245" cy="5141595"/>
+            <wp:effectExtent l="0" t="0" r="1905" b="1905"/>
+            <wp:wrapSquare wrapText="bothSides"/>
+            <wp:docPr id="2053278836" name="תמונה 2" descr="תמונה שמכילה טקסט, תרשים, תוכנית, שרטוט טכני&#10;&#10;תוכן בינה מלאכותית גנרטיבית עשוי להיות שגוי."/>
+            <wp:cNvGraphicFramePr>
+              <a:graphicFrameLocks xmlns:a="http://schemas.openxmlformats.org/drawingml/2006/main" noChangeAspect="1"/>
+            </wp:cNvGraphicFramePr>
+            <a:graphic xmlns:a="http://schemas.openxmlformats.org/drawingml/2006/main">
+              <a:graphicData uri="http://schemas.openxmlformats.org/drawingml/2006/picture">
+                <pic:pic xmlns:pic="http://schemas.openxmlformats.org/drawingml/2006/picture">
+                  <pic:nvPicPr>
+                    <pic:cNvPr id="2053278836" name="תמונה 2" descr="תמונה שמכילה טקסט, תרשים, תוכנית, שרטוט טכני&#10;&#10;תוכן בינה מלאכותית גנרטיבית עשוי להיות שגוי."/>
+                    <pic:cNvPicPr/>
+                  </pic:nvPicPr>
+                  <pic:blipFill>
+                    <a:blip r:embed="rId9" cstate="print">
+                      <a:extLst>
+                        <a:ext uri="{28A0092B-C50C-407E-A947-70E740481C1C}">
+                          <a14:useLocalDpi xmlns:a14="http://schemas.microsoft.com/office/drawing/2010/main" val="0"/>
+                        </a:ext>
+                      </a:extLst>
+                    </a:blip>
+                    <a:stretch>
+                      <a:fillRect/>
+                    </a:stretch>
+                  </pic:blipFill>
+                  <pic:spPr>
+                    <a:xfrm>
+                      <a:off x="0" y="0"/>
+                      <a:ext cx="6913245" cy="5141595"/>
+                    </a:xfrm>
+                    <a:prstGeom prst="rect">
+                      <a:avLst/>
+                    </a:prstGeom>
+                  </pic:spPr>
+                </pic:pic>
+              </a:graphicData>
+            </a:graphic>
+            <wp14:sizeRelH relativeFrom="page">
+              <wp14:pctWidth>0</wp14:pctWidth>
+            </wp14:sizeRelH>
+            <wp14:sizeRelV relativeFrom="page">
+              <wp14:pctHeight>0</wp14:pctHeight>
+            </wp14:sizeRelV>
+          </wp:anchor>
+        </w:drawing>
+      </w:r>
+    </w:p>
+    <w:p>
+      <w:pPr>
+        <w:bidi/>
+        <w:ind w:left="360"/>
+        <w:rPr>
+          <w:b/>
+          <w:bCs/>
+        </w:rPr>
+      </w:pPr>
+    </w:p>
+    <w:p>
+      <w:pPr>
+        <w:bidi/>
+        <w:ind w:left="360"/>
+        <w:rPr>
+          <w:b/>
+          <w:bCs/>
+        </w:rPr>
+      </w:pPr>
+    </w:p>
+    <w:p>
+      <w:pPr>
+        <w:bidi/>
+        <w:ind w:left="360"/>
+        <w:rPr>
+          <w:b/>
+          <w:bCs/>
+        </w:rPr>
+      </w:pPr>
+    </w:p>
+    <w:p>
+      <w:pPr>
+        <w:bidi/>
+        <w:ind w:left="360"/>
+        <w:rPr>
+          <w:b/>
+          <w:bCs/>
+        </w:rPr>
+      </w:pPr>
+    </w:p>
+    <w:p>
+      <w:pPr>
+        <w:bidi/>
+        <w:ind w:left="360"/>
+        <w:rPr>
+          <w:b/>
+          <w:bCs/>
+        </w:rPr>
+      </w:pPr>
+    </w:p>
+    <w:p>
+      <w:pPr>
+        <w:bidi/>
+        <w:ind w:left="360"/>
+        <w:rPr>
+          <w:b/>
+          <w:bCs/>
+        </w:rPr>
+      </w:pPr>
+    </w:p>
+    <w:p>
+      <w:pPr>
+        <w:pStyle w:val="a9"/>
+        <w:numPr>
+          <w:ilvl w:val="0"/>
+          <w:numId w:val="6"/>
+        </w:numPr>
+        <w:bidi/>
+        <w:rPr>
+          <w:b/>
+          <w:bCs/>
+        </w:rPr>
+      </w:pPr>
+      <w:r>
+        <w:rPr>
+          <w:b/>
+          <w:bCs/>
+        </w:rPr>
+        <w:lastRenderedPageBreak/>
+        <w:t>Sequence Diagram</w:t>
+      </w:r>
+      <w:r>
+        <w:rPr>
+          <w:rFonts w:hint="cs"/>
+          <w:b/>
+          <w:bCs/>
+          <w:rtl/>
+        </w:rPr>
+        <w:t xml:space="preserve"> לתרחיש שבו עשינו </w:t>
+      </w:r>
+      <w:r>
+        <w:rPr>
+          <w:b/>
+          <w:bCs/>
+        </w:rPr>
+        <w:t>log in</w:t>
+      </w:r>
+      <w:r>
+        <w:rPr>
+          <w:rFonts w:hint="cs"/>
+          <w:b/>
+          <w:bCs/>
+          <w:rtl/>
+        </w:rPr>
+        <w:t xml:space="preserve"> מוצלח ונבנה דף הפרופיל שיהיה להצגה בעזרת ה</w:t>
+      </w:r>
+      <w:r>
+        <w:rPr>
+          <w:b/>
+          <w:bCs/>
+        </w:rPr>
+        <w:t xml:space="preserve"> </w:t>
+      </w:r>
+      <w:r>
+        <w:rPr>
+          <w:rFonts w:hint="cs"/>
+          <w:b/>
+          <w:bCs/>
+          <w:rtl/>
+        </w:rPr>
+        <w:t>-</w:t>
+      </w:r>
+      <w:r>
+        <w:rPr>
+          <w:b/>
+          <w:bCs/>
+        </w:rPr>
+        <w:t>Builder</w:t>
+      </w:r>
+      <w:r>
+        <w:rPr>
+          <w:rFonts w:hint="cs"/>
+          <w:b/>
+          <w:bCs/>
+          <w:rtl/>
+        </w:rPr>
+        <w:t>.</w:t>
+      </w:r>
+    </w:p>
+    <w:p>
+      <w:pPr>
+        <w:bidi/>
+        <w:rPr>
+          <w:b/>
+          <w:bCs/>
+        </w:rPr>
+      </w:pPr>
+      <w:r>
+        <w:rPr>
+          <w:noProof/>
+        </w:rPr>
+        <w:drawing>
+          <wp:anchor distT="0" distB="0" distL="114300" distR="114300" simplePos="0" relativeHeight="251660288" behindDoc="0" locked="0" layoutInCell="1" allowOverlap="1" wp14:anchorId="35DB8AB7" wp14:editId="4D4EC88D">
+            <wp:simplePos x="0" y="0"/>
+            <wp:positionH relativeFrom="margin">
+              <wp:align>center</wp:align>
+            </wp:positionH>
+            <wp:positionV relativeFrom="paragraph">
+              <wp:posOffset>275293</wp:posOffset>
+            </wp:positionV>
+            <wp:extent cx="7101205" cy="4801870"/>
+            <wp:effectExtent l="0" t="0" r="4445" b="0"/>
+            <wp:wrapSquare wrapText="bothSides"/>
+            <wp:docPr id="1965074640" name="תמונה 3" descr="תמונה שמכילה טקסט, צילום מסך, גופן, מספר&#10;&#10;תוכן בינה מלאכותית גנרטיבית עשוי להיות שגוי."/>
+            <wp:cNvGraphicFramePr>
+              <a:graphicFrameLocks xmlns:a="http://schemas.openxmlformats.org/drawingml/2006/main" noChangeAspect="1"/>
+            </wp:cNvGraphicFramePr>
+            <a:graphic xmlns:a="http://schemas.openxmlformats.org/drawingml/2006/main">
+              <a:graphicData uri="http://schemas.openxmlformats.org/drawingml/2006/picture">
+                <pic:pic xmlns:pic="http://schemas.openxmlformats.org/drawingml/2006/picture">
+                  <pic:nvPicPr>
+                    <pic:cNvPr id="1965074640" name="תמונה 3" descr="תמונה שמכילה טקסט, צילום מסך, גופן, מספר&#10;&#10;תוכן בינה מלאכותית גנרטיבית עשוי להיות שגוי."/>
+                    <pic:cNvPicPr/>
+                  </pic:nvPicPr>
+                  <pic:blipFill>
+                    <a:blip r:embed="rId10">
+                      <a:extLst>
+                        <a:ext uri="{28A0092B-C50C-407E-A947-70E740481C1C}">
+                          <a14:useLocalDpi xmlns:a14="http://schemas.microsoft.com/office/drawing/2010/main" val="0"/>
+                        </a:ext>
+                      </a:extLst>
+                    </a:blip>
+                    <a:stretch>
+                      <a:fillRect/>
+                    </a:stretch>
+                  </pic:blipFill>
+                  <pic:spPr>
+                    <a:xfrm>
+                      <a:off x="0" y="0"/>
+                      <a:ext cx="7101205" cy="4801870"/>
+                    </a:xfrm>
+                    <a:prstGeom prst="rect">
+                      <a:avLst/>
+                    </a:prstGeom>
+                  </pic:spPr>
+                </pic:pic>
+              </a:graphicData>
+            </a:graphic>
+            <wp14:sizeRelH relativeFrom="page">
+              <wp14:pctWidth>0</wp14:pctWidth>
+            </wp14:sizeRelH>
+            <wp14:sizeRelV relativeFrom="page">
+              <wp14:pctHeight>0</wp14:pctHeight>
+            </wp14:sizeRelV>
+          </wp:anchor>
+        </w:drawing>
+      </w:r>
+    </w:p>
+    <w:p>
+      <w:pPr>
+        <w:bidi/>
+        <w:rPr>
+          <w:b/>
+          <w:bCs/>
+        </w:rPr>
+      </w:pPr>
+    </w:p>
+    <w:p>
+      <w:pPr>
+        <w:bidi/>
+        <w:rPr>
+          <w:b/>
+          <w:bCs/>
+        </w:rPr>
+      </w:pPr>
+    </w:p>
+    <w:p>
+      <w:pPr>
+        <w:bidi/>
+        <w:rPr>
+          <w:b/>
+          <w:bCs/>
+        </w:rPr>
+      </w:pPr>
+    </w:p>
+    <w:p>
+      <w:pPr>
+        <w:bidi/>
+        <w:rPr>
+          <w:b/>
+          <w:bCs/>
+        </w:rPr>
+      </w:pPr>
+    </w:p>
+    <w:p>
+      <w:pPr>
+        <w:bidi/>
+        <w:rPr>
+          <w:b/>
+          <w:bCs/>
+        </w:rPr>
+      </w:pPr>
+    </w:p>
+    <w:p>
+      <w:pPr>
+        <w:bidi/>
+        <w:rPr>
+          <w:b/>
+          <w:bCs/>
+        </w:rPr>
+      </w:pPr>
+    </w:p>
+    <w:p>
+      <w:pPr>
+        <w:bidi/>
+        <w:rPr>
+          <w:b/>
+          <w:bCs/>
+        </w:rPr>
+      </w:pPr>
+    </w:p>
+    <w:p>
+      <w:pPr>
+        <w:bidi/>
+        <w:rPr>
+          <w:b/>
+          <w:bCs/>
+        </w:rPr>
+      </w:pPr>
+    </w:p>
+    <w:p>
+      <w:pPr>
+        <w:pStyle w:val="a9"/>
+        <w:numPr>
+          <w:ilvl w:val="0"/>
+          <w:numId w:val="1"/>
+        </w:numPr>
+        <w:bidi/>
+        <w:rPr>
+          <w:b/>
+          <w:bCs/>
+        </w:rPr>
+      </w:pPr>
+      <w:r>
+        <w:rPr>
+          <w:b/>
+          <w:bCs/>
+        </w:rPr>
+        <w:lastRenderedPageBreak/>
+        <w:t>Adapter</w:t>
+      </w:r>
+    </w:p>
+    <w:p>
+      <w:pPr>
+        <w:pStyle w:val="a9"/>
+        <w:numPr>
+          <w:ilvl w:val="0"/>
+          <w:numId w:val="8"/>
+        </w:numPr>
+        <w:bidi/>
+        <w:rPr>
+          <w:b/>
+          <w:bCs/>
+        </w:rPr>
+      </w:pPr>
+      <w:r>
+        <w:rPr>
+          <w:rFonts w:hint="cs"/>
+          <w:b/>
+          <w:bCs/>
+          <w:rtl/>
+        </w:rPr>
+        <w:t>הסבר קצר לגבי המימוש:</w:t>
+      </w:r>
+    </w:p>
+    <w:p>
+      <w:pPr>
+        <w:bidi/>
+        <w:ind w:left="360"/>
+        <w:rPr>
+          <w:b/>
+          <w:bCs/>
+          <w:rtl/>
+        </w:rPr>
+      </w:pPr>
+      <w:r>
+        <w:rPr>
+          <w:b/>
+          <w:bCs/>
+          <w:rtl/>
+        </w:rPr>
+        <w:t>מדוע בחר</w:t>
+      </w:r>
+      <w:r>
+        <w:rPr>
+          <w:rFonts w:hint="cs"/>
+          <w:b/>
+          <w:bCs/>
+          <w:rtl/>
+        </w:rPr>
+        <w:t>נו בה ו</w:t>
+      </w:r>
+      <w:r>
+        <w:rPr>
+          <w:b/>
+          <w:bCs/>
+          <w:rtl/>
+        </w:rPr>
+        <w:t>מה מטרת השימוש בה בתוכנית של</w:t>
+      </w:r>
+      <w:r>
+        <w:rPr>
+          <w:rFonts w:hint="cs"/>
+          <w:b/>
+          <w:bCs/>
+          <w:rtl/>
+        </w:rPr>
+        <w:t>נו?</w:t>
+      </w:r>
+    </w:p>
+    <w:p>
+      <w:pPr>
+        <w:bidi/>
+        <w:ind w:left="360"/>
+        <w:rPr>
+          <w:b/>
+          <w:bCs/>
+          <w:rtl/>
+        </w:rPr>
+      </w:pPr>
+      <w:r>
+        <w:rPr>
+          <w:b/>
+          <w:bCs/>
+          <w:rtl/>
+        </w:rPr>
+        <w:t>כיצד היא מומ</w:t>
+      </w:r>
+      <w:r>
+        <w:rPr>
+          <w:rFonts w:hint="cs"/>
+          <w:b/>
+          <w:bCs/>
+          <w:rtl/>
+        </w:rPr>
+        <w:t>שה?</w:t>
+      </w:r>
+    </w:p>
+    <w:p>
+      <w:pPr>
+        <w:pStyle w:val="a9"/>
+        <w:numPr>
+          <w:ilvl w:val="0"/>
+          <w:numId w:val="7"/>
+        </w:numPr>
+        <w:bidi/>
+        <w:rPr>
+          <w:b/>
+          <w:bCs/>
+        </w:rPr>
+      </w:pPr>
+      <w:r>
+        <w:rPr>
+          <w:rFonts w:hint="cs"/>
+          <w:b/>
+          <w:bCs/>
+          <w:rtl/>
+        </w:rPr>
+        <w:t>איזה מחלקה בקוד שלנו מייצגת איזה "שחקן" בתבנית?</w:t>
+      </w:r>
+    </w:p>
+    <w:p>
+      <w:pPr>
+        <w:pStyle w:val="a9"/>
+        <w:numPr>
+          <w:ilvl w:val="0"/>
+          <w:numId w:val="7"/>
+        </w:numPr>
+        <w:bidi/>
+        <w:rPr>
+          <w:b/>
+          <w:bCs/>
+        </w:rPr>
+      </w:pPr>
+      <w:r>
+        <w:rPr>
+          <w:b/>
+          <w:bCs/>
+          <w:rtl/>
+        </w:rPr>
+        <w:t>תרשים מחלקו</w:t>
+      </w:r>
+      <w:r>
+        <w:rPr>
+          <w:rFonts w:hint="cs"/>
+          <w:b/>
+          <w:bCs/>
+          <w:rtl/>
+        </w:rPr>
+        <w:t xml:space="preserve">ת מלא </w:t>
+      </w:r>
+      <w:r>
+        <w:rPr>
+          <w:b/>
+          <w:bCs/>
+          <w:rtl/>
+        </w:rPr>
+        <w:t xml:space="preserve">שמתאר את המחלקות שמעורבות בתבנית </w:t>
+      </w:r>
+      <w:r>
+        <w:rPr>
+          <w:rFonts w:hint="cs"/>
+          <w:b/>
+          <w:bCs/>
+          <w:rtl/>
+        </w:rPr>
+        <w:t>שבחרנו כולל</w:t>
+      </w:r>
+      <w:r>
+        <w:rPr>
+          <w:b/>
+          <w:bCs/>
+          <w:rtl/>
+        </w:rPr>
+        <w:t xml:space="preserve"> עבור כל מחלקה,</w:t>
+      </w:r>
+      <w:r>
+        <w:rPr>
+          <w:rFonts w:hint="cs"/>
+          <w:b/>
+          <w:bCs/>
+          <w:rtl/>
+        </w:rPr>
+        <w:t xml:space="preserve"> </w:t>
+      </w:r>
+      <w:r>
+        <w:rPr>
+          <w:b/>
+          <w:bCs/>
+          <w:rtl/>
+        </w:rPr>
+        <w:t>מי המקבילה שלה אם יש כ</w:t>
+      </w:r>
+      <w:r>
+        <w:rPr>
+          <w:rFonts w:hint="cs"/>
+          <w:b/>
+          <w:bCs/>
+          <w:rtl/>
+        </w:rPr>
+        <w:t>זו בתבנית שלמדנו בכיתה:</w:t>
+      </w:r>
+    </w:p>
+    <w:p>
+      <w:pPr>
+        <w:pStyle w:val="a9"/>
+        <w:numPr>
+          <w:ilvl w:val="0"/>
+          <w:numId w:val="7"/>
+        </w:numPr>
+        <w:bidi/>
+        <w:rPr>
+          <w:b/>
+          <w:bCs/>
+        </w:rPr>
+      </w:pPr>
+      <w:r>
+        <w:rPr>
+          <w:rFonts w:hint="cs"/>
+          <w:b/>
+          <w:bCs/>
+          <w:rtl/>
+        </w:rPr>
+        <w:t xml:space="preserve"> </w:t>
+      </w:r>
+      <w:r>
+        <w:rPr>
+          <w:b/>
+          <w:bCs/>
+        </w:rPr>
+        <w:t>Sequence diagram</w:t>
+      </w:r>
+      <w:r>
+        <w:rPr>
+          <w:rFonts w:hint="cs"/>
+          <w:b/>
+          <w:bCs/>
+          <w:rtl/>
+        </w:rPr>
+        <w:t xml:space="preserve"> לתרחיש שבו (תשלים לבד אין לי רעיון).</w:t>
+      </w:r>
+      <w:r>
+        <w:rPr>
+          <w:rFonts w:hint="cs"/>
+          <w:b/>
+          <w:bCs/>
+          <w:rtl/>
+        </w:rPr>
+        <w:t xml:space="preserve"> </w:t>
+      </w:r>
+    </w:p>
     <w:sectPr>
       <w:pgSz w:w="12240" w:h="15840"/>
       <w:pgMar w:top="1440" w:right="1800" w:bottom="1440" w:left="1800" w:header="720" w:footer="720" w:gutter="0"/>
@@ -1559,6 +3439,95 @@
 <file path=word/numbering.xml><?xml version="1.0" encoding="utf-8"?>
 <w:numbering xmlns:wpc="http://schemas.microsoft.com/office/word/2010/wordprocessingCanvas" xmlns:cx="http://schemas.microsoft.com/office/drawing/2014/chartex" xmlns:cx1="http://schemas.microsoft.com/office/drawing/2015/9/8/chartex" xmlns:cx2="http://schemas.microsoft.com/office/drawing/2015/10/21/chartex" xmlns:cx3="http://schemas.microsoft.com/office/drawing/2016/5/9/chartex" xmlns:cx4="http://schemas.microsoft.com/office/drawing/2016/5/10/chartex" xmlns:cx5="http://schemas.microsoft.com/office/drawing/2016/5/11/chartex" xmlns:cx6="http://schemas.microsoft.com/office/drawing/2016/5/12/chartex" xmlns:cx7="http://schemas.microsoft.com/office/drawing/2016/5/13/chartex" xmlns:cx8="http://schemas.microsoft.com/office/drawing/2016/5/14/chartex" xmlns:mc="http://schemas.openxmlformats.org/markup-compatibility/2006" xmlns:aink="http://schemas.microsoft.com/office/drawing/2016/ink" xmlns:am3d="http://schemas.microsoft.com/office/drawing/2017/model3d" xmlns:o="urn:schemas-microsoft-com:office:office" xmlns:oel="http://schemas.microsoft.com/office/2019/extlst" xmlns:r="http://schemas.openxmlformats.org/officeDocument/2006/relationships" xmlns:m="http://schemas.openxmlformats.org/officeDocument/2006/math" xmlns:v="urn:schemas-microsoft-com:vml" xmlns:wp14="http://schemas.microsoft.com/office/word/2010/wordprocessingDrawing" xmlns:wp="http://schemas.openxmlformats.org/drawingml/2006/wordprocessingDrawing" xmlns:w10="urn:schemas-microsoft-com:office:word" xmlns:w="http://schemas.openxmlformats.org/wordprocessingml/2006/main" xmlns:w14="http://schemas.microsoft.com/office/word/2010/wordml" xmlns:w15="http://schemas.microsoft.com/office/word/2012/wordml" xmlns:w16cex="http://schemas.microsoft.com/office/word/2018/wordml/cex" xmlns:w16cid="http://schemas.microsoft.com/office/word/2016/wordml/cid" xmlns:w16="http://schemas.microsoft.com/office/word/2018/wordml" xmlns:w16du="http://schemas.microsoft.com/office/word/2023/wordml/word16du" xmlns:w16sdtdh="http://schemas.microsoft.com/office/word/2020/wordml/sdtdatahash" xmlns:w16sdtfl="http://schemas.microsoft.com/office/word/2024/wordml/sdtformatlock" xmlns:w16se="http://schemas.microsoft.com/office/word/2015/wordml/symex" xmlns:wpg="http://schemas.microsoft.com/office/word/2010/wordprocessingGroup" xmlns:wpi="http://schemas.microsoft.com/office/word/2010/wordprocessingInk" xmlns:wne="http://schemas.microsoft.com/office/word/2006/wordml" xmlns:wps="http://schemas.microsoft.com/office/word/2010/wordprocessingShape" mc:Ignorable="w14 w15 w16se w16cid w16 w16cex w16sdtdh w16sdtfl w16du wp14">
   <w:abstractNum w:abstractNumId="0" w15:restartNumberingAfterBreak="0">
+    <w:nsid w:val="03D94DAD"/>
+    <w:multiLevelType w:val="hybridMultilevel"/>
+    <w:tmpl w:val="D7546778"/>
+    <w:lvl w:ilvl="0" w:tplc="F664FE8C">
+      <w:start w:val="1"/>
+      <w:numFmt w:val="hebrew1"/>
+      <w:lvlText w:val="%1)"/>
+      <w:lvlJc w:val="left"/>
+      <w:pPr>
+        <w:ind w:left="720" w:hanging="360"/>
+      </w:pPr>
+      <w:rPr>
+        <w:rFonts w:hint="default"/>
+      </w:rPr>
+    </w:lvl>
+    <w:lvl w:ilvl="1" w:tplc="04090019" w:tentative="1">
+      <w:start w:val="1"/>
+      <w:numFmt w:val="lowerLetter"/>
+      <w:lvlText w:val="%2."/>
+      <w:lvlJc w:val="left"/>
+      <w:pPr>
+        <w:ind w:left="1440" w:hanging="360"/>
+      </w:pPr>
+    </w:lvl>
+    <w:lvl w:ilvl="2" w:tplc="0409001B" w:tentative="1">
+      <w:start w:val="1"/>
+      <w:numFmt w:val="lowerRoman"/>
+      <w:lvlText w:val="%3."/>
+      <w:lvlJc w:val="right"/>
+      <w:pPr>
+        <w:ind w:left="2160" w:hanging="180"/>
+      </w:pPr>
+    </w:lvl>
+    <w:lvl w:ilvl="3" w:tplc="0409000F" w:tentative="1">
+      <w:start w:val="1"/>
+      <w:numFmt w:val="decimal"/>
+      <w:lvlText w:val="%4."/>
+      <w:lvlJc w:val="left"/>
+      <w:pPr>
+        <w:ind w:left="2880" w:hanging="360"/>
+      </w:pPr>
+    </w:lvl>
+    <w:lvl w:ilvl="4" w:tplc="04090019" w:tentative="1">
+      <w:start w:val="1"/>
+      <w:numFmt w:val="lowerLetter"/>
+      <w:lvlText w:val="%5."/>
+      <w:lvlJc w:val="left"/>
+      <w:pPr>
+        <w:ind w:left="3600" w:hanging="360"/>
+      </w:pPr>
+    </w:lvl>
+    <w:lvl w:ilvl="5" w:tplc="0409001B" w:tentative="1">
+      <w:start w:val="1"/>
+      <w:numFmt w:val="lowerRoman"/>
+      <w:lvlText w:val="%6."/>
+      <w:lvlJc w:val="right"/>
+      <w:pPr>
+        <w:ind w:left="4320" w:hanging="180"/>
+      </w:pPr>
+    </w:lvl>
+    <w:lvl w:ilvl="6" w:tplc="0409000F" w:tentative="1">
+      <w:start w:val="1"/>
+      <w:numFmt w:val="decimal"/>
+      <w:lvlText w:val="%7."/>
+      <w:lvlJc w:val="left"/>
+      <w:pPr>
+        <w:ind w:left="5040" w:hanging="360"/>
+      </w:pPr>
+    </w:lvl>
+    <w:lvl w:ilvl="7" w:tplc="04090019" w:tentative="1">
+      <w:start w:val="1"/>
+      <w:numFmt w:val="lowerLetter"/>
+      <w:lvlText w:val="%8."/>
+      <w:lvlJc w:val="left"/>
+      <w:pPr>
+        <w:ind w:left="5760" w:hanging="360"/>
+      </w:pPr>
+    </w:lvl>
+    <w:lvl w:ilvl="8" w:tplc="0409001B" w:tentative="1">
+      <w:start w:val="1"/>
+      <w:numFmt w:val="lowerRoman"/>
+      <w:lvlText w:val="%9."/>
+      <w:lvlJc w:val="right"/>
+      <w:pPr>
+        <w:ind w:left="6480" w:hanging="180"/>
+      </w:pPr>
+    </w:lvl>
+  </w:abstractNum>
+  <w:abstractNum w:abstractNumId="1" w15:restartNumberingAfterBreak="0">
     <w:nsid w:val="0C986252"/>
     <w:multiLevelType w:val="hybridMultilevel"/>
     <w:tmpl w:val="F490EBDA"/>
@@ -1647,7 +3616,673 @@
       </w:pPr>
     </w:lvl>
   </w:abstractNum>
-  <w:abstractNum w:abstractNumId="1" w15:restartNumberingAfterBreak="0">
+  <w:abstractNum w:abstractNumId="2" w15:restartNumberingAfterBreak="0">
+    <w:nsid w:val="1DA31DAB"/>
+    <w:multiLevelType w:val="multilevel"/>
+    <w:tmpl w:val="BD9216DA"/>
+    <w:lvl w:ilvl="0">
+      <w:start w:val="1"/>
+      <w:numFmt w:val="decimal"/>
+      <w:lvlText w:val="%1."/>
+      <w:lvlJc w:val="left"/>
+      <w:pPr>
+        <w:tabs>
+          <w:tab w:val="num" w:pos="720"/>
+        </w:tabs>
+        <w:ind w:left="720" w:hanging="360"/>
+      </w:pPr>
+    </w:lvl>
+    <w:lvl w:ilvl="1" w:tentative="1">
+      <w:start w:val="1"/>
+      <w:numFmt w:val="decimal"/>
+      <w:lvlText w:val="%2."/>
+      <w:lvlJc w:val="left"/>
+      <w:pPr>
+        <w:tabs>
+          <w:tab w:val="num" w:pos="1440"/>
+        </w:tabs>
+        <w:ind w:left="1440" w:hanging="360"/>
+      </w:pPr>
+    </w:lvl>
+    <w:lvl w:ilvl="2" w:tentative="1">
+      <w:start w:val="1"/>
+      <w:numFmt w:val="decimal"/>
+      <w:lvlText w:val="%3."/>
+      <w:lvlJc w:val="left"/>
+      <w:pPr>
+        <w:tabs>
+          <w:tab w:val="num" w:pos="2160"/>
+        </w:tabs>
+        <w:ind w:left="2160" w:hanging="360"/>
+      </w:pPr>
+    </w:lvl>
+    <w:lvl w:ilvl="3" w:tentative="1">
+      <w:start w:val="1"/>
+      <w:numFmt w:val="decimal"/>
+      <w:lvlText w:val="%4."/>
+      <w:lvlJc w:val="left"/>
+      <w:pPr>
+        <w:tabs>
+          <w:tab w:val="num" w:pos="2880"/>
+        </w:tabs>
+        <w:ind w:left="2880" w:hanging="360"/>
+      </w:pPr>
+    </w:lvl>
+    <w:lvl w:ilvl="4" w:tentative="1">
+      <w:start w:val="1"/>
+      <w:numFmt w:val="decimal"/>
+      <w:lvlText w:val="%5."/>
+      <w:lvlJc w:val="left"/>
+      <w:pPr>
+        <w:tabs>
+          <w:tab w:val="num" w:pos="3600"/>
+        </w:tabs>
+        <w:ind w:left="3600" w:hanging="360"/>
+      </w:pPr>
+    </w:lvl>
+    <w:lvl w:ilvl="5" w:tentative="1">
+      <w:start w:val="1"/>
+      <w:numFmt w:val="decimal"/>
+      <w:lvlText w:val="%6."/>
+      <w:lvlJc w:val="left"/>
+      <w:pPr>
+        <w:tabs>
+          <w:tab w:val="num" w:pos="4320"/>
+        </w:tabs>
+        <w:ind w:left="4320" w:hanging="360"/>
+      </w:pPr>
+    </w:lvl>
+    <w:lvl w:ilvl="6" w:tentative="1">
+      <w:start w:val="1"/>
+      <w:numFmt w:val="decimal"/>
+      <w:lvlText w:val="%7."/>
+      <w:lvlJc w:val="left"/>
+      <w:pPr>
+        <w:tabs>
+          <w:tab w:val="num" w:pos="5040"/>
+        </w:tabs>
+        <w:ind w:left="5040" w:hanging="360"/>
+      </w:pPr>
+    </w:lvl>
+    <w:lvl w:ilvl="7" w:tentative="1">
+      <w:start w:val="1"/>
+      <w:numFmt w:val="decimal"/>
+      <w:lvlText w:val="%8."/>
+      <w:lvlJc w:val="left"/>
+      <w:pPr>
+        <w:tabs>
+          <w:tab w:val="num" w:pos="5760"/>
+        </w:tabs>
+        <w:ind w:left="5760" w:hanging="360"/>
+      </w:pPr>
+    </w:lvl>
+    <w:lvl w:ilvl="8" w:tentative="1">
+      <w:start w:val="1"/>
+      <w:numFmt w:val="decimal"/>
+      <w:lvlText w:val="%9."/>
+      <w:lvlJc w:val="left"/>
+      <w:pPr>
+        <w:tabs>
+          <w:tab w:val="num" w:pos="6480"/>
+        </w:tabs>
+        <w:ind w:left="6480" w:hanging="360"/>
+      </w:pPr>
+    </w:lvl>
+  </w:abstractNum>
+  <w:abstractNum w:abstractNumId="3" w15:restartNumberingAfterBreak="0">
+    <w:nsid w:val="25E212AB"/>
+    <w:multiLevelType w:val="hybridMultilevel"/>
+    <w:tmpl w:val="D6064864"/>
+    <w:lvl w:ilvl="0" w:tplc="4C2EFDA8">
+      <w:start w:val="1"/>
+      <w:numFmt w:val="hebrew1"/>
+      <w:lvlText w:val="%1)"/>
+      <w:lvlJc w:val="left"/>
+      <w:pPr>
+        <w:ind w:left="720" w:hanging="360"/>
+      </w:pPr>
+      <w:rPr>
+        <w:rFonts w:hint="default"/>
+      </w:rPr>
+    </w:lvl>
+    <w:lvl w:ilvl="1" w:tplc="04090019" w:tentative="1">
+      <w:start w:val="1"/>
+      <w:numFmt w:val="lowerLetter"/>
+      <w:lvlText w:val="%2."/>
+      <w:lvlJc w:val="left"/>
+      <w:pPr>
+        <w:ind w:left="1440" w:hanging="360"/>
+      </w:pPr>
+    </w:lvl>
+    <w:lvl w:ilvl="2" w:tplc="0409001B" w:tentative="1">
+      <w:start w:val="1"/>
+      <w:numFmt w:val="lowerRoman"/>
+      <w:lvlText w:val="%3."/>
+      <w:lvlJc w:val="right"/>
+      <w:pPr>
+        <w:ind w:left="2160" w:hanging="180"/>
+      </w:pPr>
+    </w:lvl>
+    <w:lvl w:ilvl="3" w:tplc="0409000F" w:tentative="1">
+      <w:start w:val="1"/>
+      <w:numFmt w:val="decimal"/>
+      <w:lvlText w:val="%4."/>
+      <w:lvlJc w:val="left"/>
+      <w:pPr>
+        <w:ind w:left="2880" w:hanging="360"/>
+      </w:pPr>
+    </w:lvl>
+    <w:lvl w:ilvl="4" w:tplc="04090019" w:tentative="1">
+      <w:start w:val="1"/>
+      <w:numFmt w:val="lowerLetter"/>
+      <w:lvlText w:val="%5."/>
+      <w:lvlJc w:val="left"/>
+      <w:pPr>
+        <w:ind w:left="3600" w:hanging="360"/>
+      </w:pPr>
+    </w:lvl>
+    <w:lvl w:ilvl="5" w:tplc="0409001B" w:tentative="1">
+      <w:start w:val="1"/>
+      <w:numFmt w:val="lowerRoman"/>
+      <w:lvlText w:val="%6."/>
+      <w:lvlJc w:val="right"/>
+      <w:pPr>
+        <w:ind w:left="4320" w:hanging="180"/>
+      </w:pPr>
+    </w:lvl>
+    <w:lvl w:ilvl="6" w:tplc="0409000F" w:tentative="1">
+      <w:start w:val="1"/>
+      <w:numFmt w:val="decimal"/>
+      <w:lvlText w:val="%7."/>
+      <w:lvlJc w:val="left"/>
+      <w:pPr>
+        <w:ind w:left="5040" w:hanging="360"/>
+      </w:pPr>
+    </w:lvl>
+    <w:lvl w:ilvl="7" w:tplc="04090019" w:tentative="1">
+      <w:start w:val="1"/>
+      <w:numFmt w:val="lowerLetter"/>
+      <w:lvlText w:val="%8."/>
+      <w:lvlJc w:val="left"/>
+      <w:pPr>
+        <w:ind w:left="5760" w:hanging="360"/>
+      </w:pPr>
+    </w:lvl>
+    <w:lvl w:ilvl="8" w:tplc="0409001B" w:tentative="1">
+      <w:start w:val="1"/>
+      <w:numFmt w:val="lowerRoman"/>
+      <w:lvlText w:val="%9."/>
+      <w:lvlJc w:val="right"/>
+      <w:pPr>
+        <w:ind w:left="6480" w:hanging="180"/>
+      </w:pPr>
+    </w:lvl>
+  </w:abstractNum>
+  <w:abstractNum w:abstractNumId="4" w15:restartNumberingAfterBreak="0">
+    <w:nsid w:val="2CE17896"/>
+    <w:multiLevelType w:val="hybridMultilevel"/>
+    <w:tmpl w:val="ADAADF56"/>
+    <w:lvl w:ilvl="0" w:tplc="04090001">
+      <w:start w:val="1"/>
+      <w:numFmt w:val="bullet"/>
+      <w:lvlText w:val=""/>
+      <w:lvlJc w:val="left"/>
+      <w:pPr>
+        <w:ind w:left="1080" w:hanging="360"/>
+      </w:pPr>
+      <w:rPr>
+        <w:rFonts w:ascii="Symbol" w:hAnsi="Symbol" w:hint="default"/>
+      </w:rPr>
+    </w:lvl>
+    <w:lvl w:ilvl="1" w:tplc="04090003" w:tentative="1">
+      <w:start w:val="1"/>
+      <w:numFmt w:val="bullet"/>
+      <w:lvlText w:val="o"/>
+      <w:lvlJc w:val="left"/>
+      <w:pPr>
+        <w:ind w:left="1800" w:hanging="360"/>
+      </w:pPr>
+      <w:rPr>
+        <w:rFonts w:ascii="Courier New" w:hAnsi="Courier New" w:cs="Courier New" w:hint="default"/>
+      </w:rPr>
+    </w:lvl>
+    <w:lvl w:ilvl="2" w:tplc="04090005" w:tentative="1">
+      <w:start w:val="1"/>
+      <w:numFmt w:val="bullet"/>
+      <w:lvlText w:val=""/>
+      <w:lvlJc w:val="left"/>
+      <w:pPr>
+        <w:ind w:left="2520" w:hanging="360"/>
+      </w:pPr>
+      <w:rPr>
+        <w:rFonts w:ascii="Wingdings" w:hAnsi="Wingdings" w:hint="default"/>
+      </w:rPr>
+    </w:lvl>
+    <w:lvl w:ilvl="3" w:tplc="04090001" w:tentative="1">
+      <w:start w:val="1"/>
+      <w:numFmt w:val="bullet"/>
+      <w:lvlText w:val=""/>
+      <w:lvlJc w:val="left"/>
+      <w:pPr>
+        <w:ind w:left="3240" w:hanging="360"/>
+      </w:pPr>
+      <w:rPr>
+        <w:rFonts w:ascii="Symbol" w:hAnsi="Symbol" w:hint="default"/>
+      </w:rPr>
+    </w:lvl>
+    <w:lvl w:ilvl="4" w:tplc="04090003" w:tentative="1">
+      <w:start w:val="1"/>
+      <w:numFmt w:val="bullet"/>
+      <w:lvlText w:val="o"/>
+      <w:lvlJc w:val="left"/>
+      <w:pPr>
+        <w:ind w:left="3960" w:hanging="360"/>
+      </w:pPr>
+      <w:rPr>
+        <w:rFonts w:ascii="Courier New" w:hAnsi="Courier New" w:cs="Courier New" w:hint="default"/>
+      </w:rPr>
+    </w:lvl>
+    <w:lvl w:ilvl="5" w:tplc="04090005" w:tentative="1">
+      <w:start w:val="1"/>
+      <w:numFmt w:val="bullet"/>
+      <w:lvlText w:val=""/>
+      <w:lvlJc w:val="left"/>
+      <w:pPr>
+        <w:ind w:left="4680" w:hanging="360"/>
+      </w:pPr>
+      <w:rPr>
+        <w:rFonts w:ascii="Wingdings" w:hAnsi="Wingdings" w:hint="default"/>
+      </w:rPr>
+    </w:lvl>
+    <w:lvl w:ilvl="6" w:tplc="04090001" w:tentative="1">
+      <w:start w:val="1"/>
+      <w:numFmt w:val="bullet"/>
+      <w:lvlText w:val=""/>
+      <w:lvlJc w:val="left"/>
+      <w:pPr>
+        <w:ind w:left="5400" w:hanging="360"/>
+      </w:pPr>
+      <w:rPr>
+        <w:rFonts w:ascii="Symbol" w:hAnsi="Symbol" w:hint="default"/>
+      </w:rPr>
+    </w:lvl>
+    <w:lvl w:ilvl="7" w:tplc="04090003" w:tentative="1">
+      <w:start w:val="1"/>
+      <w:numFmt w:val="bullet"/>
+      <w:lvlText w:val="o"/>
+      <w:lvlJc w:val="left"/>
+      <w:pPr>
+        <w:ind w:left="6120" w:hanging="360"/>
+      </w:pPr>
+      <w:rPr>
+        <w:rFonts w:ascii="Courier New" w:hAnsi="Courier New" w:cs="Courier New" w:hint="default"/>
+      </w:rPr>
+    </w:lvl>
+    <w:lvl w:ilvl="8" w:tplc="04090005" w:tentative="1">
+      <w:start w:val="1"/>
+      <w:numFmt w:val="bullet"/>
+      <w:lvlText w:val=""/>
+      <w:lvlJc w:val="left"/>
+      <w:pPr>
+        <w:ind w:left="6840" w:hanging="360"/>
+      </w:pPr>
+      <w:rPr>
+        <w:rFonts w:ascii="Wingdings" w:hAnsi="Wingdings" w:hint="default"/>
+      </w:rPr>
+    </w:lvl>
+  </w:abstractNum>
+  <w:abstractNum w:abstractNumId="5" w15:restartNumberingAfterBreak="0">
+    <w:nsid w:val="310379F4"/>
+    <w:multiLevelType w:val="hybridMultilevel"/>
+    <w:tmpl w:val="80861FD6"/>
+    <w:lvl w:ilvl="0" w:tplc="04090001">
+      <w:start w:val="1"/>
+      <w:numFmt w:val="bullet"/>
+      <w:lvlText w:val=""/>
+      <w:lvlJc w:val="left"/>
+      <w:pPr>
+        <w:ind w:left="720" w:hanging="360"/>
+      </w:pPr>
+      <w:rPr>
+        <w:rFonts w:ascii="Symbol" w:hAnsi="Symbol" w:hint="default"/>
+      </w:rPr>
+    </w:lvl>
+    <w:lvl w:ilvl="1" w:tplc="04090003" w:tentative="1">
+      <w:start w:val="1"/>
+      <w:numFmt w:val="bullet"/>
+      <w:lvlText w:val="o"/>
+      <w:lvlJc w:val="left"/>
+      <w:pPr>
+        <w:ind w:left="1440" w:hanging="360"/>
+      </w:pPr>
+      <w:rPr>
+        <w:rFonts w:ascii="Courier New" w:hAnsi="Courier New" w:cs="Courier New" w:hint="default"/>
+      </w:rPr>
+    </w:lvl>
+    <w:lvl w:ilvl="2" w:tplc="04090005" w:tentative="1">
+      <w:start w:val="1"/>
+      <w:numFmt w:val="bullet"/>
+      <w:lvlText w:val=""/>
+      <w:lvlJc w:val="left"/>
+      <w:pPr>
+        <w:ind w:left="2160" w:hanging="360"/>
+      </w:pPr>
+      <w:rPr>
+        <w:rFonts w:ascii="Wingdings" w:hAnsi="Wingdings" w:hint="default"/>
+      </w:rPr>
+    </w:lvl>
+    <w:lvl w:ilvl="3" w:tplc="04090001" w:tentative="1">
+      <w:start w:val="1"/>
+      <w:numFmt w:val="bullet"/>
+      <w:lvlText w:val=""/>
+      <w:lvlJc w:val="left"/>
+      <w:pPr>
+        <w:ind w:left="2880" w:hanging="360"/>
+      </w:pPr>
+      <w:rPr>
+        <w:rFonts w:ascii="Symbol" w:hAnsi="Symbol" w:hint="default"/>
+      </w:rPr>
+    </w:lvl>
+    <w:lvl w:ilvl="4" w:tplc="04090003" w:tentative="1">
+      <w:start w:val="1"/>
+      <w:numFmt w:val="bullet"/>
+      <w:lvlText w:val="o"/>
+      <w:lvlJc w:val="left"/>
+      <w:pPr>
+        <w:ind w:left="3600" w:hanging="360"/>
+      </w:pPr>
+      <w:rPr>
+        <w:rFonts w:ascii="Courier New" w:hAnsi="Courier New" w:cs="Courier New" w:hint="default"/>
+      </w:rPr>
+    </w:lvl>
+    <w:lvl w:ilvl="5" w:tplc="04090005" w:tentative="1">
+      <w:start w:val="1"/>
+      <w:numFmt w:val="bullet"/>
+      <w:lvlText w:val=""/>
+      <w:lvlJc w:val="left"/>
+      <w:pPr>
+        <w:ind w:left="4320" w:hanging="360"/>
+      </w:pPr>
+      <w:rPr>
+        <w:rFonts w:ascii="Wingdings" w:hAnsi="Wingdings" w:hint="default"/>
+      </w:rPr>
+    </w:lvl>
+    <w:lvl w:ilvl="6" w:tplc="04090001" w:tentative="1">
+      <w:start w:val="1"/>
+      <w:numFmt w:val="bullet"/>
+      <w:lvlText w:val=""/>
+      <w:lvlJc w:val="left"/>
+      <w:pPr>
+        <w:ind w:left="5040" w:hanging="360"/>
+      </w:pPr>
+      <w:rPr>
+        <w:rFonts w:ascii="Symbol" w:hAnsi="Symbol" w:hint="default"/>
+      </w:rPr>
+    </w:lvl>
+    <w:lvl w:ilvl="7" w:tplc="04090003" w:tentative="1">
+      <w:start w:val="1"/>
+      <w:numFmt w:val="bullet"/>
+      <w:lvlText w:val="o"/>
+      <w:lvlJc w:val="left"/>
+      <w:pPr>
+        <w:ind w:left="5760" w:hanging="360"/>
+      </w:pPr>
+      <w:rPr>
+        <w:rFonts w:ascii="Courier New" w:hAnsi="Courier New" w:cs="Courier New" w:hint="default"/>
+      </w:rPr>
+    </w:lvl>
+    <w:lvl w:ilvl="8" w:tplc="04090005" w:tentative="1">
+      <w:start w:val="1"/>
+      <w:numFmt w:val="bullet"/>
+      <w:lvlText w:val=""/>
+      <w:lvlJc w:val="left"/>
+      <w:pPr>
+        <w:ind w:left="6480" w:hanging="360"/>
+      </w:pPr>
+      <w:rPr>
+        <w:rFonts w:ascii="Wingdings" w:hAnsi="Wingdings" w:hint="default"/>
+      </w:rPr>
+    </w:lvl>
+  </w:abstractNum>
+  <w:abstractNum w:abstractNumId="6" w15:restartNumberingAfterBreak="0">
+    <w:nsid w:val="35C870CE"/>
+    <w:multiLevelType w:val="hybridMultilevel"/>
+    <w:tmpl w:val="A37E9238"/>
+    <w:lvl w:ilvl="0" w:tplc="500AF572">
+      <w:start w:val="1"/>
+      <w:numFmt w:val="hebrew1"/>
+      <w:lvlText w:val="%1)"/>
+      <w:lvlJc w:val="left"/>
+      <w:pPr>
+        <w:ind w:left="720" w:hanging="360"/>
+      </w:pPr>
+      <w:rPr>
+        <w:rFonts w:hint="default"/>
+      </w:rPr>
+    </w:lvl>
+    <w:lvl w:ilvl="1" w:tplc="04090019" w:tentative="1">
+      <w:start w:val="1"/>
+      <w:numFmt w:val="lowerLetter"/>
+      <w:lvlText w:val="%2."/>
+      <w:lvlJc w:val="left"/>
+      <w:pPr>
+        <w:ind w:left="1440" w:hanging="360"/>
+      </w:pPr>
+    </w:lvl>
+    <w:lvl w:ilvl="2" w:tplc="0409001B" w:tentative="1">
+      <w:start w:val="1"/>
+      <w:numFmt w:val="lowerRoman"/>
+      <w:lvlText w:val="%3."/>
+      <w:lvlJc w:val="right"/>
+      <w:pPr>
+        <w:ind w:left="2160" w:hanging="180"/>
+      </w:pPr>
+    </w:lvl>
+    <w:lvl w:ilvl="3" w:tplc="0409000F" w:tentative="1">
+      <w:start w:val="1"/>
+      <w:numFmt w:val="decimal"/>
+      <w:lvlText w:val="%4."/>
+      <w:lvlJc w:val="left"/>
+      <w:pPr>
+        <w:ind w:left="2880" w:hanging="360"/>
+      </w:pPr>
+    </w:lvl>
+    <w:lvl w:ilvl="4" w:tplc="04090019" w:tentative="1">
+      <w:start w:val="1"/>
+      <w:numFmt w:val="lowerLetter"/>
+      <w:lvlText w:val="%5."/>
+      <w:lvlJc w:val="left"/>
+      <w:pPr>
+        <w:ind w:left="3600" w:hanging="360"/>
+      </w:pPr>
+    </w:lvl>
+    <w:lvl w:ilvl="5" w:tplc="0409001B" w:tentative="1">
+      <w:start w:val="1"/>
+      <w:numFmt w:val="lowerRoman"/>
+      <w:lvlText w:val="%6."/>
+      <w:lvlJc w:val="right"/>
+      <w:pPr>
+        <w:ind w:left="4320" w:hanging="180"/>
+      </w:pPr>
+    </w:lvl>
+    <w:lvl w:ilvl="6" w:tplc="0409000F" w:tentative="1">
+      <w:start w:val="1"/>
+      <w:numFmt w:val="decimal"/>
+      <w:lvlText w:val="%7."/>
+      <w:lvlJc w:val="left"/>
+      <w:pPr>
+        <w:ind w:left="5040" w:hanging="360"/>
+      </w:pPr>
+    </w:lvl>
+    <w:lvl w:ilvl="7" w:tplc="04090019" w:tentative="1">
+      <w:start w:val="1"/>
+      <w:numFmt w:val="lowerLetter"/>
+      <w:lvlText w:val="%8."/>
+      <w:lvlJc w:val="left"/>
+      <w:pPr>
+        <w:ind w:left="5760" w:hanging="360"/>
+      </w:pPr>
+    </w:lvl>
+    <w:lvl w:ilvl="8" w:tplc="0409001B" w:tentative="1">
+      <w:start w:val="1"/>
+      <w:numFmt w:val="lowerRoman"/>
+      <w:lvlText w:val="%9."/>
+      <w:lvlJc w:val="right"/>
+      <w:pPr>
+        <w:ind w:left="6480" w:hanging="180"/>
+      </w:pPr>
+    </w:lvl>
+  </w:abstractNum>
+  <w:abstractNum w:abstractNumId="7" w15:restartNumberingAfterBreak="0">
+    <w:nsid w:val="3C1F28E0"/>
+    <w:multiLevelType w:val="multilevel"/>
+    <w:tmpl w:val="875C667C"/>
+    <w:lvl w:ilvl="0">
+      <w:start w:val="1"/>
+      <w:numFmt w:val="bullet"/>
+      <w:lvlText w:val=""/>
+      <w:lvlJc w:val="left"/>
+      <w:pPr>
+        <w:tabs>
+          <w:tab w:val="num" w:pos="720"/>
+        </w:tabs>
+        <w:ind w:left="720" w:hanging="360"/>
+      </w:pPr>
+      <w:rPr>
+        <w:rFonts w:ascii="Symbol" w:hAnsi="Symbol" w:hint="default"/>
+        <w:sz w:val="20"/>
+      </w:rPr>
+    </w:lvl>
+    <w:lvl w:ilvl="1" w:tentative="1">
+      <w:start w:val="1"/>
+      <w:numFmt w:val="bullet"/>
+      <w:lvlText w:val="o"/>
+      <w:lvlJc w:val="left"/>
+      <w:pPr>
+        <w:tabs>
+          <w:tab w:val="num" w:pos="1440"/>
+        </w:tabs>
+        <w:ind w:left="1440" w:hanging="360"/>
+      </w:pPr>
+      <w:rPr>
+        <w:rFonts w:ascii="Courier New" w:hAnsi="Courier New" w:hint="default"/>
+        <w:sz w:val="20"/>
+      </w:rPr>
+    </w:lvl>
+    <w:lvl w:ilvl="2" w:tentative="1">
+      <w:start w:val="1"/>
+      <w:numFmt w:val="bullet"/>
+      <w:lvlText w:val=""/>
+      <w:lvlJc w:val="left"/>
+      <w:pPr>
+        <w:tabs>
+          <w:tab w:val="num" w:pos="2160"/>
+        </w:tabs>
+        <w:ind w:left="2160" w:hanging="360"/>
+      </w:pPr>
+      <w:rPr>
+        <w:rFonts w:ascii="Wingdings" w:hAnsi="Wingdings" w:hint="default"/>
+        <w:sz w:val="20"/>
+      </w:rPr>
+    </w:lvl>
+    <w:lvl w:ilvl="3" w:tentative="1">
+      <w:start w:val="1"/>
+      <w:numFmt w:val="bullet"/>
+      <w:lvlText w:val=""/>
+      <w:lvlJc w:val="left"/>
+      <w:pPr>
+        <w:tabs>
+          <w:tab w:val="num" w:pos="2880"/>
+        </w:tabs>
+        <w:ind w:left="2880" w:hanging="360"/>
+      </w:pPr>
+      <w:rPr>
+        <w:rFonts w:ascii="Wingdings" w:hAnsi="Wingdings" w:hint="default"/>
+        <w:sz w:val="20"/>
+      </w:rPr>
+    </w:lvl>
+    <w:lvl w:ilvl="4" w:tentative="1">
+      <w:start w:val="1"/>
+      <w:numFmt w:val="bullet"/>
+      <w:lvlText w:val=""/>
+      <w:lvlJc w:val="left"/>
+      <w:pPr>
+        <w:tabs>
+          <w:tab w:val="num" w:pos="3600"/>
+        </w:tabs>
+        <w:ind w:left="3600" w:hanging="360"/>
+      </w:pPr>
+      <w:rPr>
+        <w:rFonts w:ascii="Wingdings" w:hAnsi="Wingdings" w:hint="default"/>
+        <w:sz w:val="20"/>
+      </w:rPr>
+    </w:lvl>
+    <w:lvl w:ilvl="5" w:tentative="1">
+      <w:start w:val="1"/>
+      <w:numFmt w:val="bullet"/>
+      <w:lvlText w:val=""/>
+      <w:lvlJc w:val="left"/>
+      <w:pPr>
+        <w:tabs>
+          <w:tab w:val="num" w:pos="4320"/>
+        </w:tabs>
+        <w:ind w:left="4320" w:hanging="360"/>
+      </w:pPr>
+      <w:rPr>
+        <w:rFonts w:ascii="Wingdings" w:hAnsi="Wingdings" w:hint="default"/>
+        <w:sz w:val="20"/>
+      </w:rPr>
+    </w:lvl>
+    <w:lvl w:ilvl="6" w:tentative="1">
+      <w:start w:val="1"/>
+      <w:numFmt w:val="bullet"/>
+      <w:lvlText w:val=""/>
+      <w:lvlJc w:val="left"/>
+      <w:pPr>
+        <w:tabs>
+          <w:tab w:val="num" w:pos="5040"/>
+        </w:tabs>
+        <w:ind w:left="5040" w:hanging="360"/>
+      </w:pPr>
+      <w:rPr>
+        <w:rFonts w:ascii="Wingdings" w:hAnsi="Wingdings" w:hint="default"/>
+        <w:sz w:val="20"/>
+      </w:rPr>
+    </w:lvl>
+    <w:lvl w:ilvl="7" w:tentative="1">
+      <w:start w:val="1"/>
+      <w:numFmt w:val="bullet"/>
+      <w:lvlText w:val=""/>
+      <w:lvlJc w:val="left"/>
+      <w:pPr>
+        <w:tabs>
+          <w:tab w:val="num" w:pos="5760"/>
+        </w:tabs>
+        <w:ind w:left="5760" w:hanging="360"/>
+      </w:pPr>
+      <w:rPr>
+        <w:rFonts w:ascii="Wingdings" w:hAnsi="Wingdings" w:hint="default"/>
+        <w:sz w:val="20"/>
+      </w:rPr>
+    </w:lvl>
+    <w:lvl w:ilvl="8" w:tentative="1">
+      <w:start w:val="1"/>
+      <w:numFmt w:val="bullet"/>
+      <w:lvlText w:val=""/>
+      <w:lvlJc w:val="left"/>
+      <w:pPr>
+        <w:tabs>
+          <w:tab w:val="num" w:pos="6480"/>
+        </w:tabs>
+        <w:ind w:left="6480" w:hanging="360"/>
+      </w:pPr>
+      <w:rPr>
+        <w:rFonts w:ascii="Wingdings" w:hAnsi="Wingdings" w:hint="default"/>
+        <w:sz w:val="20"/>
+      </w:rPr>
+    </w:lvl>
+  </w:abstractNum>
+  <w:abstractNum w:abstractNumId="8" w15:restartNumberingAfterBreak="0">
     <w:nsid w:val="3CDA4735"/>
     <w:multiLevelType w:val="hybridMultilevel"/>
     <w:tmpl w:val="A6A0F28E"/>
@@ -1760,7 +4395,245 @@
       </w:rPr>
     </w:lvl>
   </w:abstractNum>
-  <w:abstractNum w:abstractNumId="2" w15:restartNumberingAfterBreak="0">
+  <w:abstractNum w:abstractNumId="9" w15:restartNumberingAfterBreak="0">
+    <w:nsid w:val="53273460"/>
+    <w:multiLevelType w:val="multilevel"/>
+    <w:tmpl w:val="182A825A"/>
+    <w:lvl w:ilvl="0">
+      <w:start w:val="1"/>
+      <w:numFmt w:val="bullet"/>
+      <w:lvlText w:val=""/>
+      <w:lvlJc w:val="left"/>
+      <w:pPr>
+        <w:tabs>
+          <w:tab w:val="num" w:pos="720"/>
+        </w:tabs>
+        <w:ind w:left="720" w:hanging="360"/>
+      </w:pPr>
+      <w:rPr>
+        <w:rFonts w:ascii="Symbol" w:hAnsi="Symbol" w:hint="default"/>
+        <w:sz w:val="20"/>
+      </w:rPr>
+    </w:lvl>
+    <w:lvl w:ilvl="1" w:tentative="1">
+      <w:start w:val="1"/>
+      <w:numFmt w:val="bullet"/>
+      <w:lvlText w:val="o"/>
+      <w:lvlJc w:val="left"/>
+      <w:pPr>
+        <w:tabs>
+          <w:tab w:val="num" w:pos="1440"/>
+        </w:tabs>
+        <w:ind w:left="1440" w:hanging="360"/>
+      </w:pPr>
+      <w:rPr>
+        <w:rFonts w:ascii="Courier New" w:hAnsi="Courier New" w:hint="default"/>
+        <w:sz w:val="20"/>
+      </w:rPr>
+    </w:lvl>
+    <w:lvl w:ilvl="2" w:tentative="1">
+      <w:start w:val="1"/>
+      <w:numFmt w:val="bullet"/>
+      <w:lvlText w:val=""/>
+      <w:lvlJc w:val="left"/>
+      <w:pPr>
+        <w:tabs>
+          <w:tab w:val="num" w:pos="2160"/>
+        </w:tabs>
+        <w:ind w:left="2160" w:hanging="360"/>
+      </w:pPr>
+      <w:rPr>
+        <w:rFonts w:ascii="Wingdings" w:hAnsi="Wingdings" w:hint="default"/>
+        <w:sz w:val="20"/>
+      </w:rPr>
+    </w:lvl>
+    <w:lvl w:ilvl="3" w:tentative="1">
+      <w:start w:val="1"/>
+      <w:numFmt w:val="bullet"/>
+      <w:lvlText w:val=""/>
+      <w:lvlJc w:val="left"/>
+      <w:pPr>
+        <w:tabs>
+          <w:tab w:val="num" w:pos="2880"/>
+        </w:tabs>
+        <w:ind w:left="2880" w:hanging="360"/>
+      </w:pPr>
+      <w:rPr>
+        <w:rFonts w:ascii="Wingdings" w:hAnsi="Wingdings" w:hint="default"/>
+        <w:sz w:val="20"/>
+      </w:rPr>
+    </w:lvl>
+    <w:lvl w:ilvl="4" w:tentative="1">
+      <w:start w:val="1"/>
+      <w:numFmt w:val="bullet"/>
+      <w:lvlText w:val=""/>
+      <w:lvlJc w:val="left"/>
+      <w:pPr>
+        <w:tabs>
+          <w:tab w:val="num" w:pos="3600"/>
+        </w:tabs>
+        <w:ind w:left="3600" w:hanging="360"/>
+      </w:pPr>
+      <w:rPr>
+        <w:rFonts w:ascii="Wingdings" w:hAnsi="Wingdings" w:hint="default"/>
+        <w:sz w:val="20"/>
+      </w:rPr>
+    </w:lvl>
+    <w:lvl w:ilvl="5" w:tentative="1">
+      <w:start w:val="1"/>
+      <w:numFmt w:val="bullet"/>
+      <w:lvlText w:val=""/>
+      <w:lvlJc w:val="left"/>
+      <w:pPr>
+        <w:tabs>
+          <w:tab w:val="num" w:pos="4320"/>
+        </w:tabs>
+        <w:ind w:left="4320" w:hanging="360"/>
+      </w:pPr>
+      <w:rPr>
+        <w:rFonts w:ascii="Wingdings" w:hAnsi="Wingdings" w:hint="default"/>
+        <w:sz w:val="20"/>
+      </w:rPr>
+    </w:lvl>
+    <w:lvl w:ilvl="6" w:tentative="1">
+      <w:start w:val="1"/>
+      <w:numFmt w:val="bullet"/>
+      <w:lvlText w:val=""/>
+      <w:lvlJc w:val="left"/>
+      <w:pPr>
+        <w:tabs>
+          <w:tab w:val="num" w:pos="5040"/>
+        </w:tabs>
+        <w:ind w:left="5040" w:hanging="360"/>
+      </w:pPr>
+      <w:rPr>
+        <w:rFonts w:ascii="Wingdings" w:hAnsi="Wingdings" w:hint="default"/>
+        <w:sz w:val="20"/>
+      </w:rPr>
+    </w:lvl>
+    <w:lvl w:ilvl="7" w:tentative="1">
+      <w:start w:val="1"/>
+      <w:numFmt w:val="bullet"/>
+      <w:lvlText w:val=""/>
+      <w:lvlJc w:val="left"/>
+      <w:pPr>
+        <w:tabs>
+          <w:tab w:val="num" w:pos="5760"/>
+        </w:tabs>
+        <w:ind w:left="5760" w:hanging="360"/>
+      </w:pPr>
+      <w:rPr>
+        <w:rFonts w:ascii="Wingdings" w:hAnsi="Wingdings" w:hint="default"/>
+        <w:sz w:val="20"/>
+      </w:rPr>
+    </w:lvl>
+    <w:lvl w:ilvl="8" w:tentative="1">
+      <w:start w:val="1"/>
+      <w:numFmt w:val="bullet"/>
+      <w:lvlText w:val=""/>
+      <w:lvlJc w:val="left"/>
+      <w:pPr>
+        <w:tabs>
+          <w:tab w:val="num" w:pos="6480"/>
+        </w:tabs>
+        <w:ind w:left="6480" w:hanging="360"/>
+      </w:pPr>
+      <w:rPr>
+        <w:rFonts w:ascii="Wingdings" w:hAnsi="Wingdings" w:hint="default"/>
+        <w:sz w:val="20"/>
+      </w:rPr>
+    </w:lvl>
+  </w:abstractNum>
+  <w:abstractNum w:abstractNumId="10" w15:restartNumberingAfterBreak="0">
+    <w:nsid w:val="545631D2"/>
+    <w:multiLevelType w:val="hybridMultilevel"/>
+    <w:tmpl w:val="25CA0C66"/>
+    <w:lvl w:ilvl="0" w:tplc="5562EE9A">
+      <w:start w:val="2"/>
+      <w:numFmt w:val="hebrew1"/>
+      <w:lvlText w:val="%1)"/>
+      <w:lvlJc w:val="left"/>
+      <w:pPr>
+        <w:ind w:left="720" w:hanging="360"/>
+      </w:pPr>
+      <w:rPr>
+        <w:rFonts w:hint="default"/>
+      </w:rPr>
+    </w:lvl>
+    <w:lvl w:ilvl="1" w:tplc="04090019" w:tentative="1">
+      <w:start w:val="1"/>
+      <w:numFmt w:val="lowerLetter"/>
+      <w:lvlText w:val="%2."/>
+      <w:lvlJc w:val="left"/>
+      <w:pPr>
+        <w:ind w:left="1440" w:hanging="360"/>
+      </w:pPr>
+    </w:lvl>
+    <w:lvl w:ilvl="2" w:tplc="0409001B" w:tentative="1">
+      <w:start w:val="1"/>
+      <w:numFmt w:val="lowerRoman"/>
+      <w:lvlText w:val="%3."/>
+      <w:lvlJc w:val="right"/>
+      <w:pPr>
+        <w:ind w:left="2160" w:hanging="180"/>
+      </w:pPr>
+    </w:lvl>
+    <w:lvl w:ilvl="3" w:tplc="0409000F" w:tentative="1">
+      <w:start w:val="1"/>
+      <w:numFmt w:val="decimal"/>
+      <w:lvlText w:val="%4."/>
+      <w:lvlJc w:val="left"/>
+      <w:pPr>
+        <w:ind w:left="2880" w:hanging="360"/>
+      </w:pPr>
+    </w:lvl>
+    <w:lvl w:ilvl="4" w:tplc="04090019" w:tentative="1">
+      <w:start w:val="1"/>
+      <w:numFmt w:val="lowerLetter"/>
+      <w:lvlText w:val="%5."/>
+      <w:lvlJc w:val="left"/>
+      <w:pPr>
+        <w:ind w:left="3600" w:hanging="360"/>
+      </w:pPr>
+    </w:lvl>
+    <w:lvl w:ilvl="5" w:tplc="0409001B" w:tentative="1">
+      <w:start w:val="1"/>
+      <w:numFmt w:val="lowerRoman"/>
+      <w:lvlText w:val="%6."/>
+      <w:lvlJc w:val="right"/>
+      <w:pPr>
+        <w:ind w:left="4320" w:hanging="180"/>
+      </w:pPr>
+    </w:lvl>
+    <w:lvl w:ilvl="6" w:tplc="0409000F" w:tentative="1">
+      <w:start w:val="1"/>
+      <w:numFmt w:val="decimal"/>
+      <w:lvlText w:val="%7."/>
+      <w:lvlJc w:val="left"/>
+      <w:pPr>
+        <w:ind w:left="5040" w:hanging="360"/>
+      </w:pPr>
+    </w:lvl>
+    <w:lvl w:ilvl="7" w:tplc="04090019" w:tentative="1">
+      <w:start w:val="1"/>
+      <w:numFmt w:val="lowerLetter"/>
+      <w:lvlText w:val="%8."/>
+      <w:lvlJc w:val="left"/>
+      <w:pPr>
+        <w:ind w:left="5760" w:hanging="360"/>
+      </w:pPr>
+    </w:lvl>
+    <w:lvl w:ilvl="8" w:tplc="0409001B" w:tentative="1">
+      <w:start w:val="1"/>
+      <w:numFmt w:val="lowerRoman"/>
+      <w:lvlText w:val="%9."/>
+      <w:lvlJc w:val="right"/>
+      <w:pPr>
+        <w:ind w:left="6480" w:hanging="180"/>
+      </w:pPr>
+    </w:lvl>
+  </w:abstractNum>
+  <w:abstractNum w:abstractNumId="11" w15:restartNumberingAfterBreak="0">
     <w:nsid w:val="585E5EBF"/>
     <w:multiLevelType w:val="hybridMultilevel"/>
     <w:tmpl w:val="53BEFC90"/>
@@ -1849,7 +4722,7 @@
       </w:pPr>
     </w:lvl>
   </w:abstractNum>
-  <w:abstractNum w:abstractNumId="3" w15:restartNumberingAfterBreak="0">
+  <w:abstractNum w:abstractNumId="12" w15:restartNumberingAfterBreak="0">
     <w:nsid w:val="5B341DC2"/>
     <w:multiLevelType w:val="hybridMultilevel"/>
     <w:tmpl w:val="F8B4C67E"/>
@@ -1962,17 +4835,196 @@
       </w:rPr>
     </w:lvl>
   </w:abstractNum>
+  <w:abstractNum w:abstractNumId="13" w15:restartNumberingAfterBreak="0">
+    <w:nsid w:val="75616C9E"/>
+    <w:multiLevelType w:val="multilevel"/>
+    <w:tmpl w:val="664CF192"/>
+    <w:lvl w:ilvl="0">
+      <w:start w:val="1"/>
+      <w:numFmt w:val="bullet"/>
+      <w:lvlText w:val=""/>
+      <w:lvlJc w:val="left"/>
+      <w:pPr>
+        <w:tabs>
+          <w:tab w:val="num" w:pos="720"/>
+        </w:tabs>
+        <w:ind w:left="720" w:hanging="360"/>
+      </w:pPr>
+      <w:rPr>
+        <w:rFonts w:ascii="Symbol" w:hAnsi="Symbol" w:hint="default"/>
+        <w:sz w:val="20"/>
+      </w:rPr>
+    </w:lvl>
+    <w:lvl w:ilvl="1" w:tentative="1">
+      <w:start w:val="1"/>
+      <w:numFmt w:val="bullet"/>
+      <w:lvlText w:val="o"/>
+      <w:lvlJc w:val="left"/>
+      <w:pPr>
+        <w:tabs>
+          <w:tab w:val="num" w:pos="1440"/>
+        </w:tabs>
+        <w:ind w:left="1440" w:hanging="360"/>
+      </w:pPr>
+      <w:rPr>
+        <w:rFonts w:ascii="Courier New" w:hAnsi="Courier New" w:hint="default"/>
+        <w:sz w:val="20"/>
+      </w:rPr>
+    </w:lvl>
+    <w:lvl w:ilvl="2" w:tentative="1">
+      <w:start w:val="1"/>
+      <w:numFmt w:val="bullet"/>
+      <w:lvlText w:val=""/>
+      <w:lvlJc w:val="left"/>
+      <w:pPr>
+        <w:tabs>
+          <w:tab w:val="num" w:pos="2160"/>
+        </w:tabs>
+        <w:ind w:left="2160" w:hanging="360"/>
+      </w:pPr>
+      <w:rPr>
+        <w:rFonts w:ascii="Wingdings" w:hAnsi="Wingdings" w:hint="default"/>
+        <w:sz w:val="20"/>
+      </w:rPr>
+    </w:lvl>
+    <w:lvl w:ilvl="3" w:tentative="1">
+      <w:start w:val="1"/>
+      <w:numFmt w:val="bullet"/>
+      <w:lvlText w:val=""/>
+      <w:lvlJc w:val="left"/>
+      <w:pPr>
+        <w:tabs>
+          <w:tab w:val="num" w:pos="2880"/>
+        </w:tabs>
+        <w:ind w:left="2880" w:hanging="360"/>
+      </w:pPr>
+      <w:rPr>
+        <w:rFonts w:ascii="Wingdings" w:hAnsi="Wingdings" w:hint="default"/>
+        <w:sz w:val="20"/>
+      </w:rPr>
+    </w:lvl>
+    <w:lvl w:ilvl="4" w:tentative="1">
+      <w:start w:val="1"/>
+      <w:numFmt w:val="bullet"/>
+      <w:lvlText w:val=""/>
+      <w:lvlJc w:val="left"/>
+      <w:pPr>
+        <w:tabs>
+          <w:tab w:val="num" w:pos="3600"/>
+        </w:tabs>
+        <w:ind w:left="3600" w:hanging="360"/>
+      </w:pPr>
+      <w:rPr>
+        <w:rFonts w:ascii="Wingdings" w:hAnsi="Wingdings" w:hint="default"/>
+        <w:sz w:val="20"/>
+      </w:rPr>
+    </w:lvl>
+    <w:lvl w:ilvl="5" w:tentative="1">
+      <w:start w:val="1"/>
+      <w:numFmt w:val="bullet"/>
+      <w:lvlText w:val=""/>
+      <w:lvlJc w:val="left"/>
+      <w:pPr>
+        <w:tabs>
+          <w:tab w:val="num" w:pos="4320"/>
+        </w:tabs>
+        <w:ind w:left="4320" w:hanging="360"/>
+      </w:pPr>
+      <w:rPr>
+        <w:rFonts w:ascii="Wingdings" w:hAnsi="Wingdings" w:hint="default"/>
+        <w:sz w:val="20"/>
+      </w:rPr>
+    </w:lvl>
+    <w:lvl w:ilvl="6" w:tentative="1">
+      <w:start w:val="1"/>
+      <w:numFmt w:val="bullet"/>
+      <w:lvlText w:val=""/>
+      <w:lvlJc w:val="left"/>
+      <w:pPr>
+        <w:tabs>
+          <w:tab w:val="num" w:pos="5040"/>
+        </w:tabs>
+        <w:ind w:left="5040" w:hanging="360"/>
+      </w:pPr>
+      <w:rPr>
+        <w:rFonts w:ascii="Wingdings" w:hAnsi="Wingdings" w:hint="default"/>
+        <w:sz w:val="20"/>
+      </w:rPr>
+    </w:lvl>
+    <w:lvl w:ilvl="7" w:tentative="1">
+      <w:start w:val="1"/>
+      <w:numFmt w:val="bullet"/>
+      <w:lvlText w:val=""/>
+      <w:lvlJc w:val="left"/>
+      <w:pPr>
+        <w:tabs>
+          <w:tab w:val="num" w:pos="5760"/>
+        </w:tabs>
+        <w:ind w:left="5760" w:hanging="360"/>
+      </w:pPr>
+      <w:rPr>
+        <w:rFonts w:ascii="Wingdings" w:hAnsi="Wingdings" w:hint="default"/>
+        <w:sz w:val="20"/>
+      </w:rPr>
+    </w:lvl>
+    <w:lvl w:ilvl="8" w:tentative="1">
+      <w:start w:val="1"/>
+      <w:numFmt w:val="bullet"/>
+      <w:lvlText w:val=""/>
+      <w:lvlJc w:val="left"/>
+      <w:pPr>
+        <w:tabs>
+          <w:tab w:val="num" w:pos="6480"/>
+        </w:tabs>
+        <w:ind w:left="6480" w:hanging="360"/>
+      </w:pPr>
+      <w:rPr>
+        <w:rFonts w:ascii="Wingdings" w:hAnsi="Wingdings" w:hint="default"/>
+        <w:sz w:val="20"/>
+      </w:rPr>
+    </w:lvl>
+  </w:abstractNum>
   <w:num w:numId="1" w16cid:durableId="138353708">
+    <w:abstractNumId w:val="1"/>
+  </w:num>
+  <w:num w:numId="2" w16cid:durableId="502549934">
+    <w:abstractNumId w:val="11"/>
+  </w:num>
+  <w:num w:numId="3" w16cid:durableId="1522625538">
+    <w:abstractNumId w:val="12"/>
+  </w:num>
+  <w:num w:numId="4" w16cid:durableId="1442216776">
+    <w:abstractNumId w:val="8"/>
+  </w:num>
+  <w:num w:numId="5" w16cid:durableId="206720688">
     <w:abstractNumId w:val="0"/>
   </w:num>
-  <w:num w:numId="2" w16cid:durableId="502549934">
+  <w:num w:numId="6" w16cid:durableId="2141529557">
+    <w:abstractNumId w:val="6"/>
+  </w:num>
+  <w:num w:numId="7" w16cid:durableId="1333141660">
+    <w:abstractNumId w:val="10"/>
+  </w:num>
+  <w:num w:numId="8" w16cid:durableId="1291396826">
+    <w:abstractNumId w:val="3"/>
+  </w:num>
+  <w:num w:numId="9" w16cid:durableId="309020457">
+    <w:abstractNumId w:val="13"/>
+  </w:num>
+  <w:num w:numId="10" w16cid:durableId="258029600">
+    <w:abstractNumId w:val="7"/>
+  </w:num>
+  <w:num w:numId="11" w16cid:durableId="581764169">
+    <w:abstractNumId w:val="9"/>
+  </w:num>
+  <w:num w:numId="12" w16cid:durableId="260532722">
     <w:abstractNumId w:val="2"/>
   </w:num>
-  <w:num w:numId="3" w16cid:durableId="1522625538">
-    <w:abstractNumId w:val="3"/>
+  <w:num w:numId="13" w16cid:durableId="5786719">
+    <w:abstractNumId w:val="4"/>
   </w:num>
-  <w:num w:numId="4" w16cid:durableId="1442216776">
-    <w:abstractNumId w:val="1"/>
+  <w:num w:numId="14" w16cid:durableId="573898996">
+    <w:abstractNumId w:val="5"/>
   </w:num>
 </w:numbering>
 </file>
@@ -2580,7 +5632,6 @@
   <w:style w:type="character" w:default="1" w:styleId="a0">
     <w:name w:val="Default Paragraph Font"/>
     <w:uiPriority w:val="1"/>
-    <w:semiHidden/>
     <w:unhideWhenUsed/>
   </w:style>
   <w:style w:type="table" w:default="1" w:styleId="a1">

</xml_diff>

<commit_message>
removing loged in user from UserMainForm
</commit_message>
<xml_diff>
--- a/DP.docx
+++ b/DP.docx
@@ -1076,18 +1076,18 @@
           <w:noProof/>
         </w:rPr>
         <w:drawing>
-          <wp:anchor distT="0" distB="0" distL="114300" distR="114300" simplePos="0" relativeHeight="251661312" behindDoc="0" locked="0" layoutInCell="1" allowOverlap="1" wp14:anchorId="1FDC7C58" wp14:editId="5AE94EFE">
+          <wp:anchor distT="0" distB="0" distL="114300" distR="114300" simplePos="0" relativeHeight="251663360" behindDoc="0" locked="0" layoutInCell="1" allowOverlap="1" wp14:anchorId="536EF3BE" wp14:editId="1A816134">
             <wp:simplePos x="0" y="0"/>
-            <wp:positionH relativeFrom="page">
-              <wp:align>right</wp:align>
+            <wp:positionH relativeFrom="column">
+              <wp:posOffset>-487103</wp:posOffset>
             </wp:positionH>
             <wp:positionV relativeFrom="paragraph">
-              <wp:posOffset>518160</wp:posOffset>
+              <wp:posOffset>402458</wp:posOffset>
             </wp:positionV>
-            <wp:extent cx="7669530" cy="4428490"/>
-            <wp:effectExtent l="0" t="0" r="7620" b="0"/>
+            <wp:extent cx="6463649" cy="5361709"/>
+            <wp:effectExtent l="0" t="0" r="0" b="0"/>
             <wp:wrapSquare wrapText="bothSides"/>
-            <wp:docPr id="398105889" name="תמונה 5"/>
+            <wp:docPr id="2014517778" name="תמונה 1"/>
             <wp:cNvGraphicFramePr>
               <a:graphicFrameLocks xmlns:a="http://schemas.openxmlformats.org/drawingml/2006/main" noChangeAspect="1"/>
             </wp:cNvGraphicFramePr>
@@ -1095,7 +1095,7 @@
               <a:graphicData uri="http://schemas.openxmlformats.org/drawingml/2006/picture">
                 <pic:pic xmlns:pic="http://schemas.openxmlformats.org/drawingml/2006/picture">
                   <pic:nvPicPr>
-                    <pic:cNvPr id="398105889" name="תמונה 398105889"/>
+                    <pic:cNvPr id="2014517778" name="תמונה 2014517778"/>
                     <pic:cNvPicPr/>
                   </pic:nvPicPr>
                   <pic:blipFill>
@@ -1113,7 +1113,7 @@
                   <pic:spPr>
                     <a:xfrm>
                       <a:off x="0" y="0"/>
-                      <a:ext cx="7669530" cy="4428490"/>
+                      <a:ext cx="6463649" cy="5361709"/>
                     </a:xfrm>
                     <a:prstGeom prst="rect">
                       <a:avLst/>
@@ -1372,7 +1372,6 @@
           <w:bCs/>
           <w:noProof/>
         </w:rPr>
-        <w:lastRenderedPageBreak/>
         <w:drawing>
           <wp:anchor distT="0" distB="0" distL="114300" distR="114300" simplePos="0" relativeHeight="251659264" behindDoc="0" locked="0" layoutInCell="1" allowOverlap="1" wp14:anchorId="3899F64A" wp14:editId="7D5BCA32">
             <wp:simplePos x="0" y="0"/>
@@ -1540,7 +1539,6 @@
           <w:b/>
           <w:bCs/>
         </w:rPr>
-        <w:lastRenderedPageBreak/>
         <w:t>Builder</w:t>
       </w:r>
     </w:p>
@@ -1724,13 +1722,13 @@
         <w:bidi/>
         <w:ind w:left="360"/>
         <w:rPr>
-          <w:rFonts w:hint="cs"/>
           <w:rtl/>
         </w:rPr>
       </w:pPr>
       <w:r>
         <w:rPr>
           <w:rFonts w:cs="Arial"/>
+          <w:noProof/>
           <w:rtl/>
         </w:rPr>
         <w:drawing>
@@ -2187,6 +2185,7 @@
         <w:bidi/>
       </w:pPr>
       <w:r>
+        <w:lastRenderedPageBreak/>
         <w:t xml:space="preserve">Concrete Builders </w:t>
       </w:r>
       <w:r>
@@ -2270,7 +2269,6 @@
           <w:rFonts w:hint="cs"/>
           <w:rtl/>
         </w:rPr>
-        <w:lastRenderedPageBreak/>
         <w:t>כמו כן ה-</w:t>
       </w:r>
       <w:r>
@@ -2707,11 +2705,11 @@
         </w:numPr>
         <w:bidi/>
         <w:rPr>
-          <w:rFonts w:hint="cs"/>
-          <w:rtl/>
-        </w:rPr>
-      </w:pPr>
-      <w:r>
+          <w:rtl/>
+        </w:rPr>
+      </w:pPr>
+      <w:r>
+        <w:lastRenderedPageBreak/>
         <w:t>PageBuildContext</w:t>
       </w:r>
     </w:p>
@@ -2739,7 +2737,6 @@
           <w:bCs/>
           <w:rtl/>
         </w:rPr>
-        <w:lastRenderedPageBreak/>
         <w:t>תרשים מחלקו</w:t>
       </w:r>
       <w:r>
@@ -2953,7 +2950,6 @@
           <w:b/>
           <w:bCs/>
         </w:rPr>
-        <w:lastRenderedPageBreak/>
         <w:t>Sequence Diagram</w:t>
       </w:r>
       <w:r>
@@ -3173,7 +3169,6 @@
           <w:b/>
           <w:bCs/>
         </w:rPr>
-        <w:lastRenderedPageBreak/>
         <w:t>Adapter</w:t>
       </w:r>
     </w:p>
@@ -3250,6 +3245,488 @@
         <w:bidi/>
         <w:ind w:left="360"/>
         <w:rPr>
+          <w:rtl/>
+        </w:rPr>
+      </w:pPr>
+      <w:r>
+        <w:rPr>
+          <w:rtl/>
+        </w:rPr>
+        <w:t>בחרנ</w:t>
+      </w:r>
+      <w:r>
+        <w:rPr>
+          <w:rFonts w:hint="cs"/>
+          <w:rtl/>
+        </w:rPr>
+        <w:t>ו ב-</w:t>
+      </w:r>
+      <w:r>
+        <w:t>Adapter</w:t>
+      </w:r>
+      <w:r>
+        <w:rPr>
+          <w:rFonts w:hint="cs"/>
+          <w:rtl/>
+        </w:rPr>
+        <w:t xml:space="preserve"> </w:t>
+      </w:r>
+      <w:r>
+        <w:t xml:space="preserve"> </w:t>
+      </w:r>
+      <w:r>
+        <w:rPr>
+          <w:rtl/>
+        </w:rPr>
+        <w:t xml:space="preserve">כדי לנתק את לוגיקת האפליקציה </w:t>
+      </w:r>
+      <w:r>
+        <w:rPr>
+          <w:rFonts w:hint="cs"/>
+          <w:rtl/>
+        </w:rPr>
+        <w:t>וה-</w:t>
+      </w:r>
+      <w:r>
+        <w:t>UI</w:t>
+      </w:r>
+      <w:r>
+        <w:rPr>
+          <w:rFonts w:hint="cs"/>
+          <w:rtl/>
+        </w:rPr>
+        <w:t xml:space="preserve"> </w:t>
+      </w:r>
+      <w:r>
+        <w:rPr>
+          <w:rtl/>
+        </w:rPr>
+        <w:t>מה</w:t>
+      </w:r>
+      <w:r>
+        <w:rPr>
+          <w:rFonts w:hint="cs"/>
+          <w:rtl/>
+        </w:rPr>
+        <w:t>-</w:t>
+      </w:r>
+      <w:r>
+        <w:t>API</w:t>
+      </w:r>
+      <w:r>
+        <w:rPr>
+          <w:rFonts w:hint="cs"/>
+          <w:rtl/>
+        </w:rPr>
+        <w:t xml:space="preserve"> </w:t>
+      </w:r>
+      <w:r>
+        <w:t xml:space="preserve"> </w:t>
+      </w:r>
+      <w:r>
+        <w:rPr>
+          <w:rtl/>
+        </w:rPr>
+        <w:t xml:space="preserve">של </w:t>
+      </w:r>
+      <w:proofErr w:type="spellStart"/>
+      <w:r>
+        <w:rPr>
+          <w:rtl/>
+        </w:rPr>
+        <w:t>פייסבוק</w:t>
+      </w:r>
+      <w:proofErr w:type="spellEnd"/>
+      <w:r>
+        <w:rPr>
+          <w:rFonts w:hint="cs"/>
+          <w:rtl/>
+        </w:rPr>
+        <w:t>(</w:t>
+      </w:r>
+      <w:proofErr w:type="spellStart"/>
+      <w:r>
+        <w:t>FacebookWrapper</w:t>
+      </w:r>
+      <w:proofErr w:type="spellEnd"/>
+      <w:r>
+        <w:rPr>
+          <w:rFonts w:hint="cs"/>
+          <w:rtl/>
+        </w:rPr>
+        <w:t>).</w:t>
+      </w:r>
+    </w:p>
+    <w:p>
+      <w:pPr>
+        <w:bidi/>
+        <w:ind w:left="360"/>
+      </w:pPr>
+      <w:r>
+        <w:rPr>
+          <w:rFonts w:hint="cs"/>
+          <w:rtl/>
+        </w:rPr>
+        <w:t>ה-</w:t>
+      </w:r>
+      <w:r>
+        <w:t>UI</w:t>
+      </w:r>
+      <w:r>
+        <w:rPr>
+          <w:rFonts w:hint="cs"/>
+          <w:rtl/>
+        </w:rPr>
+        <w:t xml:space="preserve"> </w:t>
+      </w:r>
+      <w:r>
+        <w:t xml:space="preserve"> </w:t>
+      </w:r>
+      <w:r>
+        <w:rPr>
+          <w:rtl/>
+        </w:rPr>
+        <w:t>שלנו</w:t>
+      </w:r>
+      <w:r>
+        <w:t xml:space="preserve"> (</w:t>
+      </w:r>
+      <w:proofErr w:type="spellStart"/>
+      <w:r>
+        <w:t>PostComponent</w:t>
+      </w:r>
+      <w:proofErr w:type="spellEnd"/>
+      <w:r>
+        <w:t xml:space="preserve"> / flows) </w:t>
+      </w:r>
+      <w:r>
+        <w:rPr>
+          <w:rtl/>
+        </w:rPr>
+        <w:t xml:space="preserve">רוצה לעבוד עם </w:t>
+      </w:r>
+      <w:r>
+        <w:rPr>
+          <w:rFonts w:hint="cs"/>
+          <w:rtl/>
+        </w:rPr>
+        <w:t>אובייקט "פוסט"</w:t>
+      </w:r>
+      <w:r>
+        <w:rPr>
+          <w:rtl/>
+        </w:rPr>
+        <w:t xml:space="preserve"> אחיד ופשוט, אבל האובייקטים שמגיעים מה</w:t>
+      </w:r>
+      <w:r>
+        <w:rPr>
+          <w:rFonts w:hint="cs"/>
+          <w:rtl/>
+        </w:rPr>
+        <w:t>-</w:t>
+      </w:r>
+      <w:r>
+        <w:t>API</w:t>
+      </w:r>
+      <w:r>
+        <w:rPr>
+          <w:rFonts w:hint="cs"/>
+          <w:rtl/>
+        </w:rPr>
+        <w:t xml:space="preserve"> הם </w:t>
+      </w:r>
+      <w:proofErr w:type="spellStart"/>
+      <w:r>
+        <w:t>FacebookWrapper.ObjectModel.Post</w:t>
+      </w:r>
+      <w:proofErr w:type="spellEnd"/>
+      <w:r>
+        <w:rPr>
+          <w:rtl/>
+        </w:rPr>
+        <w:t xml:space="preserve"> </w:t>
+      </w:r>
+      <w:r>
+        <w:rPr>
+          <w:rFonts w:hint="cs"/>
+          <w:rtl/>
+        </w:rPr>
+        <w:t xml:space="preserve">שמכילים </w:t>
+      </w:r>
+      <w:r>
+        <w:rPr>
+          <w:rtl/>
+        </w:rPr>
+        <w:t>מידע</w:t>
+      </w:r>
+      <w:r>
+        <w:rPr>
+          <w:rFonts w:hint="cs"/>
+          <w:rtl/>
+        </w:rPr>
+        <w:t xml:space="preserve"> </w:t>
+      </w:r>
+      <w:r>
+        <w:rPr>
+          <w:rFonts w:hint="cs"/>
+          <w:rtl/>
+        </w:rPr>
+        <w:t>שלא</w:t>
+      </w:r>
+      <w:r>
+        <w:rPr>
+          <w:rtl/>
+        </w:rPr>
+        <w:t xml:space="preserve"> במבנה שמתאים לנו (למשל: טקסט פוסט יכול להיות</w:t>
+      </w:r>
+      <w:r>
+        <w:t xml:space="preserve"> Message </w:t>
+      </w:r>
+      <w:r>
+        <w:rPr>
+          <w:rFonts w:hint="cs"/>
+          <w:rtl/>
+        </w:rPr>
+        <w:t xml:space="preserve"> או </w:t>
+      </w:r>
+      <w:r>
+        <w:t>Caption</w:t>
+      </w:r>
+      <w:r>
+        <w:rPr>
+          <w:rFonts w:hint="cs"/>
+          <w:rtl/>
+        </w:rPr>
+        <w:t xml:space="preserve">, לא אחיד, ובנוסף </w:t>
+      </w:r>
+      <w:r>
+        <w:t>likes/comment</w:t>
+      </w:r>
+      <w:r>
+        <w:rPr>
+          <w:rFonts w:hint="cs"/>
+          <w:rtl/>
+        </w:rPr>
+        <w:t xml:space="preserve"> זורקים שגיאות של הרשאות גישה).</w:t>
+      </w:r>
+    </w:p>
+    <w:p>
+      <w:pPr>
+        <w:bidi/>
+        <w:ind w:left="360"/>
+        <w:rPr>
+          <w:rtl/>
+        </w:rPr>
+      </w:pPr>
+      <w:r>
+        <w:rPr>
+          <w:rtl/>
+        </w:rPr>
+        <w:t xml:space="preserve">במקום </w:t>
+      </w:r>
+      <w:r>
+        <w:rPr>
+          <w:rFonts w:hint="cs"/>
+          <w:rtl/>
+        </w:rPr>
+        <w:t>"</w:t>
+      </w:r>
+      <w:r>
+        <w:rPr>
+          <w:rtl/>
+        </w:rPr>
+        <w:t>לזהם</w:t>
+      </w:r>
+      <w:r>
+        <w:rPr>
+          <w:rFonts w:hint="cs"/>
+          <w:rtl/>
+        </w:rPr>
+        <w:t>"</w:t>
+      </w:r>
+      <w:r>
+        <w:rPr>
+          <w:rtl/>
+        </w:rPr>
+        <w:t xml:space="preserve"> את </w:t>
+      </w:r>
+      <w:r>
+        <w:rPr>
+          <w:rFonts w:hint="cs"/>
+          <w:rtl/>
+        </w:rPr>
+        <w:t>ה-</w:t>
+      </w:r>
+      <w:r>
+        <w:t>UI</w:t>
+      </w:r>
+      <w:r>
+        <w:rPr>
+          <w:rFonts w:hint="cs"/>
+          <w:rtl/>
+        </w:rPr>
+        <w:t xml:space="preserve"> </w:t>
+      </w:r>
+      <w:r>
+        <w:t xml:space="preserve"> </w:t>
+      </w:r>
+      <w:r>
+        <w:rPr>
+          <w:rtl/>
+        </w:rPr>
+        <w:t xml:space="preserve">ואת </w:t>
+      </w:r>
+      <w:r>
+        <w:rPr>
+          <w:rFonts w:hint="cs"/>
+          <w:rtl/>
+        </w:rPr>
+        <w:t>ה-</w:t>
+      </w:r>
+      <w:r>
+        <w:t>Logic</w:t>
+      </w:r>
+      <w:r>
+        <w:rPr>
+          <w:rFonts w:hint="cs"/>
+          <w:rtl/>
+        </w:rPr>
+        <w:t xml:space="preserve"> </w:t>
+      </w:r>
+      <w:r>
+        <w:t xml:space="preserve"> </w:t>
+      </w:r>
+      <w:r>
+        <w:rPr>
+          <w:rtl/>
+        </w:rPr>
+        <w:t>בתלות ישירה ב</w:t>
+      </w:r>
+      <w:r>
+        <w:rPr>
+          <w:rFonts w:hint="cs"/>
+          <w:rtl/>
+        </w:rPr>
+        <w:t>-</w:t>
+      </w:r>
+      <w:proofErr w:type="spellStart"/>
+      <w:r>
+        <w:t>FacbookAPI</w:t>
+      </w:r>
+      <w:proofErr w:type="spellEnd"/>
+      <w:r>
+        <w:rPr>
+          <w:rFonts w:hint="cs"/>
+          <w:rtl/>
+        </w:rPr>
+        <w:t xml:space="preserve"> ו</w:t>
+      </w:r>
+      <w:r>
+        <w:rPr>
+          <w:rtl/>
+        </w:rPr>
+        <w:t>במקרי קצה שלו, אנחנו מגדירים ממשק פנימי משלנו</w:t>
+      </w:r>
+      <w:r>
+        <w:t>:</w:t>
+      </w:r>
+      <w:r>
+        <w:br/>
+      </w:r>
+      <w:proofErr w:type="spellStart"/>
+      <w:r>
+        <w:t>IPostData</w:t>
+      </w:r>
+      <w:proofErr w:type="spellEnd"/>
+      <w:r>
+        <w:rPr>
+          <w:rFonts w:hint="cs"/>
+          <w:rtl/>
+        </w:rPr>
+        <w:t>. ממשק זה הוא ה-</w:t>
+      </w:r>
+      <w:r>
+        <w:t>Target</w:t>
+      </w:r>
+      <w:r>
+        <w:rPr>
+          <w:rFonts w:hint="cs"/>
+          <w:rtl/>
+        </w:rPr>
+        <w:t xml:space="preserve"> שלנו. כפי שצוין במצגת:</w:t>
+      </w:r>
+    </w:p>
+    <w:p>
+      <w:pPr>
+        <w:bidi/>
+        <w:ind w:left="360"/>
+        <w:rPr>
+          <w:rFonts w:hint="cs"/>
+          <w:b/>
+          <w:bCs/>
+          <w:rtl/>
+        </w:rPr>
+      </w:pPr>
+      <w:r>
+        <w:rPr>
+          <w:rFonts w:cs="Arial"/>
+          <w:b/>
+          <w:bCs/>
+          <w:rtl/>
+        </w:rPr>
+        <w:drawing>
+          <wp:inline distT="0" distB="0" distL="0" distR="0" wp14:anchorId="103D6390" wp14:editId="49141F85">
+            <wp:extent cx="5486400" cy="539115"/>
+            <wp:effectExtent l="0" t="0" r="0" b="0"/>
+            <wp:docPr id="1853140851" name="תמונה 1"/>
+            <wp:cNvGraphicFramePr>
+              <a:graphicFrameLocks xmlns:a="http://schemas.openxmlformats.org/drawingml/2006/main" noChangeAspect="1"/>
+            </wp:cNvGraphicFramePr>
+            <a:graphic xmlns:a="http://schemas.openxmlformats.org/drawingml/2006/main">
+              <a:graphicData uri="http://schemas.openxmlformats.org/drawingml/2006/picture">
+                <pic:pic xmlns:pic="http://schemas.openxmlformats.org/drawingml/2006/picture">
+                  <pic:nvPicPr>
+                    <pic:cNvPr id="1853140851" name=""/>
+                    <pic:cNvPicPr/>
+                  </pic:nvPicPr>
+                  <pic:blipFill>
+                    <a:blip r:embed="rId11"/>
+                    <a:stretch>
+                      <a:fillRect/>
+                    </a:stretch>
+                  </pic:blipFill>
+                  <pic:spPr>
+                    <a:xfrm>
+                      <a:off x="0" y="0"/>
+                      <a:ext cx="5486400" cy="539115"/>
+                    </a:xfrm>
+                    <a:prstGeom prst="rect">
+                      <a:avLst/>
+                    </a:prstGeom>
+                  </pic:spPr>
+                </pic:pic>
+              </a:graphicData>
+            </a:graphic>
+          </wp:inline>
+        </w:drawing>
+      </w:r>
+    </w:p>
+    <w:p>
+      <w:pPr>
+        <w:bidi/>
+        <w:ind w:left="360"/>
+        <w:rPr>
+          <w:b/>
+          <w:bCs/>
+          <w:rtl/>
+        </w:rPr>
+      </w:pPr>
+    </w:p>
+    <w:p>
+      <w:pPr>
+        <w:bidi/>
+        <w:ind w:left="360"/>
+        <w:rPr>
           <w:b/>
           <w:bCs/>
           <w:rtl/>
@@ -3271,6 +3748,545 @@
           <w:rtl/>
         </w:rPr>
         <w:t>שה?</w:t>
+      </w:r>
+    </w:p>
+    <w:p>
+      <w:pPr>
+        <w:bidi/>
+        <w:ind w:left="360"/>
+        <w:rPr>
+          <w:rFonts w:hint="cs"/>
+          <w:rtl/>
+        </w:rPr>
+      </w:pPr>
+      <w:r>
+        <w:rPr>
+          <w:rtl/>
+        </w:rPr>
+        <w:t>מימשנו</w:t>
+      </w:r>
+      <w:r>
+        <w:t xml:space="preserve"> Adapter </w:t>
+      </w:r>
+      <w:r>
+        <w:rPr>
+          <w:rtl/>
+        </w:rPr>
+        <w:t xml:space="preserve">מסוג </w:t>
+      </w:r>
+      <w:r>
+        <w:t>Object Adapter</w:t>
+      </w:r>
+      <w:r>
+        <w:rPr>
+          <w:rFonts w:hint="cs"/>
+          <w:rtl/>
+        </w:rPr>
+        <w:t xml:space="preserve"> </w:t>
+      </w:r>
+      <w:r>
+        <w:rPr>
+          <w:rtl/>
+        </w:rPr>
+        <w:t>ע</w:t>
+      </w:r>
+      <w:r>
+        <w:rPr>
+          <w:rFonts w:hint="cs"/>
+          <w:rtl/>
+        </w:rPr>
+        <w:t>"</w:t>
+      </w:r>
+      <w:r>
+        <w:rPr>
+          <w:rtl/>
+        </w:rPr>
+        <w:t>י קומפוזיציה</w:t>
+      </w:r>
+      <w:r>
+        <w:rPr>
+          <w:rFonts w:hint="cs"/>
+          <w:rtl/>
+        </w:rPr>
+        <w:t>:</w:t>
+      </w:r>
+      <w:r>
+        <w:br/>
+      </w:r>
+      <w:proofErr w:type="spellStart"/>
+      <w:r>
+        <w:t>FacebookPostAdapter</w:t>
+      </w:r>
+      <w:proofErr w:type="spellEnd"/>
+      <w:r>
+        <w:rPr>
+          <w:rFonts w:hint="cs"/>
+          <w:rtl/>
+        </w:rPr>
+        <w:t xml:space="preserve"> </w:t>
+      </w:r>
+      <w:r>
+        <w:t xml:space="preserve"> </w:t>
+      </w:r>
+      <w:r>
+        <w:rPr>
+          <w:rtl/>
+        </w:rPr>
+        <w:t xml:space="preserve">מחזיק </w:t>
+      </w:r>
+      <w:proofErr w:type="spellStart"/>
+      <w:r>
+        <w:rPr>
+          <w:rtl/>
+        </w:rPr>
+        <w:t>רפרנס</w:t>
+      </w:r>
+      <w:proofErr w:type="spellEnd"/>
+      <w:r>
+        <w:rPr>
+          <w:rFonts w:hint="cs"/>
+          <w:rtl/>
+        </w:rPr>
+        <w:t>-</w:t>
+      </w:r>
+      <w:r>
+        <w:t>Post</w:t>
+      </w:r>
+      <w:r>
+        <w:rPr>
+          <w:rFonts w:hint="cs"/>
+          <w:rtl/>
+        </w:rPr>
+        <w:t xml:space="preserve"> ול-</w:t>
+      </w:r>
+      <w:r>
+        <w:t>User</w:t>
+      </w:r>
+      <w:r>
+        <w:rPr>
+          <w:rFonts w:hint="cs"/>
+          <w:rtl/>
+        </w:rPr>
+        <w:t xml:space="preserve">(בעלי הפוסט), אלו </w:t>
+      </w:r>
+      <w:r>
+        <w:rPr>
+          <w:rtl/>
+        </w:rPr>
+        <w:t>האובייקטים החיצוניים, וממיר אותם ל</w:t>
+      </w:r>
+      <w:r>
+        <w:rPr>
+          <w:rFonts w:hint="cs"/>
+          <w:rtl/>
+        </w:rPr>
+        <w:t>-</w:t>
+      </w:r>
+      <w:proofErr w:type="spellStart"/>
+      <w:r>
+        <w:t>PostDataSnapshot</w:t>
+      </w:r>
+      <w:proofErr w:type="spellEnd"/>
+      <w:r>
+        <w:rPr>
+          <w:rFonts w:hint="cs"/>
+          <w:rtl/>
+        </w:rPr>
+        <w:t xml:space="preserve"> </w:t>
+      </w:r>
+      <w:r>
+        <w:t xml:space="preserve"> </w:t>
+      </w:r>
+      <w:r>
+        <w:rPr>
+          <w:rtl/>
+        </w:rPr>
+        <w:t>שמממש את</w:t>
+      </w:r>
+      <w:r>
+        <w:rPr>
+          <w:rFonts w:hint="cs"/>
+          <w:rtl/>
+        </w:rPr>
+        <w:t xml:space="preserve"> </w:t>
+      </w:r>
+      <w:proofErr w:type="spellStart"/>
+      <w:r>
+        <w:t>IPostData</w:t>
+      </w:r>
+      <w:proofErr w:type="spellEnd"/>
+      <w:r>
+        <w:rPr>
+          <w:rFonts w:hint="cs"/>
+          <w:rtl/>
+        </w:rPr>
+        <w:t>.</w:t>
+      </w:r>
+    </w:p>
+    <w:p>
+      <w:pPr>
+        <w:numPr>
+          <w:ilvl w:val="0"/>
+          <w:numId w:val="15"/>
+        </w:numPr>
+        <w:bidi/>
+      </w:pPr>
+      <w:proofErr w:type="spellStart"/>
+      <w:proofErr w:type="gramStart"/>
+      <w:r>
+        <w:t>FacebookPostAdapter</w:t>
+      </w:r>
+      <w:proofErr w:type="spellEnd"/>
+      <w:r>
+        <w:rPr>
+          <w:rFonts w:hint="cs"/>
+          <w:rtl/>
+        </w:rPr>
+        <w:t xml:space="preserve"> </w:t>
+      </w:r>
+      <w:r>
+        <w:t xml:space="preserve"> </w:t>
+      </w:r>
+      <w:r>
+        <w:rPr>
+          <w:rtl/>
+        </w:rPr>
+        <w:t>מקבל</w:t>
+      </w:r>
+      <w:proofErr w:type="gramEnd"/>
+      <w:r>
+        <w:rPr>
+          <w:rtl/>
+        </w:rPr>
+        <w:t xml:space="preserve"> בבנאי</w:t>
+      </w:r>
+      <w:r>
+        <w:rPr>
+          <w:rFonts w:hint="cs"/>
+          <w:rtl/>
+        </w:rPr>
+        <w:t xml:space="preserve"> </w:t>
+      </w:r>
+      <w:r>
+        <w:rPr>
+          <w:rStyle w:val="af0"/>
+        </w:rPr>
+        <w:t>Post</w:t>
+      </w:r>
+      <w:r>
+        <w:rPr>
+          <w:rStyle w:val="af0"/>
+          <w:rFonts w:hint="cs"/>
+          <w:rtl/>
+        </w:rPr>
+        <w:t xml:space="preserve"> ו-</w:t>
+      </w:r>
+      <w:proofErr w:type="gramStart"/>
+      <w:r>
+        <w:rPr>
+          <w:rStyle w:val="af0"/>
+        </w:rPr>
+        <w:t>Owner</w:t>
+      </w:r>
+      <w:r>
+        <w:rPr>
+          <w:rStyle w:val="af0"/>
+          <w:rFonts w:hint="cs"/>
+          <w:rtl/>
+        </w:rPr>
+        <w:t>(</w:t>
+      </w:r>
+      <w:proofErr w:type="gramEnd"/>
+      <w:r>
+        <w:rPr>
+          <w:rStyle w:val="af0"/>
+        </w:rPr>
+        <w:t>User</w:t>
+      </w:r>
+      <w:r>
+        <w:rPr>
+          <w:rStyle w:val="af0"/>
+          <w:rFonts w:hint="cs"/>
+          <w:rtl/>
+        </w:rPr>
+        <w:t>).</w:t>
+      </w:r>
+      <w:r>
+        <w:rPr>
+          <w:rFonts w:hint="cs"/>
+          <w:rtl/>
+        </w:rPr>
+        <w:t xml:space="preserve"> </w:t>
+      </w:r>
+    </w:p>
+    <w:p>
+      <w:pPr>
+        <w:numPr>
+          <w:ilvl w:val="0"/>
+          <w:numId w:val="15"/>
+        </w:numPr>
+        <w:bidi/>
+        <w:ind w:left="360"/>
+      </w:pPr>
+      <w:proofErr w:type="spellStart"/>
+      <w:proofErr w:type="gramStart"/>
+      <w:r>
+        <w:t>ToSnapshot</w:t>
+      </w:r>
+      <w:proofErr w:type="spellEnd"/>
+      <w:r>
+        <w:t xml:space="preserve">() </w:t>
+      </w:r>
+      <w:r>
+        <w:rPr>
+          <w:rFonts w:hint="cs"/>
+          <w:rtl/>
+        </w:rPr>
+        <w:t xml:space="preserve"> </w:t>
+      </w:r>
+      <w:r>
+        <w:rPr>
+          <w:rtl/>
+        </w:rPr>
+        <w:t>בונה</w:t>
+      </w:r>
+      <w:proofErr w:type="gramEnd"/>
+      <w:r>
+        <w:rPr>
+          <w:rtl/>
+        </w:rPr>
+        <w:t xml:space="preserve"> </w:t>
+      </w:r>
+      <w:proofErr w:type="spellStart"/>
+      <w:proofErr w:type="gramStart"/>
+      <w:r>
+        <w:t>PostDataSnapshot</w:t>
+      </w:r>
+      <w:proofErr w:type="spellEnd"/>
+      <w:r>
+        <w:rPr>
+          <w:rFonts w:hint="cs"/>
+          <w:rtl/>
+        </w:rPr>
+        <w:t xml:space="preserve"> </w:t>
+      </w:r>
+      <w:r>
+        <w:t xml:space="preserve"> </w:t>
+      </w:r>
+      <w:r>
+        <w:rPr>
+          <w:rtl/>
+        </w:rPr>
+        <w:t>וממלא</w:t>
+      </w:r>
+      <w:proofErr w:type="gramEnd"/>
+      <w:r>
+        <w:rPr>
+          <w:rtl/>
+        </w:rPr>
+        <w:t xml:space="preserve"> שדות</w:t>
+      </w:r>
+      <w:r>
+        <w:rPr>
+          <w:rFonts w:hint="cs"/>
+          <w:rtl/>
+        </w:rPr>
+        <w:t xml:space="preserve"> מתאימים לממשק הנח לשימוש שאנחנו רוצים לממש, תוך </w:t>
+      </w:r>
+      <w:r>
+        <w:rPr>
+          <w:rtl/>
+        </w:rPr>
+        <w:t>טיפול באי</w:t>
+      </w:r>
+      <w:r>
+        <w:rPr>
+          <w:rFonts w:hint="cs"/>
+          <w:rtl/>
+        </w:rPr>
+        <w:t xml:space="preserve"> </w:t>
+      </w:r>
+      <w:r>
+        <w:rPr>
+          <w:rtl/>
+        </w:rPr>
+        <w:t>יציבות ש</w:t>
+      </w:r>
+      <w:r>
+        <w:rPr>
+          <w:rFonts w:hint="cs"/>
+          <w:rtl/>
+        </w:rPr>
+        <w:t>ל ה-</w:t>
+      </w:r>
+      <w:r>
+        <w:t>API</w:t>
+      </w:r>
+      <w:r>
+        <w:rPr>
+          <w:rFonts w:hint="cs"/>
+          <w:rtl/>
+        </w:rPr>
+        <w:t xml:space="preserve"> </w:t>
+      </w:r>
+      <w:proofErr w:type="gramStart"/>
+      <w:r>
+        <w:rPr>
+          <w:rtl/>
+        </w:rPr>
+        <w:t>סביב</w:t>
+      </w:r>
+      <w:r>
+        <w:t xml:space="preserve"> </w:t>
+      </w:r>
+      <w:r>
+        <w:rPr>
+          <w:rFonts w:hint="cs"/>
+          <w:rtl/>
+        </w:rPr>
+        <w:t xml:space="preserve"> </w:t>
+      </w:r>
+      <w:r>
+        <w:t>likes</w:t>
+      </w:r>
+      <w:proofErr w:type="gramEnd"/>
+      <w:r>
+        <w:t>/comments</w:t>
+      </w:r>
+      <w:r>
+        <w:rPr>
+          <w:rFonts w:hint="cs"/>
+          <w:rtl/>
+        </w:rPr>
+        <w:t>.</w:t>
+      </w:r>
+    </w:p>
+    <w:p>
+      <w:pPr>
+        <w:bidi/>
+        <w:ind w:left="360"/>
+        <w:rPr>
+          <w:rtl/>
+        </w:rPr>
+      </w:pPr>
+      <w:r>
+        <w:rPr>
+          <w:rFonts w:hint="cs"/>
+          <w:rtl/>
+        </w:rPr>
+        <w:t xml:space="preserve">בצורה כזו </w:t>
+      </w:r>
+      <w:r>
+        <w:rPr>
+          <w:rtl/>
+        </w:rPr>
+        <w:t>שאר המערכת</w:t>
+      </w:r>
+      <w:r>
+        <w:rPr>
+          <w:rFonts w:hint="cs"/>
+          <w:rtl/>
+        </w:rPr>
+        <w:t>(המשתמשים השונים)</w:t>
+      </w:r>
+      <w:r>
+        <w:rPr>
+          <w:rtl/>
+        </w:rPr>
+        <w:t xml:space="preserve"> </w:t>
+      </w:r>
+      <w:r>
+        <w:rPr>
+          <w:rFonts w:hint="cs"/>
+          <w:rtl/>
+        </w:rPr>
+        <w:t>עובדים</w:t>
+      </w:r>
+      <w:r>
+        <w:rPr>
+          <w:rtl/>
+        </w:rPr>
+        <w:t xml:space="preserve"> מול</w:t>
+      </w:r>
+      <w:r>
+        <w:rPr>
+          <w:rFonts w:hint="cs"/>
+          <w:rtl/>
+        </w:rPr>
+        <w:t xml:space="preserve"> </w:t>
+      </w:r>
+      <w:proofErr w:type="spellStart"/>
+      <w:r>
+        <w:t>IPostData</w:t>
+      </w:r>
+      <w:proofErr w:type="spellEnd"/>
+      <w:r>
+        <w:rPr>
+          <w:rFonts w:hint="cs"/>
+          <w:rtl/>
+        </w:rPr>
+        <w:t>, ממשק נח לשימוש,</w:t>
+      </w:r>
+      <w:r>
+        <w:rPr>
+          <w:rFonts w:hint="cs"/>
+          <w:rtl/>
+        </w:rPr>
+        <w:t xml:space="preserve"> </w:t>
+      </w:r>
+      <w:r>
+        <w:rPr>
+          <w:rtl/>
+        </w:rPr>
+        <w:t>בלי לדעת אם הנתונים</w:t>
+      </w:r>
+      <w:r>
+        <w:rPr>
+          <w:rFonts w:hint="cs"/>
+          <w:rtl/>
+        </w:rPr>
+        <w:t xml:space="preserve"> </w:t>
+      </w:r>
+      <w:r>
+        <w:rPr>
+          <w:rtl/>
+        </w:rPr>
+        <w:t>הגיעו</w:t>
+      </w:r>
+      <w:r>
+        <w:rPr>
+          <w:rFonts w:hint="cs"/>
+          <w:rtl/>
+        </w:rPr>
+        <w:t xml:space="preserve"> </w:t>
+      </w:r>
+      <w:proofErr w:type="spellStart"/>
+      <w:r>
+        <w:rPr>
+          <w:rtl/>
+        </w:rPr>
+        <w:t>מפייסבוק</w:t>
+      </w:r>
+      <w:proofErr w:type="spellEnd"/>
+      <w:r>
+        <w:rPr>
+          <w:rFonts w:hint="cs"/>
+          <w:rtl/>
+        </w:rPr>
+        <w:t xml:space="preserve"> או מ</w:t>
+      </w:r>
+      <w:r>
+        <w:rPr>
+          <w:rtl/>
+        </w:rPr>
+        <w:t>מקור אחר</w:t>
+      </w:r>
+      <w:r>
+        <w:rPr>
+          <w:rFonts w:hint="cs"/>
+          <w:rtl/>
+        </w:rPr>
+        <w:t>.</w:t>
       </w:r>
     </w:p>
     <w:p>
@@ -3298,6 +4314,269 @@
     </w:p>
     <w:p>
       <w:pPr>
+        <w:bidi/>
+        <w:ind w:left="360"/>
+        <w:rPr>
+          <w:rtl/>
+        </w:rPr>
+      </w:pPr>
+      <w:r>
+        <w:rPr>
+          <w:rFonts w:hint="cs"/>
+          <w:rtl/>
+        </w:rPr>
+        <w:t xml:space="preserve">שחקן בתפקיד </w:t>
+      </w:r>
+      <w:r>
+        <w:t>Target</w:t>
+      </w:r>
+      <w:r>
+        <w:rPr>
+          <w:rFonts w:hint="cs"/>
+          <w:rtl/>
+        </w:rPr>
+        <w:t>:</w:t>
+      </w:r>
+    </w:p>
+    <w:p>
+      <w:pPr>
+        <w:pStyle w:val="a9"/>
+        <w:numPr>
+          <w:ilvl w:val="0"/>
+          <w:numId w:val="14"/>
+        </w:numPr>
+        <w:bidi/>
+      </w:pPr>
+      <w:proofErr w:type="spellStart"/>
+      <w:r>
+        <w:t>IPostData</w:t>
+      </w:r>
+      <w:proofErr w:type="spellEnd"/>
+    </w:p>
+    <w:p>
+      <w:pPr>
+        <w:bidi/>
+        <w:ind w:left="360"/>
+        <w:rPr>
+          <w:rtl/>
+        </w:rPr>
+      </w:pPr>
+      <w:r>
+        <w:rPr>
+          <w:rFonts w:hint="cs"/>
+          <w:rtl/>
+        </w:rPr>
+        <w:t xml:space="preserve">שחקן בתפקיד </w:t>
+      </w:r>
+      <w:proofErr w:type="spellStart"/>
+      <w:r>
+        <w:t>Adaptee</w:t>
+      </w:r>
+      <w:proofErr w:type="spellEnd"/>
+      <w:r>
+        <w:rPr>
+          <w:rFonts w:hint="cs"/>
+          <w:rtl/>
+        </w:rPr>
+        <w:t>:</w:t>
+      </w:r>
+    </w:p>
+    <w:p>
+      <w:pPr>
+        <w:pStyle w:val="a9"/>
+        <w:numPr>
+          <w:ilvl w:val="0"/>
+          <w:numId w:val="14"/>
+        </w:numPr>
+        <w:bidi/>
+        <w:rPr>
+          <w:rtl/>
+        </w:rPr>
+      </w:pPr>
+      <w:proofErr w:type="spellStart"/>
+      <w:proofErr w:type="gramStart"/>
+      <w:r>
+        <w:lastRenderedPageBreak/>
+        <w:t>FacebookWrapper.ObjectModel.Post</w:t>
+      </w:r>
+      <w:proofErr w:type="spellEnd"/>
+      <w:proofErr w:type="gramEnd"/>
+    </w:p>
+    <w:p>
+      <w:pPr>
+        <w:bidi/>
+        <w:ind w:left="360"/>
+        <w:rPr>
+          <w:rtl/>
+        </w:rPr>
+      </w:pPr>
+      <w:r>
+        <w:rPr>
+          <w:rFonts w:hint="cs"/>
+          <w:rtl/>
+        </w:rPr>
+        <w:t xml:space="preserve">שחקן בתפקיד </w:t>
+      </w:r>
+      <w:r>
+        <w:t>Adapter</w:t>
+      </w:r>
+      <w:r>
+        <w:rPr>
+          <w:rFonts w:hint="cs"/>
+          <w:rtl/>
+        </w:rPr>
+        <w:t>:</w:t>
+      </w:r>
+    </w:p>
+    <w:p>
+      <w:pPr>
+        <w:pStyle w:val="a9"/>
+        <w:numPr>
+          <w:ilvl w:val="0"/>
+          <w:numId w:val="14"/>
+        </w:numPr>
+        <w:bidi/>
+      </w:pPr>
+      <w:proofErr w:type="spellStart"/>
+      <w:r>
+        <w:t>FacebookPostAdapter</w:t>
+      </w:r>
+      <w:proofErr w:type="spellEnd"/>
+      <w:r>
+        <w:rPr>
+          <w:rFonts w:hint="cs"/>
+          <w:rtl/>
+        </w:rPr>
+        <w:t xml:space="preserve"> שבתוכו נעזר ב-</w:t>
+      </w:r>
+      <w:proofErr w:type="spellStart"/>
+      <w:proofErr w:type="gramStart"/>
+      <w:r>
+        <w:t>PostDataSnapshot</w:t>
+      </w:r>
+      <w:proofErr w:type="spellEnd"/>
+      <w:r>
+        <w:t xml:space="preserve"> </w:t>
+      </w:r>
+      <w:r>
+        <w:rPr>
+          <w:rFonts w:hint="cs"/>
+          <w:rtl/>
+        </w:rPr>
+        <w:t xml:space="preserve"> שמממש</w:t>
+      </w:r>
+      <w:proofErr w:type="gramEnd"/>
+      <w:r>
+        <w:rPr>
+          <w:rFonts w:hint="cs"/>
+          <w:rtl/>
+        </w:rPr>
+        <w:t xml:space="preserve"> את הממשק </w:t>
+      </w:r>
+      <w:r>
+        <w:t>Target</w:t>
+      </w:r>
+      <w:r>
+        <w:rPr>
+          <w:rFonts w:hint="cs"/>
+          <w:rtl/>
+        </w:rPr>
+        <w:t>.</w:t>
+      </w:r>
+    </w:p>
+    <w:p>
+      <w:pPr>
+        <w:bidi/>
+        <w:ind w:left="360"/>
+        <w:rPr>
+          <w:rtl/>
+        </w:rPr>
+      </w:pPr>
+      <w:r>
+        <w:rPr>
+          <w:rFonts w:hint="cs"/>
+          <w:rtl/>
+        </w:rPr>
+        <w:t xml:space="preserve">שחקן בתפקיד </w:t>
+      </w:r>
+      <w:r>
+        <w:t>Client</w:t>
+      </w:r>
+      <w:r>
+        <w:rPr>
+          <w:rFonts w:hint="cs"/>
+          <w:rtl/>
+        </w:rPr>
+        <w:t>:</w:t>
+      </w:r>
+    </w:p>
+    <w:p>
+      <w:pPr>
+        <w:pStyle w:val="a9"/>
+        <w:numPr>
+          <w:ilvl w:val="0"/>
+          <w:numId w:val="14"/>
+        </w:numPr>
+        <w:bidi/>
+        <w:rPr>
+          <w:rtl/>
+        </w:rPr>
+      </w:pPr>
+      <w:proofErr w:type="spellStart"/>
+      <w:r>
+        <w:t>FacebookAppLogic</w:t>
+      </w:r>
+      <w:proofErr w:type="spellEnd"/>
+      <w:r>
+        <w:rPr>
+          <w:rFonts w:hint="cs"/>
+          <w:rtl/>
+        </w:rPr>
+        <w:t xml:space="preserve">, </w:t>
+      </w:r>
+      <w:proofErr w:type="gramStart"/>
+      <w:r>
+        <w:t xml:space="preserve">Façade </w:t>
+      </w:r>
+      <w:r>
+        <w:rPr>
+          <w:rFonts w:hint="cs"/>
+          <w:rtl/>
+        </w:rPr>
+        <w:t xml:space="preserve"> ש</w:t>
+      </w:r>
+      <w:proofErr w:type="gramEnd"/>
+      <w:r>
+        <w:rPr>
+          <w:rFonts w:hint="cs"/>
+          <w:rtl/>
+        </w:rPr>
+        <w:t>"מגיש" למי שמבקש את ה</w:t>
+      </w:r>
+      <w:proofErr w:type="spellStart"/>
+      <w:r>
+        <w:t>Ipostdata</w:t>
+      </w:r>
+      <w:proofErr w:type="spellEnd"/>
+      <w:r>
+        <w:rPr>
+          <w:rFonts w:hint="cs"/>
+          <w:rtl/>
+        </w:rPr>
+        <w:t>.</w:t>
+      </w:r>
+    </w:p>
+    <w:p>
+      <w:pPr>
+        <w:bidi/>
+        <w:rPr>
+          <w:rFonts w:hint="cs"/>
+          <w:rtl/>
+        </w:rPr>
+      </w:pPr>
+    </w:p>
+    <w:p>
+      <w:pPr>
         <w:pStyle w:val="a9"/>
         <w:numPr>
           <w:ilvl w:val="0"/>
@@ -3313,6 +4592,68 @@
         <w:rPr>
           <w:b/>
           <w:bCs/>
+          <w:noProof/>
+        </w:rPr>
+        <w:drawing>
+          <wp:anchor distT="0" distB="0" distL="114300" distR="114300" simplePos="0" relativeHeight="251665408" behindDoc="0" locked="0" layoutInCell="1" allowOverlap="1" wp14:anchorId="0A2BF0BB" wp14:editId="0272E6DC">
+            <wp:simplePos x="0" y="0"/>
+            <wp:positionH relativeFrom="column">
+              <wp:posOffset>-840105</wp:posOffset>
+            </wp:positionH>
+            <wp:positionV relativeFrom="paragraph">
+              <wp:posOffset>507365</wp:posOffset>
+            </wp:positionV>
+            <wp:extent cx="7033260" cy="5086985"/>
+            <wp:effectExtent l="0" t="0" r="0" b="0"/>
+            <wp:wrapSquare wrapText="bothSides"/>
+            <wp:docPr id="134305850" name="תמונה 3" descr="תמונה שמכילה טקסט, תרשים, תוכנית, גופן&#10;&#10;תוכן בינה מלאכותית גנרטיבית עשוי להיות שגוי."/>
+            <wp:cNvGraphicFramePr>
+              <a:graphicFrameLocks xmlns:a="http://schemas.openxmlformats.org/drawingml/2006/main" noChangeAspect="1"/>
+            </wp:cNvGraphicFramePr>
+            <a:graphic xmlns:a="http://schemas.openxmlformats.org/drawingml/2006/main">
+              <a:graphicData uri="http://schemas.openxmlformats.org/drawingml/2006/picture">
+                <pic:pic xmlns:pic="http://schemas.openxmlformats.org/drawingml/2006/picture">
+                  <pic:nvPicPr>
+                    <pic:cNvPr id="134305850" name="תמונה 3" descr="תמונה שמכילה טקסט, תרשים, תוכנית, גופן&#10;&#10;תוכן בינה מלאכותית גנרטיבית עשוי להיות שגוי."/>
+                    <pic:cNvPicPr/>
+                  </pic:nvPicPr>
+                  <pic:blipFill>
+                    <a:blip r:embed="rId12" cstate="print">
+                      <a:extLst>
+                        <a:ext uri="{28A0092B-C50C-407E-A947-70E740481C1C}">
+                          <a14:useLocalDpi xmlns:a14="http://schemas.microsoft.com/office/drawing/2010/main" val="0"/>
+                        </a:ext>
+                      </a:extLst>
+                    </a:blip>
+                    <a:stretch>
+                      <a:fillRect/>
+                    </a:stretch>
+                  </pic:blipFill>
+                  <pic:spPr>
+                    <a:xfrm>
+                      <a:off x="0" y="0"/>
+                      <a:ext cx="7033260" cy="5086985"/>
+                    </a:xfrm>
+                    <a:prstGeom prst="rect">
+                      <a:avLst/>
+                    </a:prstGeom>
+                  </pic:spPr>
+                </pic:pic>
+              </a:graphicData>
+            </a:graphic>
+            <wp14:sizeRelH relativeFrom="page">
+              <wp14:pctWidth>0</wp14:pctWidth>
+            </wp14:sizeRelH>
+            <wp14:sizeRelV relativeFrom="page">
+              <wp14:pctHeight>0</wp14:pctHeight>
+            </wp14:sizeRelV>
+          </wp:anchor>
+        </w:drawing>
+      </w:r>
+      <w:r>
+        <w:rPr>
+          <w:b/>
+          <w:bCs/>
           <w:rtl/>
         </w:rPr>
         <w:t>תרשים מחלקו</w:t>
@@ -3377,6 +4718,15 @@
         </w:rPr>
         <w:t>זו בתבנית שלמדנו בכיתה:</w:t>
       </w:r>
+    </w:p>
+    <w:p>
+      <w:pPr>
+        <w:ind w:left="360"/>
+        <w:rPr>
+          <w:b/>
+          <w:bCs/>
+        </w:rPr>
+      </w:pPr>
     </w:p>
     <w:p>
       <w:pPr>
@@ -3393,6 +4743,69 @@
       </w:pPr>
       <w:r>
         <w:rPr>
+          <w:b/>
+          <w:bCs/>
+          <w:noProof/>
+        </w:rPr>
+        <w:lastRenderedPageBreak/>
+        <w:drawing>
+          <wp:anchor distT="0" distB="0" distL="114300" distR="114300" simplePos="0" relativeHeight="251664384" behindDoc="0" locked="0" layoutInCell="1" allowOverlap="1" wp14:anchorId="2D7758D3" wp14:editId="3DDD5433">
+            <wp:simplePos x="0" y="0"/>
+            <wp:positionH relativeFrom="margin">
+              <wp:align>center</wp:align>
+            </wp:positionH>
+            <wp:positionV relativeFrom="paragraph">
+              <wp:posOffset>953953</wp:posOffset>
+            </wp:positionV>
+            <wp:extent cx="7062470" cy="2049780"/>
+            <wp:effectExtent l="0" t="0" r="5080" b="7620"/>
+            <wp:wrapSquare wrapText="bothSides"/>
+            <wp:docPr id="2121188300" name="תמונה 2" descr="תמונה שמכילה טקסט, צילום מסך, תרשים, גופן&#10;&#10;תוכן בינה מלאכותית גנרטיבית עשוי להיות שגוי."/>
+            <wp:cNvGraphicFramePr>
+              <a:graphicFrameLocks xmlns:a="http://schemas.openxmlformats.org/drawingml/2006/main" noChangeAspect="1"/>
+            </wp:cNvGraphicFramePr>
+            <a:graphic xmlns:a="http://schemas.openxmlformats.org/drawingml/2006/main">
+              <a:graphicData uri="http://schemas.openxmlformats.org/drawingml/2006/picture">
+                <pic:pic xmlns:pic="http://schemas.openxmlformats.org/drawingml/2006/picture">
+                  <pic:nvPicPr>
+                    <pic:cNvPr id="2121188300" name="תמונה 2" descr="תמונה שמכילה טקסט, צילום מסך, תרשים, גופן&#10;&#10;תוכן בינה מלאכותית גנרטיבית עשוי להיות שגוי."/>
+                    <pic:cNvPicPr/>
+                  </pic:nvPicPr>
+                  <pic:blipFill>
+                    <a:blip r:embed="rId13">
+                      <a:extLst>
+                        <a:ext uri="{28A0092B-C50C-407E-A947-70E740481C1C}">
+                          <a14:useLocalDpi xmlns:a14="http://schemas.microsoft.com/office/drawing/2010/main" val="0"/>
+                        </a:ext>
+                      </a:extLst>
+                    </a:blip>
+                    <a:stretch>
+                      <a:fillRect/>
+                    </a:stretch>
+                  </pic:blipFill>
+                  <pic:spPr>
+                    <a:xfrm>
+                      <a:off x="0" y="0"/>
+                      <a:ext cx="7062470" cy="2049780"/>
+                    </a:xfrm>
+                    <a:prstGeom prst="rect">
+                      <a:avLst/>
+                    </a:prstGeom>
+                  </pic:spPr>
+                </pic:pic>
+              </a:graphicData>
+            </a:graphic>
+            <wp14:sizeRelH relativeFrom="page">
+              <wp14:pctWidth>0</wp14:pctWidth>
+            </wp14:sizeRelH>
+            <wp14:sizeRelV relativeFrom="page">
+              <wp14:pctHeight>0</wp14:pctHeight>
+            </wp14:sizeRelV>
+          </wp:anchor>
+        </w:drawing>
+      </w:r>
+      <w:r>
+        <w:rPr>
           <w:rFonts w:hint="cs"/>
           <w:b/>
           <w:bCs/>
@@ -3414,16 +4827,104 @@
           <w:bCs/>
           <w:rtl/>
         </w:rPr>
-        <w:t xml:space="preserve"> לתרחיש שבו (תשלים לבד אין לי רעיון).</w:t>
-      </w:r>
-      <w:r>
-        <w:rPr>
-          <w:rFonts w:hint="cs"/>
-          <w:b/>
-          <w:bCs/>
-          <w:rtl/>
-        </w:rPr>
-        <w:t xml:space="preserve"> </w:t>
+        <w:t xml:space="preserve"> לתרחיש שבו </w:t>
+      </w:r>
+      <w:r>
+        <w:rPr>
+          <w:rFonts w:hint="cs"/>
+          <w:b/>
+          <w:bCs/>
+          <w:rtl/>
+        </w:rPr>
+        <w:t>טוענים פוסטים לפרופיל</w:t>
+      </w:r>
+      <w:r>
+        <w:rPr>
+          <w:rFonts w:hint="cs"/>
+          <w:b/>
+          <w:bCs/>
+          <w:rtl/>
+        </w:rPr>
+        <w:t xml:space="preserve"> ב</w:t>
+      </w:r>
+      <w:proofErr w:type="spellStart"/>
+      <w:r>
+        <w:rPr>
+          <w:b/>
+          <w:bCs/>
+        </w:rPr>
+        <w:t>UserMainForm</w:t>
+      </w:r>
+      <w:proofErr w:type="spellEnd"/>
+      <w:r>
+        <w:rPr>
+          <w:rFonts w:hint="cs"/>
+          <w:b/>
+          <w:bCs/>
+          <w:rtl/>
+        </w:rPr>
+        <w:t xml:space="preserve"> ויש שימוש ב</w:t>
+      </w:r>
+      <w:r>
+        <w:rPr>
+          <w:rFonts w:hint="cs"/>
+          <w:b/>
+          <w:bCs/>
+          <w:rtl/>
+        </w:rPr>
+        <w:t>-</w:t>
+      </w:r>
+      <w:proofErr w:type="spellStart"/>
+      <w:r>
+        <w:rPr>
+          <w:b/>
+          <w:bCs/>
+        </w:rPr>
+        <w:t>AppLogic</w:t>
+      </w:r>
+      <w:proofErr w:type="spellEnd"/>
+      <w:r>
+        <w:rPr>
+          <w:rFonts w:hint="cs"/>
+          <w:b/>
+          <w:bCs/>
+          <w:rtl/>
+        </w:rPr>
+        <w:t xml:space="preserve"> שמשתמש ב-</w:t>
+      </w:r>
+      <w:r>
+        <w:rPr>
+          <w:b/>
+          <w:bCs/>
+        </w:rPr>
+        <w:t>Adapter</w:t>
+      </w:r>
+      <w:r>
+        <w:rPr>
+          <w:rFonts w:hint="cs"/>
+          <w:b/>
+          <w:bCs/>
+          <w:rtl/>
+        </w:rPr>
+        <w:t xml:space="preserve"> על מנת ל</w:t>
+      </w:r>
+      <w:r>
+        <w:rPr>
+          <w:rFonts w:hint="cs"/>
+          <w:b/>
+          <w:bCs/>
+          <w:rtl/>
+        </w:rPr>
+        <w:t>קחת</w:t>
+      </w:r>
+      <w:r>
+        <w:rPr>
+          <w:rFonts w:hint="cs"/>
+          <w:b/>
+          <w:bCs/>
+          <w:rtl/>
+        </w:rPr>
+        <w:t xml:space="preserve"> את המידע מהפוסטים עבור הצגתו.</w:t>
       </w:r>
     </w:p>
     <w:sectPr>
@@ -3617,6 +5118,155 @@
     </w:lvl>
   </w:abstractNum>
   <w:abstractNum w:abstractNumId="2" w15:restartNumberingAfterBreak="0">
+    <w:nsid w:val="1AD50941"/>
+    <w:multiLevelType w:val="multilevel"/>
+    <w:tmpl w:val="86B654D0"/>
+    <w:lvl w:ilvl="0">
+      <w:start w:val="1"/>
+      <w:numFmt w:val="bullet"/>
+      <w:lvlText w:val=""/>
+      <w:lvlJc w:val="left"/>
+      <w:pPr>
+        <w:tabs>
+          <w:tab w:val="num" w:pos="720"/>
+        </w:tabs>
+        <w:ind w:left="720" w:hanging="360"/>
+      </w:pPr>
+      <w:rPr>
+        <w:rFonts w:ascii="Symbol" w:hAnsi="Symbol" w:hint="default"/>
+        <w:sz w:val="20"/>
+      </w:rPr>
+    </w:lvl>
+    <w:lvl w:ilvl="1" w:tentative="1">
+      <w:start w:val="1"/>
+      <w:numFmt w:val="bullet"/>
+      <w:lvlText w:val="o"/>
+      <w:lvlJc w:val="left"/>
+      <w:pPr>
+        <w:tabs>
+          <w:tab w:val="num" w:pos="1440"/>
+        </w:tabs>
+        <w:ind w:left="1440" w:hanging="360"/>
+      </w:pPr>
+      <w:rPr>
+        <w:rFonts w:ascii="Courier New" w:hAnsi="Courier New" w:hint="default"/>
+        <w:sz w:val="20"/>
+      </w:rPr>
+    </w:lvl>
+    <w:lvl w:ilvl="2" w:tentative="1">
+      <w:start w:val="1"/>
+      <w:numFmt w:val="bullet"/>
+      <w:lvlText w:val=""/>
+      <w:lvlJc w:val="left"/>
+      <w:pPr>
+        <w:tabs>
+          <w:tab w:val="num" w:pos="2160"/>
+        </w:tabs>
+        <w:ind w:left="2160" w:hanging="360"/>
+      </w:pPr>
+      <w:rPr>
+        <w:rFonts w:ascii="Wingdings" w:hAnsi="Wingdings" w:hint="default"/>
+        <w:sz w:val="20"/>
+      </w:rPr>
+    </w:lvl>
+    <w:lvl w:ilvl="3" w:tentative="1">
+      <w:start w:val="1"/>
+      <w:numFmt w:val="bullet"/>
+      <w:lvlText w:val=""/>
+      <w:lvlJc w:val="left"/>
+      <w:pPr>
+        <w:tabs>
+          <w:tab w:val="num" w:pos="2880"/>
+        </w:tabs>
+        <w:ind w:left="2880" w:hanging="360"/>
+      </w:pPr>
+      <w:rPr>
+        <w:rFonts w:ascii="Wingdings" w:hAnsi="Wingdings" w:hint="default"/>
+        <w:sz w:val="20"/>
+      </w:rPr>
+    </w:lvl>
+    <w:lvl w:ilvl="4" w:tentative="1">
+      <w:start w:val="1"/>
+      <w:numFmt w:val="bullet"/>
+      <w:lvlText w:val=""/>
+      <w:lvlJc w:val="left"/>
+      <w:pPr>
+        <w:tabs>
+          <w:tab w:val="num" w:pos="3600"/>
+        </w:tabs>
+        <w:ind w:left="3600" w:hanging="360"/>
+      </w:pPr>
+      <w:rPr>
+        <w:rFonts w:ascii="Wingdings" w:hAnsi="Wingdings" w:hint="default"/>
+        <w:sz w:val="20"/>
+      </w:rPr>
+    </w:lvl>
+    <w:lvl w:ilvl="5" w:tentative="1">
+      <w:start w:val="1"/>
+      <w:numFmt w:val="bullet"/>
+      <w:lvlText w:val=""/>
+      <w:lvlJc w:val="left"/>
+      <w:pPr>
+        <w:tabs>
+          <w:tab w:val="num" w:pos="4320"/>
+        </w:tabs>
+        <w:ind w:left="4320" w:hanging="360"/>
+      </w:pPr>
+      <w:rPr>
+        <w:rFonts w:ascii="Wingdings" w:hAnsi="Wingdings" w:hint="default"/>
+        <w:sz w:val="20"/>
+      </w:rPr>
+    </w:lvl>
+    <w:lvl w:ilvl="6" w:tentative="1">
+      <w:start w:val="1"/>
+      <w:numFmt w:val="bullet"/>
+      <w:lvlText w:val=""/>
+      <w:lvlJc w:val="left"/>
+      <w:pPr>
+        <w:tabs>
+          <w:tab w:val="num" w:pos="5040"/>
+        </w:tabs>
+        <w:ind w:left="5040" w:hanging="360"/>
+      </w:pPr>
+      <w:rPr>
+        <w:rFonts w:ascii="Wingdings" w:hAnsi="Wingdings" w:hint="default"/>
+        <w:sz w:val="20"/>
+      </w:rPr>
+    </w:lvl>
+    <w:lvl w:ilvl="7" w:tentative="1">
+      <w:start w:val="1"/>
+      <w:numFmt w:val="bullet"/>
+      <w:lvlText w:val=""/>
+      <w:lvlJc w:val="left"/>
+      <w:pPr>
+        <w:tabs>
+          <w:tab w:val="num" w:pos="5760"/>
+        </w:tabs>
+        <w:ind w:left="5760" w:hanging="360"/>
+      </w:pPr>
+      <w:rPr>
+        <w:rFonts w:ascii="Wingdings" w:hAnsi="Wingdings" w:hint="default"/>
+        <w:sz w:val="20"/>
+      </w:rPr>
+    </w:lvl>
+    <w:lvl w:ilvl="8" w:tentative="1">
+      <w:start w:val="1"/>
+      <w:numFmt w:val="bullet"/>
+      <w:lvlText w:val=""/>
+      <w:lvlJc w:val="left"/>
+      <w:pPr>
+        <w:tabs>
+          <w:tab w:val="num" w:pos="6480"/>
+        </w:tabs>
+        <w:ind w:left="6480" w:hanging="360"/>
+      </w:pPr>
+      <w:rPr>
+        <w:rFonts w:ascii="Wingdings" w:hAnsi="Wingdings" w:hint="default"/>
+        <w:sz w:val="20"/>
+      </w:rPr>
+    </w:lvl>
+  </w:abstractNum>
+  <w:abstractNum w:abstractNumId="3" w15:restartNumberingAfterBreak="0">
     <w:nsid w:val="1DA31DAB"/>
     <w:multiLevelType w:val="multilevel"/>
     <w:tmpl w:val="BD9216DA"/>
@@ -3729,7 +5379,7 @@
       </w:pPr>
     </w:lvl>
   </w:abstractNum>
-  <w:abstractNum w:abstractNumId="3" w15:restartNumberingAfterBreak="0">
+  <w:abstractNum w:abstractNumId="4" w15:restartNumberingAfterBreak="0">
     <w:nsid w:val="25E212AB"/>
     <w:multiLevelType w:val="hybridMultilevel"/>
     <w:tmpl w:val="D6064864"/>
@@ -3818,7 +5468,7 @@
       </w:pPr>
     </w:lvl>
   </w:abstractNum>
-  <w:abstractNum w:abstractNumId="4" w15:restartNumberingAfterBreak="0">
+  <w:abstractNum w:abstractNumId="5" w15:restartNumberingAfterBreak="0">
     <w:nsid w:val="2CE17896"/>
     <w:multiLevelType w:val="hybridMultilevel"/>
     <w:tmpl w:val="ADAADF56"/>
@@ -3931,10 +5581,10 @@
       </w:rPr>
     </w:lvl>
   </w:abstractNum>
-  <w:abstractNum w:abstractNumId="5" w15:restartNumberingAfterBreak="0">
+  <w:abstractNum w:abstractNumId="6" w15:restartNumberingAfterBreak="0">
     <w:nsid w:val="310379F4"/>
     <w:multiLevelType w:val="hybridMultilevel"/>
-    <w:tmpl w:val="80861FD6"/>
+    <w:tmpl w:val="A3C2EF86"/>
     <w:lvl w:ilvl="0" w:tplc="04090001">
       <w:start w:val="1"/>
       <w:numFmt w:val="bullet"/>
@@ -4044,7 +5694,7 @@
       </w:rPr>
     </w:lvl>
   </w:abstractNum>
-  <w:abstractNum w:abstractNumId="6" w15:restartNumberingAfterBreak="0">
+  <w:abstractNum w:abstractNumId="7" w15:restartNumberingAfterBreak="0">
     <w:nsid w:val="35C870CE"/>
     <w:multiLevelType w:val="hybridMultilevel"/>
     <w:tmpl w:val="A37E9238"/>
@@ -4133,7 +5783,7 @@
       </w:pPr>
     </w:lvl>
   </w:abstractNum>
-  <w:abstractNum w:abstractNumId="7" w15:restartNumberingAfterBreak="0">
+  <w:abstractNum w:abstractNumId="8" w15:restartNumberingAfterBreak="0">
     <w:nsid w:val="3C1F28E0"/>
     <w:multiLevelType w:val="multilevel"/>
     <w:tmpl w:val="875C667C"/>
@@ -4282,7 +5932,7 @@
       </w:rPr>
     </w:lvl>
   </w:abstractNum>
-  <w:abstractNum w:abstractNumId="8" w15:restartNumberingAfterBreak="0">
+  <w:abstractNum w:abstractNumId="9" w15:restartNumberingAfterBreak="0">
     <w:nsid w:val="3CDA4735"/>
     <w:multiLevelType w:val="hybridMultilevel"/>
     <w:tmpl w:val="A6A0F28E"/>
@@ -4395,7 +6045,7 @@
       </w:rPr>
     </w:lvl>
   </w:abstractNum>
-  <w:abstractNum w:abstractNumId="9" w15:restartNumberingAfterBreak="0">
+  <w:abstractNum w:abstractNumId="10" w15:restartNumberingAfterBreak="0">
     <w:nsid w:val="53273460"/>
     <w:multiLevelType w:val="multilevel"/>
     <w:tmpl w:val="182A825A"/>
@@ -4544,7 +6194,7 @@
       </w:rPr>
     </w:lvl>
   </w:abstractNum>
-  <w:abstractNum w:abstractNumId="10" w15:restartNumberingAfterBreak="0">
+  <w:abstractNum w:abstractNumId="11" w15:restartNumberingAfterBreak="0">
     <w:nsid w:val="545631D2"/>
     <w:multiLevelType w:val="hybridMultilevel"/>
     <w:tmpl w:val="25CA0C66"/>
@@ -4633,7 +6283,7 @@
       </w:pPr>
     </w:lvl>
   </w:abstractNum>
-  <w:abstractNum w:abstractNumId="11" w15:restartNumberingAfterBreak="0">
+  <w:abstractNum w:abstractNumId="12" w15:restartNumberingAfterBreak="0">
     <w:nsid w:val="585E5EBF"/>
     <w:multiLevelType w:val="hybridMultilevel"/>
     <w:tmpl w:val="53BEFC90"/>
@@ -4722,7 +6372,7 @@
       </w:pPr>
     </w:lvl>
   </w:abstractNum>
-  <w:abstractNum w:abstractNumId="12" w15:restartNumberingAfterBreak="0">
+  <w:abstractNum w:abstractNumId="13" w15:restartNumberingAfterBreak="0">
     <w:nsid w:val="5B341DC2"/>
     <w:multiLevelType w:val="hybridMultilevel"/>
     <w:tmpl w:val="F8B4C67E"/>
@@ -4835,7 +6485,7 @@
       </w:rPr>
     </w:lvl>
   </w:abstractNum>
-  <w:abstractNum w:abstractNumId="13" w15:restartNumberingAfterBreak="0">
+  <w:abstractNum w:abstractNumId="14" w15:restartNumberingAfterBreak="0">
     <w:nsid w:val="75616C9E"/>
     <w:multiLevelType w:val="multilevel"/>
     <w:tmpl w:val="664CF192"/>
@@ -4988,43 +6638,46 @@
     <w:abstractNumId w:val="1"/>
   </w:num>
   <w:num w:numId="2" w16cid:durableId="502549934">
-    <w:abstractNumId w:val="11"/>
+    <w:abstractNumId w:val="12"/>
   </w:num>
   <w:num w:numId="3" w16cid:durableId="1522625538">
-    <w:abstractNumId w:val="12"/>
+    <w:abstractNumId w:val="13"/>
   </w:num>
   <w:num w:numId="4" w16cid:durableId="1442216776">
-    <w:abstractNumId w:val="8"/>
+    <w:abstractNumId w:val="9"/>
   </w:num>
   <w:num w:numId="5" w16cid:durableId="206720688">
     <w:abstractNumId w:val="0"/>
   </w:num>
   <w:num w:numId="6" w16cid:durableId="2141529557">
+    <w:abstractNumId w:val="7"/>
+  </w:num>
+  <w:num w:numId="7" w16cid:durableId="1333141660">
+    <w:abstractNumId w:val="11"/>
+  </w:num>
+  <w:num w:numId="8" w16cid:durableId="1291396826">
+    <w:abstractNumId w:val="4"/>
+  </w:num>
+  <w:num w:numId="9" w16cid:durableId="309020457">
+    <w:abstractNumId w:val="14"/>
+  </w:num>
+  <w:num w:numId="10" w16cid:durableId="258029600">
+    <w:abstractNumId w:val="8"/>
+  </w:num>
+  <w:num w:numId="11" w16cid:durableId="581764169">
+    <w:abstractNumId w:val="10"/>
+  </w:num>
+  <w:num w:numId="12" w16cid:durableId="260532722">
+    <w:abstractNumId w:val="3"/>
+  </w:num>
+  <w:num w:numId="13" w16cid:durableId="5786719">
+    <w:abstractNumId w:val="5"/>
+  </w:num>
+  <w:num w:numId="14" w16cid:durableId="573898996">
     <w:abstractNumId w:val="6"/>
   </w:num>
-  <w:num w:numId="7" w16cid:durableId="1333141660">
-    <w:abstractNumId w:val="10"/>
-  </w:num>
-  <w:num w:numId="8" w16cid:durableId="1291396826">
-    <w:abstractNumId w:val="3"/>
-  </w:num>
-  <w:num w:numId="9" w16cid:durableId="309020457">
-    <w:abstractNumId w:val="13"/>
-  </w:num>
-  <w:num w:numId="10" w16cid:durableId="258029600">
-    <w:abstractNumId w:val="7"/>
-  </w:num>
-  <w:num w:numId="11" w16cid:durableId="581764169">
-    <w:abstractNumId w:val="9"/>
-  </w:num>
-  <w:num w:numId="12" w16cid:durableId="260532722">
+  <w:num w:numId="15" w16cid:durableId="197936046">
     <w:abstractNumId w:val="2"/>
-  </w:num>
-  <w:num w:numId="13" w16cid:durableId="5786719">
-    <w:abstractNumId w:val="4"/>
-  </w:num>
-  <w:num w:numId="14" w16cid:durableId="573898996">
-    <w:abstractNumId w:val="5"/>
   </w:num>
 </w:numbering>
 </file>
@@ -5945,6 +7598,38 @@
       <w:spacing w:val="5"/>
     </w:rPr>
   </w:style>
+  <w:style w:type="paragraph" w:styleId="ae">
+    <w:name w:val="footer"/>
+    <w:basedOn w:val="a"/>
+    <w:link w:val="af"/>
+    <w:uiPriority w:val="99"/>
+    <w:semiHidden/>
+    <w:unhideWhenUsed/>
+    <w:rsid w:val="00016B66"/>
+    <w:pPr>
+      <w:tabs>
+        <w:tab w:val="center" w:pos="4320"/>
+        <w:tab w:val="right" w:pos="8640"/>
+      </w:tabs>
+      <w:spacing w:after="0" w:line="240" w:lineRule="auto"/>
+    </w:pPr>
+  </w:style>
+  <w:style w:type="character" w:customStyle="1" w:styleId="af">
+    <w:name w:val="כותרת תחתונה תו"/>
+    <w:basedOn w:val="a0"/>
+    <w:link w:val="ae"/>
+    <w:uiPriority w:val="99"/>
+    <w:semiHidden/>
+    <w:rsid w:val="00016B66"/>
+  </w:style>
+  <w:style w:type="character" w:styleId="af0">
+    <w:name w:val="page number"/>
+    <w:basedOn w:val="a0"/>
+    <w:uiPriority w:val="99"/>
+    <w:semiHidden/>
+    <w:unhideWhenUsed/>
+    <w:rsid w:val="00016B66"/>
+  </w:style>
 </w:styles>
 </file>
 

</xml_diff>

<commit_message>
remove using that we dont use
</commit_message>
<xml_diff>
--- a/DP.docx
+++ b/DP.docx
@@ -1270,16 +1270,34 @@
           <w:b/>
           <w:bCs/>
         </w:rPr>
-        <w:t xml:space="preserve">log in </w:t>
-      </w:r>
-      <w:r>
-        <w:rPr>
-          <w:rFonts w:hint="cs"/>
-          <w:b/>
-          <w:bCs/>
-          <w:rtl/>
-        </w:rPr>
-        <w:t xml:space="preserve"> מוצלח(טוקן ואלידי)</w:t>
+        <w:t xml:space="preserve">log </w:t>
+      </w:r>
+      <w:proofErr w:type="gramStart"/>
+      <w:r>
+        <w:rPr>
+          <w:b/>
+          <w:bCs/>
+        </w:rPr>
+        <w:t xml:space="preserve">in </w:t>
+      </w:r>
+      <w:r>
+        <w:rPr>
+          <w:rFonts w:hint="cs"/>
+          <w:b/>
+          <w:bCs/>
+          <w:rtl/>
+        </w:rPr>
+        <w:t xml:space="preserve"> מוצלח</w:t>
+      </w:r>
+      <w:proofErr w:type="gramEnd"/>
+      <w:r>
+        <w:rPr>
+          <w:rFonts w:hint="cs"/>
+          <w:b/>
+          <w:bCs/>
+          <w:rtl/>
+        </w:rPr>
+        <w:t>(טוקן ואלידי)</w:t>
       </w:r>
       <w:r>
         <w:rPr>
@@ -1299,6 +1317,7 @@
         </w:rPr>
         <w:t>ורכיבי</w:t>
       </w:r>
+      <w:proofErr w:type="gramStart"/>
       <w:r>
         <w:rPr>
           <w:b/>
@@ -1331,6 +1350,7 @@
         </w:rPr>
         <w:t>ים</w:t>
       </w:r>
+      <w:proofErr w:type="gramEnd"/>
       <w:r>
         <w:rPr>
           <w:rFonts w:hint="cs"/>
@@ -1878,6 +1898,13 @@
         </w:rPr>
         <w:t>עם רכיבים פנימיים</w:t>
       </w:r>
+      <w:r>
+        <w:rPr>
+          <w:rFonts w:hint="cs"/>
+          <w:rtl/>
+        </w:rPr>
+        <w:t>.</w:t>
+      </w:r>
     </w:p>
     <w:p>
       <w:pPr>
@@ -2153,7 +2180,11 @@
         <w:bidi/>
       </w:pPr>
       <w:r>
-        <w:t xml:space="preserve">Composer (PageComposer) </w:t>
+        <w:t>Composer (</w:t>
+      </w:r>
+      <w:proofErr w:type="gramStart"/>
+      <w:r>
+        <w:t xml:space="preserve">PageComposer) </w:t>
       </w:r>
       <w:r>
         <w:rPr>
@@ -2166,7 +2197,14 @@
         <w:rPr>
           <w:rtl/>
         </w:rPr>
-        <w:t>שאחראי לנהל את תהליך הבנייה</w:t>
+        <w:t>שאחראי</w:t>
+      </w:r>
+      <w:proofErr w:type="gramEnd"/>
+      <w:r>
+        <w:rPr>
+          <w:rtl/>
+        </w:rPr>
+        <w:t xml:space="preserve"> לנהל את תהליך הבנייה</w:t>
       </w:r>
       <w:r>
         <w:rPr>
@@ -2186,14 +2224,26 @@
       </w:pPr>
       <w:r>
         <w:lastRenderedPageBreak/>
-        <w:t xml:space="preserve">Concrete Builders </w:t>
-      </w:r>
-      <w:r>
-        <w:rPr>
-          <w:rFonts w:hint="cs"/>
-          <w:rtl/>
-        </w:rPr>
-        <w:t xml:space="preserve"> שונים ל</w:t>
+        <w:t xml:space="preserve">Concrete </w:t>
+      </w:r>
+      <w:proofErr w:type="gramStart"/>
+      <w:r>
+        <w:t xml:space="preserve">Builders </w:t>
+      </w:r>
+      <w:r>
+        <w:rPr>
+          <w:rFonts w:hint="cs"/>
+          <w:rtl/>
+        </w:rPr>
+        <w:t xml:space="preserve"> שונים</w:t>
+      </w:r>
+      <w:proofErr w:type="gramEnd"/>
+      <w:r>
+        <w:rPr>
+          <w:rFonts w:hint="cs"/>
+          <w:rtl/>
+        </w:rPr>
+        <w:t xml:space="preserve"> ל</w:t>
       </w:r>
       <w:r>
         <w:rPr>
@@ -2619,6 +2669,7 @@
         </w:numPr>
         <w:bidi/>
       </w:pPr>
+      <w:proofErr w:type="gramStart"/>
       <w:r>
         <w:t>Control</w:t>
       </w:r>
@@ -2629,6 +2680,7 @@
         </w:rPr>
         <w:t>(</w:t>
       </w:r>
+      <w:proofErr w:type="gramEnd"/>
       <w:r>
         <w:t>FlowLayoutPane</w:t>
       </w:r>
@@ -2658,12 +2710,36 @@
           <w:rtl/>
         </w:rPr>
       </w:pPr>
-      <w:r>
-        <w:rPr>
-          <w:rFonts w:hint="cs"/>
-          <w:rtl/>
-        </w:rPr>
-        <w:t>שחקן נוסף שלא דובר עליו במצגת אך הוספנו אותו על מנת שיהיה ל-</w:t>
+    </w:p>
+    <w:p>
+      <w:pPr>
+        <w:bidi/>
+        <w:ind w:left="360"/>
+        <w:rPr>
+          <w:rtl/>
+        </w:rPr>
+      </w:pPr>
+      <w:r>
+        <w:rPr>
+          <w:rFonts w:hint="cs"/>
+          <w:rtl/>
+        </w:rPr>
+        <w:lastRenderedPageBreak/>
+        <w:t>שחקן נוסף שלא דובר עליו במצגת אך הוספנו אותו</w:t>
+      </w:r>
+      <w:r>
+        <w:rPr>
+          <w:rFonts w:hint="cs"/>
+          <w:rtl/>
+        </w:rPr>
+        <w:t>.</w:t>
+      </w:r>
+      <w:r>
+        <w:rPr>
+          <w:rFonts w:hint="cs"/>
+          <w:rtl/>
+        </w:rPr>
+        <w:t xml:space="preserve"> על מנת שיהיה ל-</w:t>
       </w:r>
       <w:r>
         <w:t>Composer</w:t>
@@ -2709,7 +2785,6 @@
         </w:rPr>
       </w:pPr>
       <w:r>
-        <w:lastRenderedPageBreak/>
         <w:t>PageBuildContext</w:t>
       </w:r>
     </w:p>
@@ -3661,7 +3736,6 @@
         <w:bidi/>
         <w:ind w:left="360"/>
         <w:rPr>
-          <w:rFonts w:hint="cs"/>
           <w:b/>
           <w:bCs/>
           <w:rtl/>
@@ -3672,6 +3746,7 @@
           <w:rFonts w:cs="Arial"/>
           <w:b/>
           <w:bCs/>
+          <w:noProof/>
           <w:rtl/>
         </w:rPr>
         <w:drawing>
@@ -3755,7 +3830,6 @@
         <w:bidi/>
         <w:ind w:left="360"/>
         <w:rPr>
-          <w:rFonts w:hint="cs"/>
           <w:rtl/>
         </w:rPr>
       </w:pPr>
@@ -4026,7 +4100,6 @@
           <w:numId w:val="15"/>
         </w:numPr>
         <w:bidi/>
-        <w:ind w:left="360"/>
       </w:pPr>
       <w:proofErr w:type="spellStart"/>
       <w:proofErr w:type="gramStart"/>
@@ -4349,6 +4422,7 @@
       </w:pPr>
       <w:proofErr w:type="spellStart"/>
       <w:r>
+        <w:lastRenderedPageBreak/>
         <w:t>IPostData</w:t>
       </w:r>
       <w:proofErr w:type="spellEnd"/>
@@ -4396,7 +4470,6 @@
       <w:proofErr w:type="spellStart"/>
       <w:proofErr w:type="gramStart"/>
       <w:r>
-        <w:lastRenderedPageBreak/>
         <w:t>FacebookWrapper.ObjectModel.Post</w:t>
       </w:r>
       <w:proofErr w:type="spellEnd"/>
@@ -4471,7 +4544,7 @@
           <w:rFonts w:hint="cs"/>
           <w:rtl/>
         </w:rPr>
-        <w:t xml:space="preserve"> את הממשק </w:t>
+        <w:t xml:space="preserve"> את ממשק </w:t>
       </w:r>
       <w:r>
         <w:t>Target</w:t>
@@ -4570,7 +4643,6 @@
       <w:pPr>
         <w:bidi/>
         <w:rPr>
-          <w:rFonts w:hint="cs"/>
           <w:rtl/>
         </w:rPr>
       </w:pPr>
@@ -4594,6 +4666,7 @@
           <w:bCs/>
           <w:noProof/>
         </w:rPr>
+        <w:lastRenderedPageBreak/>
         <w:drawing>
           <wp:anchor distT="0" distB="0" distL="114300" distR="114300" simplePos="0" relativeHeight="251665408" behindDoc="0" locked="0" layoutInCell="1" allowOverlap="1" wp14:anchorId="0A2BF0BB" wp14:editId="0272E6DC">
             <wp:simplePos x="0" y="0"/>
@@ -4927,6 +5000,382 @@
         <w:t xml:space="preserve"> את המידע מהפוסטים עבור הצגתו.</w:t>
       </w:r>
     </w:p>
+    <w:p/>
+    <w:p>
+      <w:pPr>
+        <w:tabs>
+          <w:tab w:val="left" w:pos="6651"/>
+        </w:tabs>
+        <w:bidi/>
+        <w:rPr>
+          <w:rtl/>
+        </w:rPr>
+      </w:pPr>
+    </w:p>
+    <w:p>
+      <w:pPr>
+        <w:tabs>
+          <w:tab w:val="left" w:pos="6651"/>
+        </w:tabs>
+        <w:bidi/>
+        <w:rPr>
+          <w:rtl/>
+        </w:rPr>
+      </w:pPr>
+    </w:p>
+    <w:p>
+      <w:pPr>
+        <w:tabs>
+          <w:tab w:val="left" w:pos="6651"/>
+        </w:tabs>
+        <w:bidi/>
+        <w:rPr>
+          <w:b/>
+          <w:bCs/>
+          <w:rtl/>
+        </w:rPr>
+      </w:pPr>
+      <w:r>
+        <w:rPr>
+          <w:rFonts w:hint="cs"/>
+          <w:b/>
+          <w:bCs/>
+          <w:u w:val="single"/>
+          <w:rtl/>
+        </w:rPr>
+        <w:t>אסינכרוניות</w:t>
+      </w:r>
+      <w:r>
+        <w:rPr>
+          <w:rFonts w:hint="cs"/>
+          <w:b/>
+          <w:bCs/>
+          <w:rtl/>
+        </w:rPr>
+        <w:t>:</w:t>
+      </w:r>
+    </w:p>
+    <w:p>
+      <w:pPr>
+        <w:tabs>
+          <w:tab w:val="left" w:pos="6651"/>
+        </w:tabs>
+        <w:bidi/>
+        <w:rPr>
+          <w:rtl/>
+        </w:rPr>
+      </w:pPr>
+      <w:r>
+        <w:rPr>
+          <w:rFonts w:hint="cs"/>
+          <w:rtl/>
+        </w:rPr>
+        <w:t>ב</w:t>
+      </w:r>
+      <w:r>
+        <w:rPr>
+          <w:rtl/>
+        </w:rPr>
+        <w:t>מערכת שלנו נעשה שימוש בתכנות אסינכרוני בעיקר בשכבת ה</w:t>
+      </w:r>
+      <w:r>
+        <w:rPr>
+          <w:rFonts w:hint="cs"/>
+          <w:rtl/>
+        </w:rPr>
+        <w:t>-</w:t>
+      </w:r>
+      <w:r>
+        <w:t>UI</w:t>
+      </w:r>
+      <w:r>
+        <w:rPr>
+          <w:rFonts w:hint="cs"/>
+          <w:rtl/>
+        </w:rPr>
+        <w:t xml:space="preserve"> במחלקה </w:t>
+      </w:r>
+      <w:proofErr w:type="spellStart"/>
+      <w:r>
+        <w:t>UserMainForm</w:t>
+      </w:r>
+      <w:proofErr w:type="spellEnd"/>
+      <w:r>
+        <w:rPr>
+          <w:rFonts w:hint="cs"/>
+          <w:rtl/>
+        </w:rPr>
+        <w:t>, אשר "טוענת" את כל המידע מה-</w:t>
+      </w:r>
+      <w:r>
+        <w:t>Facebook API</w:t>
+      </w:r>
+      <w:r>
+        <w:rPr>
+          <w:rFonts w:hint="cs"/>
+          <w:rtl/>
+        </w:rPr>
+        <w:t xml:space="preserve"> של פוסטים, דפים, עמודים, מידע על המשתמש ועוד בצורה אסינכרונית.</w:t>
+      </w:r>
+    </w:p>
+    <w:p>
+      <w:pPr>
+        <w:tabs>
+          <w:tab w:val="left" w:pos="6651"/>
+        </w:tabs>
+        <w:bidi/>
+        <w:rPr>
+          <w:rtl/>
+        </w:rPr>
+      </w:pPr>
+      <w:r>
+        <w:rPr>
+          <w:rFonts w:hint="cs"/>
+          <w:rtl/>
+        </w:rPr>
+        <w:t xml:space="preserve">זה קורה במטודות: </w:t>
+      </w:r>
+    </w:p>
+    <w:p>
+      <w:pPr>
+        <w:tabs>
+          <w:tab w:val="left" w:pos="6651"/>
+        </w:tabs>
+        <w:bidi/>
+        <w:rPr>
+          <w:rtl/>
+        </w:rPr>
+      </w:pPr>
+      <w:proofErr w:type="spellStart"/>
+      <w:proofErr w:type="gramStart"/>
+      <w:r>
+        <w:t>startProfileAsyncLoaders</w:t>
+      </w:r>
+      <w:proofErr w:type="spellEnd"/>
+      <w:r>
+        <w:t>(</w:t>
+      </w:r>
+      <w:proofErr w:type="gramEnd"/>
+      <w:r>
+        <w:t>)</w:t>
+      </w:r>
+      <w:r>
+        <w:rPr>
+          <w:rFonts w:hint="cs"/>
+          <w:rtl/>
+        </w:rPr>
+        <w:t xml:space="preserve"> ו- </w:t>
+      </w:r>
+      <w:proofErr w:type="spellStart"/>
+      <w:r>
+        <w:t>startFeedAsynceLoaders</w:t>
+      </w:r>
+      <w:proofErr w:type="spellEnd"/>
+      <w:r>
+        <w:rPr>
+          <w:rFonts w:hint="cs"/>
+          <w:rtl/>
+        </w:rPr>
+        <w:t>.</w:t>
+      </w:r>
+    </w:p>
+    <w:p>
+      <w:pPr>
+        <w:tabs>
+          <w:tab w:val="left" w:pos="6651"/>
+        </w:tabs>
+        <w:bidi/>
+        <w:rPr>
+          <w:rtl/>
+        </w:rPr>
+      </w:pPr>
+      <w:r>
+        <w:rPr>
+          <w:rtl/>
+        </w:rPr>
+        <w:t>הסיבה המרכזית לשימוש בתכנות אסינכרוני היא שיפור חוויית המשתמש ומניעת קיפאון של הממשק הגר</w:t>
+      </w:r>
+      <w:r>
+        <w:rPr>
+          <w:rFonts w:hint="cs"/>
+          <w:rtl/>
+        </w:rPr>
+        <w:t>פי.</w:t>
+      </w:r>
+    </w:p>
+    <w:p>
+      <w:pPr>
+        <w:tabs>
+          <w:tab w:val="left" w:pos="6651"/>
+        </w:tabs>
+        <w:bidi/>
+        <w:rPr>
+          <w:rtl/>
+        </w:rPr>
+      </w:pPr>
+      <w:r>
+        <w:rPr>
+          <w:rFonts w:hint="cs"/>
+          <w:rtl/>
+        </w:rPr>
+        <w:t>הדרך שבה מימשנו זאת היא ש</w:t>
+      </w:r>
+      <w:r>
+        <w:rPr>
+          <w:rFonts w:hint="cs"/>
+          <w:rtl/>
+        </w:rPr>
+        <w:t xml:space="preserve">עבור כל סוג מידע שאנו רוצים להביא, ישנו </w:t>
+      </w:r>
+      <w:r>
+        <w:t>Thread</w:t>
+      </w:r>
+      <w:r>
+        <w:rPr>
+          <w:rFonts w:hint="cs"/>
+          <w:rtl/>
+        </w:rPr>
+        <w:t xml:space="preserve"> שמביא אותו בצורה אסינכרונית ו"מגיש" את המידע הרלוונטי לרכיב </w:t>
+      </w:r>
+      <w:r>
+        <w:t>UI</w:t>
+      </w:r>
+      <w:r>
+        <w:rPr>
+          <w:rFonts w:hint="cs"/>
+          <w:rtl/>
+        </w:rPr>
+        <w:t xml:space="preserve"> שמציג אותו.</w:t>
+      </w:r>
+    </w:p>
+    <w:p>
+      <w:pPr>
+        <w:bidi/>
+        <w:rPr>
+          <w:rtl/>
+        </w:rPr>
+      </w:pPr>
+      <w:r>
+        <w:rPr>
+          <w:rFonts w:hint="cs"/>
+          <w:rtl/>
+        </w:rPr>
+        <w:t>מכיוון ש</w:t>
+      </w:r>
+      <w:r>
+        <w:t>win-form</w:t>
+      </w:r>
+      <w:r>
+        <w:rPr>
+          <w:rFonts w:hint="cs"/>
+          <w:rtl/>
+        </w:rPr>
+        <w:t xml:space="preserve"> לא תומך בעדכון </w:t>
+      </w:r>
+      <w:r>
+        <w:t>UI</w:t>
+      </w:r>
+      <w:r>
+        <w:rPr>
+          <w:rFonts w:hint="cs"/>
+          <w:rtl/>
+        </w:rPr>
+        <w:t xml:space="preserve"> מ</w:t>
+      </w:r>
+      <w:r>
+        <w:t xml:space="preserve"> </w:t>
+      </w:r>
+      <w:r>
+        <w:rPr>
+          <w:rFonts w:hint="cs"/>
+          <w:rtl/>
+        </w:rPr>
+        <w:t>-</w:t>
+      </w:r>
+      <w:r>
+        <w:t>Thread</w:t>
+      </w:r>
+      <w:r>
+        <w:rPr>
+          <w:rFonts w:hint="cs"/>
+          <w:rtl/>
+        </w:rPr>
+        <w:t xml:space="preserve"> שאינו ה-</w:t>
+      </w:r>
+      <w:r>
+        <w:t>UI Thread</w:t>
+      </w:r>
+      <w:r>
+        <w:rPr>
+          <w:rFonts w:hint="cs"/>
+          <w:rtl/>
+        </w:rPr>
+        <w:t xml:space="preserve"> כל עדכון של רכיבי ה</w:t>
+      </w:r>
+      <w:r>
+        <w:t>UI</w:t>
+      </w:r>
+      <w:r>
+        <w:rPr>
+          <w:rFonts w:hint="cs"/>
+          <w:rtl/>
+        </w:rPr>
+        <w:t xml:space="preserve"> מתבצע בעזרת </w:t>
+      </w:r>
+      <w:proofErr w:type="spellStart"/>
+      <w:r>
+        <w:t>beginInvoke</w:t>
+      </w:r>
+      <w:proofErr w:type="spellEnd"/>
+      <w:r>
+        <w:rPr>
+          <w:rFonts w:hint="cs"/>
+          <w:rtl/>
+        </w:rPr>
+        <w:t xml:space="preserve"> כפי שלמדנו בהקלטה הרלוונטית וכפי שדובר בשיעור האחרון.</w:t>
+      </w:r>
+    </w:p>
+    <w:p>
+      <w:pPr>
+        <w:bidi/>
+        <w:rPr>
+          <w:b/>
+          <w:bCs/>
+          <w:rtl/>
+        </w:rPr>
+      </w:pPr>
+      <w:proofErr w:type="gramStart"/>
+      <w:r>
+        <w:rPr>
+          <w:b/>
+          <w:bCs/>
+          <w:u w:val="single"/>
+        </w:rPr>
+        <w:t>Data-binding</w:t>
+      </w:r>
+      <w:proofErr w:type="gramEnd"/>
+      <w:r>
+        <w:rPr>
+          <w:rFonts w:hint="cs"/>
+          <w:b/>
+          <w:bCs/>
+          <w:rtl/>
+        </w:rPr>
+        <w:t>:</w:t>
+      </w:r>
+    </w:p>
+    <w:p>
+      <w:pPr>
+        <w:bidi/>
+        <w:rPr>
+          <w:b/>
+          <w:bCs/>
+          <w:rtl/>
+        </w:rPr>
+      </w:pPr>
+    </w:p>
+    <w:p/>
+    <w:p/>
     <w:sectPr>
       <w:pgSz w:w="12240" w:h="15840"/>
       <w:pgMar w:top="1440" w:right="1800" w:bottom="1440" w:left="1800" w:header="720" w:footer="720" w:gutter="0"/>
@@ -5128,25 +5577,25 @@
       <w:lvlJc w:val="left"/>
       <w:pPr>
         <w:tabs>
-          <w:tab w:val="num" w:pos="720"/>
+          <w:tab w:val="num" w:pos="360"/>
         </w:tabs>
-        <w:ind w:left="720" w:hanging="360"/>
+        <w:ind w:left="360" w:hanging="360"/>
       </w:pPr>
       <w:rPr>
         <w:rFonts w:ascii="Symbol" w:hAnsi="Symbol" w:hint="default"/>
         <w:sz w:val="20"/>
       </w:rPr>
     </w:lvl>
-    <w:lvl w:ilvl="1" w:tentative="1">
+    <w:lvl w:ilvl="1">
       <w:start w:val="1"/>
       <w:numFmt w:val="bullet"/>
       <w:lvlText w:val="o"/>
       <w:lvlJc w:val="left"/>
       <w:pPr>
         <w:tabs>
-          <w:tab w:val="num" w:pos="1440"/>
+          <w:tab w:val="num" w:pos="-540"/>
         </w:tabs>
-        <w:ind w:left="1440" w:hanging="360"/>
+        <w:ind w:left="-540" w:hanging="360"/>
       </w:pPr>
       <w:rPr>
         <w:rFonts w:ascii="Courier New" w:hAnsi="Courier New" w:hint="default"/>
@@ -5160,9 +5609,9 @@
       <w:lvlJc w:val="left"/>
       <w:pPr>
         <w:tabs>
-          <w:tab w:val="num" w:pos="2160"/>
+          <w:tab w:val="num" w:pos="180"/>
         </w:tabs>
-        <w:ind w:left="2160" w:hanging="360"/>
+        <w:ind w:left="180" w:hanging="360"/>
       </w:pPr>
       <w:rPr>
         <w:rFonts w:ascii="Wingdings" w:hAnsi="Wingdings" w:hint="default"/>
@@ -5176,9 +5625,9 @@
       <w:lvlJc w:val="left"/>
       <w:pPr>
         <w:tabs>
-          <w:tab w:val="num" w:pos="2880"/>
+          <w:tab w:val="num" w:pos="900"/>
         </w:tabs>
-        <w:ind w:left="2880" w:hanging="360"/>
+        <w:ind w:left="900" w:hanging="360"/>
       </w:pPr>
       <w:rPr>
         <w:rFonts w:ascii="Wingdings" w:hAnsi="Wingdings" w:hint="default"/>
@@ -5192,9 +5641,9 @@
       <w:lvlJc w:val="left"/>
       <w:pPr>
         <w:tabs>
-          <w:tab w:val="num" w:pos="3600"/>
+          <w:tab w:val="num" w:pos="1620"/>
         </w:tabs>
-        <w:ind w:left="3600" w:hanging="360"/>
+        <w:ind w:left="1620" w:hanging="360"/>
       </w:pPr>
       <w:rPr>
         <w:rFonts w:ascii="Wingdings" w:hAnsi="Wingdings" w:hint="default"/>
@@ -5208,9 +5657,9 @@
       <w:lvlJc w:val="left"/>
       <w:pPr>
         <w:tabs>
-          <w:tab w:val="num" w:pos="4320"/>
+          <w:tab w:val="num" w:pos="2340"/>
         </w:tabs>
-        <w:ind w:left="4320" w:hanging="360"/>
+        <w:ind w:left="2340" w:hanging="360"/>
       </w:pPr>
       <w:rPr>
         <w:rFonts w:ascii="Wingdings" w:hAnsi="Wingdings" w:hint="default"/>
@@ -5224,9 +5673,9 @@
       <w:lvlJc w:val="left"/>
       <w:pPr>
         <w:tabs>
-          <w:tab w:val="num" w:pos="5040"/>
+          <w:tab w:val="num" w:pos="3060"/>
         </w:tabs>
-        <w:ind w:left="5040" w:hanging="360"/>
+        <w:ind w:left="3060" w:hanging="360"/>
       </w:pPr>
       <w:rPr>
         <w:rFonts w:ascii="Wingdings" w:hAnsi="Wingdings" w:hint="default"/>
@@ -5240,9 +5689,9 @@
       <w:lvlJc w:val="left"/>
       <w:pPr>
         <w:tabs>
-          <w:tab w:val="num" w:pos="5760"/>
+          <w:tab w:val="num" w:pos="3780"/>
         </w:tabs>
-        <w:ind w:left="5760" w:hanging="360"/>
+        <w:ind w:left="3780" w:hanging="360"/>
       </w:pPr>
       <w:rPr>
         <w:rFonts w:ascii="Wingdings" w:hAnsi="Wingdings" w:hint="default"/>
@@ -5256,9 +5705,9 @@
       <w:lvlJc w:val="left"/>
       <w:pPr>
         <w:tabs>
-          <w:tab w:val="num" w:pos="6480"/>
+          <w:tab w:val="num" w:pos="4500"/>
         </w:tabs>
-        <w:ind w:left="6480" w:hanging="360"/>
+        <w:ind w:left="4500" w:hanging="360"/>
       </w:pPr>
       <w:rPr>
         <w:rFonts w:ascii="Wingdings" w:hAnsi="Wingdings" w:hint="default"/>
@@ -7285,6 +7734,7 @@
   <w:style w:type="character" w:default="1" w:styleId="a0">
     <w:name w:val="Default Paragraph Font"/>
     <w:uiPriority w:val="1"/>
+    <w:semiHidden/>
     <w:unhideWhenUsed/>
   </w:style>
   <w:style w:type="table" w:default="1" w:styleId="a1">

</xml_diff>